<commit_message>
Add professional standalone User Guide and Developer Guide docx to PhaseB
Replaces the plain markdown guides with polished Word documents matching
the capstone book's cover/TOC/heading style: system requirements,
installation, quick start, full walkthroughs of both agents' tools, a
troubleshooting/FAQ and glossary for the User Guide; architecture overview,
repo map, code walkthrough of both agents, retraining/extension
instructions, evaluation methodology, and known limitations for the
Developer Guide. Also expands the book's own Appendix A/B to match the
current PPO_Agent/DQN_Agent layout and cross-reference the standalone guides.

Co-Authored-By: Claude Sonnet 5 <noreply@anthropic.com>
</commit_message>
<xml_diff>
--- a/PhaseB/FlowGrid_Capstone_Project_Book.docx
+++ b/PhaseB/FlowGrid_Capstone_Project_Book.docx
@@ -2606,7 +2606,7 @@
           <w:sz w:val="24"/>
           <w:szCs w:val="24"/>
         </w:rPr>
-        <w:t xml:space="preserve">This guide describes the normal, successful operating flow of the FlowGrid comparison tool (available as both a desktop application and a browser based application, with an identical feature set). It intentionally does not cover error conditions or unusual inputs, only the flow a user follows to get a result.</w:t>
+        <w:t xml:space="preserve">This appendix is a condensed version of the project's standalone User Guide, delivered alongside this book as PhaseB/User_Guide.docx, which additionally covers system requirements, installation, a quick start walkthrough, the original DQN agent's own tools, and a troubleshooting section. What follows here covers the normal, successful operating flow of the current agent's comparison tool (available as both a desktop application and a browser based application, with an identical feature set).</w:t>
       </w:r>
     </w:p>
     <w:p>
@@ -2636,7 +2636,7 @@
           <w:sz w:val="24"/>
           <w:szCs w:val="24"/>
         </w:rPr>
-        <w:t xml:space="preserve">Desktop version: run comparison_gui.py from the project's tools folder. The application window opens directly.</w:t>
+        <w:t xml:space="preserve">Desktop version: run comparison_gui.py from PPO_Agent/scripts. The application window opens directly.</w:t>
       </w:r>
     </w:p>
     <w:p>
@@ -2654,7 +2654,7 @@
           <w:sz w:val="24"/>
           <w:szCs w:val="24"/>
         </w:rPr>
-        <w:t xml:space="preserve">Web version: run server.py from the comparison_web folder; a browser tab opens automatically at the local address shown in the terminal.</w:t>
+        <w:t xml:space="preserve">Web version: run server.py from PPO_Agent/scripts/comparison_web; a browser tab opens automatically at the local address shown in the terminal.</w:t>
       </w:r>
     </w:p>
     <w:p>
@@ -2679,7 +2679,7 @@
           <w:sz w:val="24"/>
           <w:szCs w:val="24"/>
         </w:rPr>
-        <w:t xml:space="preserve">The Models panel lists every trained agent currently registered, with the project's champion model pre selected. Tick the checkbox beside any additional model you want included in the comparison. To compare against an agent not yet in the list, use "Add Model" and browse to its saved file; it will appear in the list immediately and persist for future sessions.</w:t>
+        <w:t xml:space="preserve">The Models panel lists every trained agent currently registered, with the project's champion model pre selected. Tick the checkbox beside any additional model you want included in the comparison. To compare against an agent not yet in the list, use "Add Model" and browse to its saved file (default location: PPO_Agent/models); it will appear in the list immediately and persist for future sessions.</w:t>
       </w:r>
     </w:p>
     <w:p>
@@ -2783,6 +2783,31 @@
       </w:r>
     </w:p>
     <w:p>
+      <w:pPr>
+        <w:pStyle w:val="Heading2"/>
+        <w:spacing w:after="150" w:before="300"/>
+      </w:pPr>
+      <w:r>
+        <w:rPr>
+          <w:rFonts w:ascii="Calibri" w:cs="Calibri" w:eastAsia="Calibri" w:hAnsi="Calibri"/>
+        </w:rPr>
+        <w:t xml:space="preserve">A.7 The Original DQN Agent's Own Tools</w:t>
+      </w:r>
+    </w:p>
+    <w:p>
+      <w:pPr>
+        <w:spacing w:after="200" w:line="276"/>
+      </w:pPr>
+      <w:r>
+        <w:rPr>
+          <w:rFonts w:ascii="Calibri" w:cs="Calibri" w:eastAsia="Calibri" w:hAnsi="Calibri"/>
+          <w:sz w:val="24"/>
+          <w:szCs w:val="24"/>
+        </w:rPr>
+        <w:t xml:space="preserve">The project's original agent, DQN_Agent, has its own separate desktop application (DQN_Agent/gui) and browser dashboard (DQN_Agent/web), including a Compare tab with the same fair, same traffic comparison logic. See PhaseB/User_Guide.docx (Section 6) and DQN_Agent/docs for details.</w:t>
+      </w:r>
+    </w:p>
+    <w:p>
       <w:r>
         <w:br w:type="page"/>
       </w:r>
@@ -2796,20 +2821,20 @@
         <w:rPr>
           <w:rFonts w:ascii="Calibri" w:cs="Calibri" w:eastAsia="Calibri" w:hAnsi="Calibri"/>
         </w:rPr>
-        <w:t xml:space="preserve">Appendix B, Maintenance Guide</w:t>
-      </w:r>
-    </w:p>
-    <w:p>
-      <w:pPr>
-        <w:spacing w:after="200" w:line="276"/>
-      </w:pPr>
-      <w:r>
-        <w:rPr>
-          <w:rFonts w:ascii="Calibri" w:cs="Calibri" w:eastAsia="Calibri" w:hAnsi="Calibri"/>
-          <w:sz w:val="24"/>
-          <w:szCs w:val="24"/>
-        </w:rPr>
-        <w:t xml:space="preserve">This guide covers what is needed to continue developing, retraining, or extending this project after its initial delivery. It assumes familiarity with standard Python development and does not cover installing well known general purpose infrastructure (Python itself, Git, a code editor) in detail.</w:t>
+        <w:t xml:space="preserve">Appendix B, Developer / Maintenance Guide</w:t>
+      </w:r>
+    </w:p>
+    <w:p>
+      <w:pPr>
+        <w:spacing w:after="200" w:line="276"/>
+      </w:pPr>
+      <w:r>
+        <w:rPr>
+          <w:rFonts w:ascii="Calibri" w:cs="Calibri" w:eastAsia="Calibri" w:hAnsi="Calibri"/>
+          <w:sz w:val="24"/>
+          <w:szCs w:val="24"/>
+        </w:rPr>
+        <w:t xml:space="preserve">This appendix is a condensed version of the project's standalone Developer Guide, delivered alongside this book as PhaseB/Developer_Guide.docx, which additionally covers the full system architecture, a complete repository map, a code walkthrough of both agents, the project's evaluation methodology in detail, known limitations, and the coding conventions used throughout this codebase. What follows here covers what is needed to continue developing, retraining, or extending this project after its initial delivery. It assumes familiarity with standard Python development.</w:t>
       </w:r>
     </w:p>
     <w:p>
@@ -2900,7 +2925,7 @@
           <w:sz w:val="24"/>
           <w:szCs w:val="24"/>
         </w:rPr>
-        <w:t xml:space="preserve">Clone the project's Git repository, then install Python dependencies from the included requirements file into a virtual environment. No project specific installation step beyond this is required, the environment and training scripts locate the SUMO network and route files via paths defined in the code.</w:t>
+        <w:t xml:space="preserve">Clone the project's Git repository, then install Python dependencies from the included requirements file into a virtual environment. No project specific installation step beyond this is required, the environment and training scripts locate the SUMO network and route files via paths defined in the code, anchored at the project root's SharedData folder.</w:t>
       </w:r>
     </w:p>
     <w:p>
@@ -2930,7 +2955,7 @@
           <w:sz w:val="24"/>
           <w:szCs w:val="24"/>
         </w:rPr>
-        <w:t xml:space="preserve">Each trained agent version lives in its own folder under saved_agents/, containing its environment definition, training script, saved checkpoints, and evaluation results, never overwritten by later versions.</w:t>
+        <w:t xml:space="preserve">PPO_Agent/ holds the final, submitted agent (V8): scripts/ has every runnable tool, models/ and checkpoints/ the trained weights, results/ every evaluation run performed against it.</w:t>
       </w:r>
     </w:p>
     <w:p>
@@ -2948,7 +2973,7 @@
           <w:sz w:val="24"/>
           <w:szCs w:val="24"/>
         </w:rPr>
-        <w:t xml:space="preserve">Shared, version agnostic tools (comparison applications, evaluation sweeps, plotting utilities) live in a common tools/ folder and are reused across every agent version.</w:t>
+        <w:t xml:space="preserve">DQN_Agent/ holds the project's original, self contained agent, with its own flowgrid/ package, gui/, web/, and scripts/.</w:t>
       </w:r>
     </w:p>
     <w:p>
@@ -2966,7 +2991,25 @@
           <w:sz w:val="24"/>
           <w:szCs w:val="24"/>
         </w:rPr>
-        <w:t xml:space="preserve">A version history document records every major iteration, what changed, and why, and should be extended rather than replaced when a new version is added.</w:t>
+        <w:t xml:space="preserve">Old_Versions/ preserves every earlier or alternate agent version, each self contained in its own folder, never overwritten by later versions.</w:t>
+      </w:r>
+    </w:p>
+    <w:p>
+      <w:pPr>
+        <w:pStyle w:val="ListParagraph"/>
+        <w:numPr>
+          <w:ilvl w:val="0"/>
+          <w:numId w:val="1"/>
+        </w:numPr>
+        <w:spacing w:after="120" w:line="276"/>
+      </w:pPr>
+      <w:r>
+        <w:rPr>
+          <w:rFonts w:ascii="Calibri" w:cs="Calibri" w:eastAsia="Calibri" w:hAnsi="Calibri"/>
+          <w:sz w:val="24"/>
+          <w:szCs w:val="24"/>
+        </w:rPr>
+        <w:t xml:space="preserve">A version history document (PPO_Agent/docs/PPO_VERSION_HISTORY.md) records every major PPO iteration, what changed, and why, and should be extended rather than replaced when a new version is added.</w:t>
       </w:r>
     </w:p>
     <w:p>
@@ -2991,7 +3034,7 @@
           <w:sz w:val="24"/>
           <w:szCs w:val="24"/>
         </w:rPr>
-        <w:t xml:space="preserve">To train a new version, copy an existing version's folder rather than modifying it in place, update its internal import references to point to the copy, and adjust the training script's hyperparameters as needed. This preserves every previous version as a working fallback. Never resume training an existing checkpoint after changing its reward function or observation definition; train a fresh agent from random initialization instead, since resuming under a changed definition has previously produced a full, unrecoverable policy collapse.</w:t>
+        <w:t xml:space="preserve">To train a new version, copy PPO_Agent/scripts/ into a new folder under Old_Versions/PPO/ rather than modifying PPO_Agent/ in place, update its internal import references to point to the copy, and adjust the training script's hyperparameters as needed. This preserves the current submitted agent as a working reference. Never resume training an existing checkpoint after changing its reward function or observation definition; train a fresh agent from random initialization instead, since resuming under a changed definition has previously produced a full, unrecoverable policy collapse.</w:t>
       </w:r>
     </w:p>
     <w:p>
@@ -3016,7 +3059,7 @@
           <w:sz w:val="24"/>
           <w:szCs w:val="24"/>
         </w:rPr>
-        <w:t xml:space="preserve">New fixed time or rule based baselines can be added by extending the baseline list used by the evaluation tools; each baseline needs only a name and, for fixed time controllers, a cycle length, since the comparison tools handle result collection and reporting generically.</w:t>
+        <w:t xml:space="preserve">New fixed time or rule based baselines can be added by extending AVAILABLE_BASELINES in comparison_core.py; each baseline needs only a name and, for fixed time controllers, a cycle length, since the comparison tools handle result collection and reporting generically.</w:t>
       </w:r>
     </w:p>
     <w:p>
@@ -3042,6 +3085,31 @@
           <w:szCs w:val="24"/>
         </w:rPr>
         <w:t xml:space="preserve">The project's evaluation tools support a dry run mode that reports exactly how many simulation runs a given sweep will perform and how long it is expected to take, without executing anything, always run this first before committing to a long sweep. Sweeps also write partial results incrementally as they progress and can be resumed from where they left off if interrupted.</w:t>
+      </w:r>
+    </w:p>
+    <w:p>
+      <w:pPr>
+        <w:pStyle w:val="Heading2"/>
+        <w:spacing w:after="150" w:before="300"/>
+      </w:pPr>
+      <w:r>
+        <w:rPr>
+          <w:rFonts w:ascii="Calibri" w:cs="Calibri" w:eastAsia="Calibri" w:hAnsi="Calibri"/>
+        </w:rPr>
+        <w:t xml:space="preserve">B.7 Evaluation Methodology</w:t>
+      </w:r>
+    </w:p>
+    <w:p>
+      <w:pPr>
+        <w:spacing w:after="200" w:line="276"/>
+      </w:pPr>
+      <w:r>
+        <w:rPr>
+          <w:rFonts w:ascii="Calibri" w:cs="Calibri" w:eastAsia="Calibri" w:hAnsi="Calibri"/>
+          <w:sz w:val="24"/>
+          <w:szCs w:val="24"/>
+        </w:rPr>
+        <w:t xml:space="preserve">This project's evaluation rigor escalated deliberately over its course: from a couple of fixed seeds during early development, to fifty independently drawn seeds when a specific comparison needed more confidence, to a fully unfiltered methodology in which every saved checkpoint is evaluated against its own freshly drawn random seed and scenario, nothing reused, nothing cherry picked. Any future evaluation work on this codebase should adopt this final, most rigorous methodology from the outset rather than repeat that escalation.</w:t>
       </w:r>
     </w:p>
     <w:p>

</xml_diff>

<commit_message>
Rewrite all 8 chapters in a plain technical report register
Applies the standard the advisor demonstrated in their marked-up
Chapters 1 and 2: direct factual prose, defensive asides removed,
bullets for real lists. Also regenerates the book and both guides.

Co-Authored-By: Claude Opus 5 <noreply@anthropic.com>
</commit_message>
<xml_diff>
--- a/PhaseB/FlowGrid_Capstone_Project_Book.docx
+++ b/PhaseB/FlowGrid_Capstone_Project_Book.docx
@@ -15,7 +15,7 @@
           <w:noProof/>
         </w:rPr>
         <w:drawing>
-          <wp:inline distT="114300" distB="114300" distL="114300" distR="114300" wp14:anchorId="486949CF" wp14:editId="0A41682A">
+          <wp:inline distT="114300" distB="114300" distL="114300" distR="114300" wp14:anchorId="692E5561" wp14:editId="318E6319">
             <wp:extent cx="3300413" cy="774587"/>
             <wp:effectExtent l="0" t="0" r="0" b="0"/>
             <wp:docPr id="1877969061" name="image1.png"/>
@@ -159,7 +159,7 @@
           <w:noProof/>
         </w:rPr>
         <w:drawing>
-          <wp:anchor distT="0" distB="0" distL="114300" distR="114300" simplePos="0" relativeHeight="251659264" behindDoc="0" locked="0" layoutInCell="1" allowOverlap="1" wp14:anchorId="0A45BE32" wp14:editId="309E3AB7">
+          <wp:anchor distT="0" distB="0" distL="114300" distR="114300" simplePos="0" relativeHeight="251659264" behindDoc="0" locked="0" layoutInCell="1" allowOverlap="1" wp14:anchorId="3E7C8F66" wp14:editId="4B960350">
             <wp:simplePos x="0" y="0"/>
             <wp:positionH relativeFrom="margin">
               <wp:align>center</wp:align>
@@ -356,7 +356,7 @@
             <w:sz w:val="20"/>
             <w:szCs w:val="20"/>
           </w:rPr>
-          <w:t>https://github.com/einavbs1/FlowGrid</w:t>
+          <w:t>https://github.com/einavbs1/TrafficProject</w:t>
         </w:r>
       </w:hyperlink>
       <w:r>
@@ -412,7 +412,7 @@
         <w:pStyle w:val="Heading1"/>
         <w:spacing w:before="260" w:after="130"/>
       </w:pPr>
-      <w:bookmarkStart w:id="0" w:name="_Toc238312552"/>
+      <w:bookmarkStart w:id="0" w:name="_Toc238496045"/>
       <w:r>
         <w:lastRenderedPageBreak/>
         <w:t>Table of Contents</w:t>
@@ -422,7 +422,7 @@
     <w:sdt>
       <w:sdtPr>
         <w:alias w:val="Table of Contents"/>
-        <w:id w:val="-496652485"/>
+        <w:id w:val="-1330136495"/>
       </w:sdtPr>
       <w:sdtContent>
         <w:p>
@@ -447,7 +447,7 @@
           <w:r>
             <w:fldChar w:fldCharType="separate"/>
           </w:r>
-          <w:hyperlink w:anchor="_Toc238312552" w:history="1">
+          <w:hyperlink w:anchor="_Toc238496045" w:history="1">
             <w:r>
               <w:rPr>
                 <w:rStyle w:val="Hyperlink"/>
@@ -471,7 +471,7 @@
               <w:rPr>
                 <w:noProof/>
               </w:rPr>
-              <w:instrText xml:space="preserve"> PAGEREF _Toc238312552 \h </w:instrText>
+              <w:instrText xml:space="preserve"> PAGEREF _Toc238496045 \h </w:instrText>
             </w:r>
             <w:r>
               <w:rPr>
@@ -511,7 +511,7 @@
               <w14:ligatures w14:val="standardContextual"/>
             </w:rPr>
           </w:pPr>
-          <w:hyperlink w:anchor="_Toc238312553" w:history="1">
+          <w:hyperlink w:anchor="_Toc238496046" w:history="1">
             <w:r>
               <w:rPr>
                 <w:rStyle w:val="Hyperlink"/>
@@ -535,7 +535,7 @@
               <w:rPr>
                 <w:noProof/>
               </w:rPr>
-              <w:instrText xml:space="preserve"> PAGEREF _Toc238312553 \h </w:instrText>
+              <w:instrText xml:space="preserve"> PAGEREF _Toc238496046 \h </w:instrText>
             </w:r>
             <w:r>
               <w:rPr>
@@ -575,7 +575,7 @@
               <w14:ligatures w14:val="standardContextual"/>
             </w:rPr>
           </w:pPr>
-          <w:hyperlink w:anchor="_Toc238312554" w:history="1">
+          <w:hyperlink w:anchor="_Toc238496047" w:history="1">
             <w:r>
               <w:rPr>
                 <w:rStyle w:val="Hyperlink"/>
@@ -599,7 +599,7 @@
               <w:rPr>
                 <w:noProof/>
               </w:rPr>
-              <w:instrText xml:space="preserve"> PAGEREF _Toc238312554 \h </w:instrText>
+              <w:instrText xml:space="preserve"> PAGEREF _Toc238496047 \h </w:instrText>
             </w:r>
             <w:r>
               <w:rPr>
@@ -639,7 +639,7 @@
               <w14:ligatures w14:val="standardContextual"/>
             </w:rPr>
           </w:pPr>
-          <w:hyperlink w:anchor="_Toc238312555" w:history="1">
+          <w:hyperlink w:anchor="_Toc238496048" w:history="1">
             <w:r>
               <w:rPr>
                 <w:rStyle w:val="Hyperlink"/>
@@ -663,7 +663,7 @@
               <w:rPr>
                 <w:noProof/>
               </w:rPr>
-              <w:instrText xml:space="preserve"> PAGEREF _Toc238312555 \h </w:instrText>
+              <w:instrText xml:space="preserve"> PAGEREF _Toc238496048 \h </w:instrText>
             </w:r>
             <w:r>
               <w:rPr>
@@ -703,7 +703,7 @@
               <w14:ligatures w14:val="standardContextual"/>
             </w:rPr>
           </w:pPr>
-          <w:hyperlink w:anchor="_Toc238312556" w:history="1">
+          <w:hyperlink w:anchor="_Toc238496049" w:history="1">
             <w:r>
               <w:rPr>
                 <w:rStyle w:val="Hyperlink"/>
@@ -727,7 +727,7 @@
               <w:rPr>
                 <w:noProof/>
               </w:rPr>
-              <w:instrText xml:space="preserve"> PAGEREF _Toc238312556 \h </w:instrText>
+              <w:instrText xml:space="preserve"> PAGEREF _Toc238496049 \h </w:instrText>
             </w:r>
             <w:r>
               <w:rPr>
@@ -767,7 +767,7 @@
               <w14:ligatures w14:val="standardContextual"/>
             </w:rPr>
           </w:pPr>
-          <w:hyperlink w:anchor="_Toc238312557" w:history="1">
+          <w:hyperlink w:anchor="_Toc238496050" w:history="1">
             <w:r>
               <w:rPr>
                 <w:rStyle w:val="Hyperlink"/>
@@ -791,7 +791,7 @@
               <w:rPr>
                 <w:noProof/>
               </w:rPr>
-              <w:instrText xml:space="preserve"> PAGEREF _Toc238312557 \h </w:instrText>
+              <w:instrText xml:space="preserve"> PAGEREF _Toc238496050 \h </w:instrText>
             </w:r>
             <w:r>
               <w:rPr>
@@ -831,7 +831,7 @@
               <w14:ligatures w14:val="standardContextual"/>
             </w:rPr>
           </w:pPr>
-          <w:hyperlink w:anchor="_Toc238312558" w:history="1">
+          <w:hyperlink w:anchor="_Toc238496051" w:history="1">
             <w:r>
               <w:rPr>
                 <w:rStyle w:val="Hyperlink"/>
@@ -855,7 +855,7 @@
               <w:rPr>
                 <w:noProof/>
               </w:rPr>
-              <w:instrText xml:space="preserve"> PAGEREF _Toc238312558 \h </w:instrText>
+              <w:instrText xml:space="preserve"> PAGEREF _Toc238496051 \h </w:instrText>
             </w:r>
             <w:r>
               <w:rPr>
@@ -895,7 +895,7 @@
               <w14:ligatures w14:val="standardContextual"/>
             </w:rPr>
           </w:pPr>
-          <w:hyperlink w:anchor="_Toc238312559" w:history="1">
+          <w:hyperlink w:anchor="_Toc238496052" w:history="1">
             <w:r>
               <w:rPr>
                 <w:rStyle w:val="Hyperlink"/>
@@ -919,7 +919,7 @@
               <w:rPr>
                 <w:noProof/>
               </w:rPr>
-              <w:instrText xml:space="preserve"> PAGEREF _Toc238312559 \h </w:instrText>
+              <w:instrText xml:space="preserve"> PAGEREF _Toc238496052 \h </w:instrText>
             </w:r>
             <w:r>
               <w:rPr>
@@ -959,7 +959,7 @@
               <w14:ligatures w14:val="standardContextual"/>
             </w:rPr>
           </w:pPr>
-          <w:hyperlink w:anchor="_Toc238312560" w:history="1">
+          <w:hyperlink w:anchor="_Toc238496053" w:history="1">
             <w:r>
               <w:rPr>
                 <w:rStyle w:val="Hyperlink"/>
@@ -983,7 +983,7 @@
               <w:rPr>
                 <w:noProof/>
               </w:rPr>
-              <w:instrText xml:space="preserve"> PAGEREF _Toc238312560 \h </w:instrText>
+              <w:instrText xml:space="preserve"> PAGEREF _Toc238496053 \h </w:instrText>
             </w:r>
             <w:r>
               <w:rPr>
@@ -1023,7 +1023,7 @@
               <w14:ligatures w14:val="standardContextual"/>
             </w:rPr>
           </w:pPr>
-          <w:hyperlink w:anchor="_Toc238312561" w:history="1">
+          <w:hyperlink w:anchor="_Toc238496054" w:history="1">
             <w:r>
               <w:rPr>
                 <w:rStyle w:val="Hyperlink"/>
@@ -1047,7 +1047,7 @@
               <w:rPr>
                 <w:noProof/>
               </w:rPr>
-              <w:instrText xml:space="preserve"> PAGEREF _Toc238312561 \h </w:instrText>
+              <w:instrText xml:space="preserve"> PAGEREF _Toc238496054 \h </w:instrText>
             </w:r>
             <w:r>
               <w:rPr>
@@ -1064,7 +1064,7 @@
               <w:rPr>
                 <w:noProof/>
               </w:rPr>
-              <w:t>7</w:t>
+              <w:t>6</w:t>
             </w:r>
             <w:r>
               <w:rPr>
@@ -1087,7 +1087,7 @@
               <w14:ligatures w14:val="standardContextual"/>
             </w:rPr>
           </w:pPr>
-          <w:hyperlink w:anchor="_Toc238312562" w:history="1">
+          <w:hyperlink w:anchor="_Toc238496055" w:history="1">
             <w:r>
               <w:rPr>
                 <w:rStyle w:val="Hyperlink"/>
@@ -1111,7 +1111,7 @@
               <w:rPr>
                 <w:noProof/>
               </w:rPr>
-              <w:instrText xml:space="preserve"> PAGEREF _Toc238312562 \h </w:instrText>
+              <w:instrText xml:space="preserve"> PAGEREF _Toc238496055 \h </w:instrText>
             </w:r>
             <w:r>
               <w:rPr>
@@ -1151,7 +1151,7 @@
               <w14:ligatures w14:val="standardContextual"/>
             </w:rPr>
           </w:pPr>
-          <w:hyperlink w:anchor="_Toc238312563" w:history="1">
+          <w:hyperlink w:anchor="_Toc238496056" w:history="1">
             <w:r>
               <w:rPr>
                 <w:rStyle w:val="Hyperlink"/>
@@ -1175,7 +1175,7 @@
               <w:rPr>
                 <w:noProof/>
               </w:rPr>
-              <w:instrText xml:space="preserve"> PAGEREF _Toc238312563 \h </w:instrText>
+              <w:instrText xml:space="preserve"> PAGEREF _Toc238496056 \h </w:instrText>
             </w:r>
             <w:r>
               <w:rPr>
@@ -1215,7 +1215,7 @@
               <w14:ligatures w14:val="standardContextual"/>
             </w:rPr>
           </w:pPr>
-          <w:hyperlink w:anchor="_Toc238312564" w:history="1">
+          <w:hyperlink w:anchor="_Toc238496057" w:history="1">
             <w:r>
               <w:rPr>
                 <w:rStyle w:val="Hyperlink"/>
@@ -1239,7 +1239,7 @@
               <w:rPr>
                 <w:noProof/>
               </w:rPr>
-              <w:instrText xml:space="preserve"> PAGEREF _Toc238312564 \h </w:instrText>
+              <w:instrText xml:space="preserve"> PAGEREF _Toc238496057 \h </w:instrText>
             </w:r>
             <w:r>
               <w:rPr>
@@ -1279,7 +1279,7 @@
               <w14:ligatures w14:val="standardContextual"/>
             </w:rPr>
           </w:pPr>
-          <w:hyperlink w:anchor="_Toc238312565" w:history="1">
+          <w:hyperlink w:anchor="_Toc238496058" w:history="1">
             <w:r>
               <w:rPr>
                 <w:rStyle w:val="Hyperlink"/>
@@ -1303,7 +1303,7 @@
               <w:rPr>
                 <w:noProof/>
               </w:rPr>
-              <w:instrText xml:space="preserve"> PAGEREF _Toc238312565 \h </w:instrText>
+              <w:instrText xml:space="preserve"> PAGEREF _Toc238496058 \h </w:instrText>
             </w:r>
             <w:r>
               <w:rPr>
@@ -1343,7 +1343,7 @@
               <w14:ligatures w14:val="standardContextual"/>
             </w:rPr>
           </w:pPr>
-          <w:hyperlink w:anchor="_Toc238312566" w:history="1">
+          <w:hyperlink w:anchor="_Toc238496059" w:history="1">
             <w:r>
               <w:rPr>
                 <w:rStyle w:val="Hyperlink"/>
@@ -1367,7 +1367,7 @@
               <w:rPr>
                 <w:noProof/>
               </w:rPr>
-              <w:instrText xml:space="preserve"> PAGEREF _Toc238312566 \h </w:instrText>
+              <w:instrText xml:space="preserve"> PAGEREF _Toc238496059 \h </w:instrText>
             </w:r>
             <w:r>
               <w:rPr>
@@ -1384,7 +1384,7 @@
               <w:rPr>
                 <w:noProof/>
               </w:rPr>
-              <w:t>10</w:t>
+              <w:t>9</w:t>
             </w:r>
             <w:r>
               <w:rPr>
@@ -1407,7 +1407,7 @@
               <w14:ligatures w14:val="standardContextual"/>
             </w:rPr>
           </w:pPr>
-          <w:hyperlink w:anchor="_Toc238312567" w:history="1">
+          <w:hyperlink w:anchor="_Toc238496060" w:history="1">
             <w:r>
               <w:rPr>
                 <w:rStyle w:val="Hyperlink"/>
@@ -1431,7 +1431,7 @@
               <w:rPr>
                 <w:noProof/>
               </w:rPr>
-              <w:instrText xml:space="preserve"> PAGEREF _Toc238312567 \h </w:instrText>
+              <w:instrText xml:space="preserve"> PAGEREF _Toc238496060 \h </w:instrText>
             </w:r>
             <w:r>
               <w:rPr>
@@ -1471,7 +1471,7 @@
               <w14:ligatures w14:val="standardContextual"/>
             </w:rPr>
           </w:pPr>
-          <w:hyperlink w:anchor="_Toc238312568" w:history="1">
+          <w:hyperlink w:anchor="_Toc238496061" w:history="1">
             <w:r>
               <w:rPr>
                 <w:rStyle w:val="Hyperlink"/>
@@ -1495,7 +1495,7 @@
               <w:rPr>
                 <w:noProof/>
               </w:rPr>
-              <w:instrText xml:space="preserve"> PAGEREF _Toc238312568 \h </w:instrText>
+              <w:instrText xml:space="preserve"> PAGEREF _Toc238496061 \h </w:instrText>
             </w:r>
             <w:r>
               <w:rPr>
@@ -1512,7 +1512,7 @@
               <w:rPr>
                 <w:noProof/>
               </w:rPr>
-              <w:t>11</w:t>
+              <w:t>10</w:t>
             </w:r>
             <w:r>
               <w:rPr>
@@ -1535,7 +1535,7 @@
               <w14:ligatures w14:val="standardContextual"/>
             </w:rPr>
           </w:pPr>
-          <w:hyperlink w:anchor="_Toc238312569" w:history="1">
+          <w:hyperlink w:anchor="_Toc238496062" w:history="1">
             <w:r>
               <w:rPr>
                 <w:rStyle w:val="Hyperlink"/>
@@ -1559,7 +1559,7 @@
               <w:rPr>
                 <w:noProof/>
               </w:rPr>
-              <w:instrText xml:space="preserve"> PAGEREF _Toc238312569 \h </w:instrText>
+              <w:instrText xml:space="preserve"> PAGEREF _Toc238496062 \h </w:instrText>
             </w:r>
             <w:r>
               <w:rPr>
@@ -1599,7 +1599,7 @@
               <w14:ligatures w14:val="standardContextual"/>
             </w:rPr>
           </w:pPr>
-          <w:hyperlink w:anchor="_Toc238312570" w:history="1">
+          <w:hyperlink w:anchor="_Toc238496063" w:history="1">
             <w:r>
               <w:rPr>
                 <w:rStyle w:val="Hyperlink"/>
@@ -1623,7 +1623,7 @@
               <w:rPr>
                 <w:noProof/>
               </w:rPr>
-              <w:instrText xml:space="preserve"> PAGEREF _Toc238312570 \h </w:instrText>
+              <w:instrText xml:space="preserve"> PAGEREF _Toc238496063 \h </w:instrText>
             </w:r>
             <w:r>
               <w:rPr>
@@ -1640,7 +1640,7 @@
               <w:rPr>
                 <w:noProof/>
               </w:rPr>
-              <w:t>13</w:t>
+              <w:t>12</w:t>
             </w:r>
             <w:r>
               <w:rPr>
@@ -1663,7 +1663,7 @@
               <w14:ligatures w14:val="standardContextual"/>
             </w:rPr>
           </w:pPr>
-          <w:hyperlink w:anchor="_Toc238312571" w:history="1">
+          <w:hyperlink w:anchor="_Toc238496064" w:history="1">
             <w:r>
               <w:rPr>
                 <w:rStyle w:val="Hyperlink"/>
@@ -1687,7 +1687,7 @@
               <w:rPr>
                 <w:noProof/>
               </w:rPr>
-              <w:instrText xml:space="preserve"> PAGEREF _Toc238312571 \h </w:instrText>
+              <w:instrText xml:space="preserve"> PAGEREF _Toc238496064 \h </w:instrText>
             </w:r>
             <w:r>
               <w:rPr>
@@ -1727,7 +1727,7 @@
               <w14:ligatures w14:val="standardContextual"/>
             </w:rPr>
           </w:pPr>
-          <w:hyperlink w:anchor="_Toc238312572" w:history="1">
+          <w:hyperlink w:anchor="_Toc238496065" w:history="1">
             <w:r>
               <w:rPr>
                 <w:rStyle w:val="Hyperlink"/>
@@ -1751,7 +1751,7 @@
               <w:rPr>
                 <w:noProof/>
               </w:rPr>
-              <w:instrText xml:space="preserve"> PAGEREF _Toc238312572 \h </w:instrText>
+              <w:instrText xml:space="preserve"> PAGEREF _Toc238496065 \h </w:instrText>
             </w:r>
             <w:r>
               <w:rPr>
@@ -1791,7 +1791,7 @@
               <w14:ligatures w14:val="standardContextual"/>
             </w:rPr>
           </w:pPr>
-          <w:hyperlink w:anchor="_Toc238312573" w:history="1">
+          <w:hyperlink w:anchor="_Toc238496066" w:history="1">
             <w:r>
               <w:rPr>
                 <w:rStyle w:val="Hyperlink"/>
@@ -1815,7 +1815,7 @@
               <w:rPr>
                 <w:noProof/>
               </w:rPr>
-              <w:instrText xml:space="preserve"> PAGEREF _Toc238312573 \h </w:instrText>
+              <w:instrText xml:space="preserve"> PAGEREF _Toc238496066 \h </w:instrText>
             </w:r>
             <w:r>
               <w:rPr>
@@ -1855,7 +1855,7 @@
               <w14:ligatures w14:val="standardContextual"/>
             </w:rPr>
           </w:pPr>
-          <w:hyperlink w:anchor="_Toc238312574" w:history="1">
+          <w:hyperlink w:anchor="_Toc238496067" w:history="1">
             <w:r>
               <w:rPr>
                 <w:rStyle w:val="Hyperlink"/>
@@ -1879,7 +1879,7 @@
               <w:rPr>
                 <w:noProof/>
               </w:rPr>
-              <w:instrText xml:space="preserve"> PAGEREF _Toc238312574 \h </w:instrText>
+              <w:instrText xml:space="preserve"> PAGEREF _Toc238496067 \h </w:instrText>
             </w:r>
             <w:r>
               <w:rPr>
@@ -1919,7 +1919,7 @@
               <w14:ligatures w14:val="standardContextual"/>
             </w:rPr>
           </w:pPr>
-          <w:hyperlink w:anchor="_Toc238312575" w:history="1">
+          <w:hyperlink w:anchor="_Toc238496068" w:history="1">
             <w:r>
               <w:rPr>
                 <w:rStyle w:val="Hyperlink"/>
@@ -1943,7 +1943,7 @@
               <w:rPr>
                 <w:noProof/>
               </w:rPr>
-              <w:instrText xml:space="preserve"> PAGEREF _Toc238312575 \h </w:instrText>
+              <w:instrText xml:space="preserve"> PAGEREF _Toc238496068 \h </w:instrText>
             </w:r>
             <w:r>
               <w:rPr>
@@ -1983,7 +1983,7 @@
               <w14:ligatures w14:val="standardContextual"/>
             </w:rPr>
           </w:pPr>
-          <w:hyperlink w:anchor="_Toc238312576" w:history="1">
+          <w:hyperlink w:anchor="_Toc238496069" w:history="1">
             <w:r>
               <w:rPr>
                 <w:rStyle w:val="Hyperlink"/>
@@ -2007,7 +2007,7 @@
               <w:rPr>
                 <w:noProof/>
               </w:rPr>
-              <w:instrText xml:space="preserve"> PAGEREF _Toc238312576 \h </w:instrText>
+              <w:instrText xml:space="preserve"> PAGEREF _Toc238496069 \h </w:instrText>
             </w:r>
             <w:r>
               <w:rPr>
@@ -2024,7 +2024,7 @@
               <w:rPr>
                 <w:noProof/>
               </w:rPr>
-              <w:t>17</w:t>
+              <w:t>16</w:t>
             </w:r>
             <w:r>
               <w:rPr>
@@ -2047,7 +2047,7 @@
               <w14:ligatures w14:val="standardContextual"/>
             </w:rPr>
           </w:pPr>
-          <w:hyperlink w:anchor="_Toc238312577" w:history="1">
+          <w:hyperlink w:anchor="_Toc238496070" w:history="1">
             <w:r>
               <w:rPr>
                 <w:rStyle w:val="Hyperlink"/>
@@ -2071,7 +2071,7 @@
               <w:rPr>
                 <w:noProof/>
               </w:rPr>
-              <w:instrText xml:space="preserve"> PAGEREF _Toc238312577 \h </w:instrText>
+              <w:instrText xml:space="preserve"> PAGEREF _Toc238496070 \h </w:instrText>
             </w:r>
             <w:r>
               <w:rPr>
@@ -2111,7 +2111,7 @@
               <w14:ligatures w14:val="standardContextual"/>
             </w:rPr>
           </w:pPr>
-          <w:hyperlink w:anchor="_Toc238312578" w:history="1">
+          <w:hyperlink w:anchor="_Toc238496071" w:history="1">
             <w:r>
               <w:rPr>
                 <w:rStyle w:val="Hyperlink"/>
@@ -2135,7 +2135,7 @@
               <w:rPr>
                 <w:noProof/>
               </w:rPr>
-              <w:instrText xml:space="preserve"> PAGEREF _Toc238312578 \h </w:instrText>
+              <w:instrText xml:space="preserve"> PAGEREF _Toc238496071 \h </w:instrText>
             </w:r>
             <w:r>
               <w:rPr>
@@ -2175,7 +2175,7 @@
               <w14:ligatures w14:val="standardContextual"/>
             </w:rPr>
           </w:pPr>
-          <w:hyperlink w:anchor="_Toc238312579" w:history="1">
+          <w:hyperlink w:anchor="_Toc238496072" w:history="1">
             <w:r>
               <w:rPr>
                 <w:rStyle w:val="Hyperlink"/>
@@ -2199,7 +2199,7 @@
               <w:rPr>
                 <w:noProof/>
               </w:rPr>
-              <w:instrText xml:space="preserve"> PAGEREF _Toc238312579 \h </w:instrText>
+              <w:instrText xml:space="preserve"> PAGEREF _Toc238496072 \h </w:instrText>
             </w:r>
             <w:r>
               <w:rPr>
@@ -2239,7 +2239,7 @@
               <w14:ligatures w14:val="standardContextual"/>
             </w:rPr>
           </w:pPr>
-          <w:hyperlink w:anchor="_Toc238312580" w:history="1">
+          <w:hyperlink w:anchor="_Toc238496073" w:history="1">
             <w:r>
               <w:rPr>
                 <w:rStyle w:val="Hyperlink"/>
@@ -2263,7 +2263,7 @@
               <w:rPr>
                 <w:noProof/>
               </w:rPr>
-              <w:instrText xml:space="preserve"> PAGEREF _Toc238312580 \h </w:instrText>
+              <w:instrText xml:space="preserve"> PAGEREF _Toc238496073 \h </w:instrText>
             </w:r>
             <w:r>
               <w:rPr>
@@ -2280,7 +2280,7 @@
               <w:rPr>
                 <w:noProof/>
               </w:rPr>
-              <w:t>19</w:t>
+              <w:t>18</w:t>
             </w:r>
             <w:r>
               <w:rPr>
@@ -2303,7 +2303,7 @@
               <w14:ligatures w14:val="standardContextual"/>
             </w:rPr>
           </w:pPr>
-          <w:hyperlink w:anchor="_Toc238312581" w:history="1">
+          <w:hyperlink w:anchor="_Toc238496074" w:history="1">
             <w:r>
               <w:rPr>
                 <w:rStyle w:val="Hyperlink"/>
@@ -2327,7 +2327,7 @@
               <w:rPr>
                 <w:noProof/>
               </w:rPr>
-              <w:instrText xml:space="preserve"> PAGEREF _Toc238312581 \h </w:instrText>
+              <w:instrText xml:space="preserve"> PAGEREF _Toc238496074 \h </w:instrText>
             </w:r>
             <w:r>
               <w:rPr>
@@ -2344,7 +2344,7 @@
               <w:rPr>
                 <w:noProof/>
               </w:rPr>
-              <w:t>19</w:t>
+              <w:t>18</w:t>
             </w:r>
             <w:r>
               <w:rPr>
@@ -2367,7 +2367,7 @@
               <w14:ligatures w14:val="standardContextual"/>
             </w:rPr>
           </w:pPr>
-          <w:hyperlink w:anchor="_Toc238312582" w:history="1">
+          <w:hyperlink w:anchor="_Toc238496075" w:history="1">
             <w:r>
               <w:rPr>
                 <w:rStyle w:val="Hyperlink"/>
@@ -2391,7 +2391,7 @@
               <w:rPr>
                 <w:noProof/>
               </w:rPr>
-              <w:instrText xml:space="preserve"> PAGEREF _Toc238312582 \h </w:instrText>
+              <w:instrText xml:space="preserve"> PAGEREF _Toc238496075 \h </w:instrText>
             </w:r>
             <w:r>
               <w:rPr>
@@ -2431,7 +2431,7 @@
               <w14:ligatures w14:val="standardContextual"/>
             </w:rPr>
           </w:pPr>
-          <w:hyperlink w:anchor="_Toc238312583" w:history="1">
+          <w:hyperlink w:anchor="_Toc238496076" w:history="1">
             <w:r>
               <w:rPr>
                 <w:rStyle w:val="Hyperlink"/>
@@ -2455,7 +2455,7 @@
               <w:rPr>
                 <w:noProof/>
               </w:rPr>
-              <w:instrText xml:space="preserve"> PAGEREF _Toc238312583 \h </w:instrText>
+              <w:instrText xml:space="preserve"> PAGEREF _Toc238496076 \h </w:instrText>
             </w:r>
             <w:r>
               <w:rPr>
@@ -2472,7 +2472,7 @@
               <w:rPr>
                 <w:noProof/>
               </w:rPr>
-              <w:t>20</w:t>
+              <w:t>19</w:t>
             </w:r>
             <w:r>
               <w:rPr>
@@ -2495,7 +2495,7 @@
               <w14:ligatures w14:val="standardContextual"/>
             </w:rPr>
           </w:pPr>
-          <w:hyperlink w:anchor="_Toc238312584" w:history="1">
+          <w:hyperlink w:anchor="_Toc238496077" w:history="1">
             <w:r>
               <w:rPr>
                 <w:rStyle w:val="Hyperlink"/>
@@ -2519,7 +2519,7 @@
               <w:rPr>
                 <w:noProof/>
               </w:rPr>
-              <w:instrText xml:space="preserve"> PAGEREF _Toc238312584 \h </w:instrText>
+              <w:instrText xml:space="preserve"> PAGEREF _Toc238496077 \h </w:instrText>
             </w:r>
             <w:r>
               <w:rPr>
@@ -2536,7 +2536,7 @@
               <w:rPr>
                 <w:noProof/>
               </w:rPr>
-              <w:t>20</w:t>
+              <w:t>19</w:t>
             </w:r>
             <w:r>
               <w:rPr>
@@ -2559,7 +2559,7 @@
               <w14:ligatures w14:val="standardContextual"/>
             </w:rPr>
           </w:pPr>
-          <w:hyperlink w:anchor="_Toc238312585" w:history="1">
+          <w:hyperlink w:anchor="_Toc238496078" w:history="1">
             <w:r>
               <w:rPr>
                 <w:rStyle w:val="Hyperlink"/>
@@ -2583,7 +2583,7 @@
               <w:rPr>
                 <w:noProof/>
               </w:rPr>
-              <w:instrText xml:space="preserve"> PAGEREF _Toc238312585 \h </w:instrText>
+              <w:instrText xml:space="preserve"> PAGEREF _Toc238496078 \h </w:instrText>
             </w:r>
             <w:r>
               <w:rPr>
@@ -2623,7 +2623,7 @@
               <w14:ligatures w14:val="standardContextual"/>
             </w:rPr>
           </w:pPr>
-          <w:hyperlink w:anchor="_Toc238312586" w:history="1">
+          <w:hyperlink w:anchor="_Toc238496079" w:history="1">
             <w:r>
               <w:rPr>
                 <w:rStyle w:val="Hyperlink"/>
@@ -2647,7 +2647,7 @@
               <w:rPr>
                 <w:noProof/>
               </w:rPr>
-              <w:instrText xml:space="preserve"> PAGEREF _Toc238312586 \h </w:instrText>
+              <w:instrText xml:space="preserve"> PAGEREF _Toc238496079 \h </w:instrText>
             </w:r>
             <w:r>
               <w:rPr>
@@ -2664,7 +2664,7 @@
               <w:rPr>
                 <w:noProof/>
               </w:rPr>
-              <w:t>21</w:t>
+              <w:t>20</w:t>
             </w:r>
             <w:r>
               <w:rPr>
@@ -2687,7 +2687,7 @@
               <w14:ligatures w14:val="standardContextual"/>
             </w:rPr>
           </w:pPr>
-          <w:hyperlink w:anchor="_Toc238312587" w:history="1">
+          <w:hyperlink w:anchor="_Toc238496080" w:history="1">
             <w:r>
               <w:rPr>
                 <w:rStyle w:val="Hyperlink"/>
@@ -2711,7 +2711,7 @@
               <w:rPr>
                 <w:noProof/>
               </w:rPr>
-              <w:instrText xml:space="preserve"> PAGEREF _Toc238312587 \h </w:instrText>
+              <w:instrText xml:space="preserve"> PAGEREF _Toc238496080 \h </w:instrText>
             </w:r>
             <w:r>
               <w:rPr>
@@ -2728,7 +2728,7 @@
               <w:rPr>
                 <w:noProof/>
               </w:rPr>
-              <w:t>21</w:t>
+              <w:t>20</w:t>
             </w:r>
             <w:r>
               <w:rPr>
@@ -2751,7 +2751,7 @@
               <w14:ligatures w14:val="standardContextual"/>
             </w:rPr>
           </w:pPr>
-          <w:hyperlink w:anchor="_Toc238312588" w:history="1">
+          <w:hyperlink w:anchor="_Toc238496081" w:history="1">
             <w:r>
               <w:rPr>
                 <w:rStyle w:val="Hyperlink"/>
@@ -2775,7 +2775,7 @@
               <w:rPr>
                 <w:noProof/>
               </w:rPr>
-              <w:instrText xml:space="preserve"> PAGEREF _Toc238312588 \h </w:instrText>
+              <w:instrText xml:space="preserve"> PAGEREF _Toc238496081 \h </w:instrText>
             </w:r>
             <w:r>
               <w:rPr>
@@ -2792,7 +2792,7 @@
               <w:rPr>
                 <w:noProof/>
               </w:rPr>
-              <w:t>21</w:t>
+              <w:t>20</w:t>
             </w:r>
             <w:r>
               <w:rPr>
@@ -2815,7 +2815,7 @@
               <w14:ligatures w14:val="standardContextual"/>
             </w:rPr>
           </w:pPr>
-          <w:hyperlink w:anchor="_Toc238312589" w:history="1">
+          <w:hyperlink w:anchor="_Toc238496082" w:history="1">
             <w:r>
               <w:rPr>
                 <w:rStyle w:val="Hyperlink"/>
@@ -2839,7 +2839,7 @@
               <w:rPr>
                 <w:noProof/>
               </w:rPr>
-              <w:instrText xml:space="preserve"> PAGEREF _Toc238312589 \h </w:instrText>
+              <w:instrText xml:space="preserve"> PAGEREF _Toc238496082 \h </w:instrText>
             </w:r>
             <w:r>
               <w:rPr>
@@ -2856,7 +2856,7 @@
               <w:rPr>
                 <w:noProof/>
               </w:rPr>
-              <w:t>21</w:t>
+              <w:t>20</w:t>
             </w:r>
             <w:r>
               <w:rPr>
@@ -2879,7 +2879,7 @@
               <w14:ligatures w14:val="standardContextual"/>
             </w:rPr>
           </w:pPr>
-          <w:hyperlink w:anchor="_Toc238312590" w:history="1">
+          <w:hyperlink w:anchor="_Toc238496083" w:history="1">
             <w:r>
               <w:rPr>
                 <w:rStyle w:val="Hyperlink"/>
@@ -2903,7 +2903,7 @@
               <w:rPr>
                 <w:noProof/>
               </w:rPr>
-              <w:instrText xml:space="preserve"> PAGEREF _Toc238312590 \h </w:instrText>
+              <w:instrText xml:space="preserve"> PAGEREF _Toc238496083 \h </w:instrText>
             </w:r>
             <w:r>
               <w:rPr>
@@ -2943,7 +2943,7 @@
               <w14:ligatures w14:val="standardContextual"/>
             </w:rPr>
           </w:pPr>
-          <w:hyperlink w:anchor="_Toc238312591" w:history="1">
+          <w:hyperlink w:anchor="_Toc238496084" w:history="1">
             <w:r>
               <w:rPr>
                 <w:rStyle w:val="Hyperlink"/>
@@ -2967,7 +2967,7 @@
               <w:rPr>
                 <w:noProof/>
               </w:rPr>
-              <w:instrText xml:space="preserve"> PAGEREF _Toc238312591 \h </w:instrText>
+              <w:instrText xml:space="preserve"> PAGEREF _Toc238496084 \h </w:instrText>
             </w:r>
             <w:r>
               <w:rPr>
@@ -2984,7 +2984,7 @@
               <w:rPr>
                 <w:noProof/>
               </w:rPr>
-              <w:t>22</w:t>
+              <w:t>21</w:t>
             </w:r>
             <w:r>
               <w:rPr>
@@ -3007,7 +3007,7 @@
               <w14:ligatures w14:val="standardContextual"/>
             </w:rPr>
           </w:pPr>
-          <w:hyperlink w:anchor="_Toc238312592" w:history="1">
+          <w:hyperlink w:anchor="_Toc238496085" w:history="1">
             <w:r>
               <w:rPr>
                 <w:rStyle w:val="Hyperlink"/>
@@ -3031,7 +3031,7 @@
               <w:rPr>
                 <w:noProof/>
               </w:rPr>
-              <w:instrText xml:space="preserve"> PAGEREF _Toc238312592 \h </w:instrText>
+              <w:instrText xml:space="preserve"> PAGEREF _Toc238496085 \h </w:instrText>
             </w:r>
             <w:r>
               <w:rPr>
@@ -3048,7 +3048,7 @@
               <w:rPr>
                 <w:noProof/>
               </w:rPr>
-              <w:t>22</w:t>
+              <w:t>21</w:t>
             </w:r>
             <w:r>
               <w:rPr>
@@ -3071,7 +3071,7 @@
               <w14:ligatures w14:val="standardContextual"/>
             </w:rPr>
           </w:pPr>
-          <w:hyperlink w:anchor="_Toc238312593" w:history="1">
+          <w:hyperlink w:anchor="_Toc238496086" w:history="1">
             <w:r>
               <w:rPr>
                 <w:rStyle w:val="Hyperlink"/>
@@ -3095,7 +3095,7 @@
               <w:rPr>
                 <w:noProof/>
               </w:rPr>
-              <w:instrText xml:space="preserve"> PAGEREF _Toc238312593 \h </w:instrText>
+              <w:instrText xml:space="preserve"> PAGEREF _Toc238496086 \h </w:instrText>
             </w:r>
             <w:r>
               <w:rPr>
@@ -3112,7 +3112,7 @@
               <w:rPr>
                 <w:noProof/>
               </w:rPr>
-              <w:t>22</w:t>
+              <w:t>21</w:t>
             </w:r>
             <w:r>
               <w:rPr>
@@ -3135,7 +3135,7 @@
               <w14:ligatures w14:val="standardContextual"/>
             </w:rPr>
           </w:pPr>
-          <w:hyperlink w:anchor="_Toc238312594" w:history="1">
+          <w:hyperlink w:anchor="_Toc238496087" w:history="1">
             <w:r>
               <w:rPr>
                 <w:rStyle w:val="Hyperlink"/>
@@ -3159,7 +3159,7 @@
               <w:rPr>
                 <w:noProof/>
               </w:rPr>
-              <w:instrText xml:space="preserve"> PAGEREF _Toc238312594 \h </w:instrText>
+              <w:instrText xml:space="preserve"> PAGEREF _Toc238496087 \h </w:instrText>
             </w:r>
             <w:r>
               <w:rPr>
@@ -3176,7 +3176,7 @@
               <w:rPr>
                 <w:noProof/>
               </w:rPr>
-              <w:t>22</w:t>
+              <w:t>21</w:t>
             </w:r>
             <w:r>
               <w:rPr>
@@ -3199,7 +3199,7 @@
               <w14:ligatures w14:val="standardContextual"/>
             </w:rPr>
           </w:pPr>
-          <w:hyperlink w:anchor="_Toc238312595" w:history="1">
+          <w:hyperlink w:anchor="_Toc238496088" w:history="1">
             <w:r>
               <w:rPr>
                 <w:rStyle w:val="Hyperlink"/>
@@ -3223,7 +3223,7 @@
               <w:rPr>
                 <w:noProof/>
               </w:rPr>
-              <w:instrText xml:space="preserve"> PAGEREF _Toc238312595 \h </w:instrText>
+              <w:instrText xml:space="preserve"> PAGEREF _Toc238496088 \h </w:instrText>
             </w:r>
             <w:r>
               <w:rPr>
@@ -3263,7 +3263,7 @@
               <w14:ligatures w14:val="standardContextual"/>
             </w:rPr>
           </w:pPr>
-          <w:hyperlink w:anchor="_Toc238312596" w:history="1">
+          <w:hyperlink w:anchor="_Toc238496089" w:history="1">
             <w:r>
               <w:rPr>
                 <w:rStyle w:val="Hyperlink"/>
@@ -3287,7 +3287,7 @@
               <w:rPr>
                 <w:noProof/>
               </w:rPr>
-              <w:instrText xml:space="preserve"> PAGEREF _Toc238312596 \h </w:instrText>
+              <w:instrText xml:space="preserve"> PAGEREF _Toc238496089 \h </w:instrText>
             </w:r>
             <w:r>
               <w:rPr>
@@ -3304,7 +3304,7 @@
               <w:rPr>
                 <w:noProof/>
               </w:rPr>
-              <w:t>23</w:t>
+              <w:t>22</w:t>
             </w:r>
             <w:r>
               <w:rPr>
@@ -3327,7 +3327,7 @@
               <w14:ligatures w14:val="standardContextual"/>
             </w:rPr>
           </w:pPr>
-          <w:hyperlink w:anchor="_Toc238312597" w:history="1">
+          <w:hyperlink w:anchor="_Toc238496090" w:history="1">
             <w:r>
               <w:rPr>
                 <w:rStyle w:val="Hyperlink"/>
@@ -3351,7 +3351,7 @@
               <w:rPr>
                 <w:noProof/>
               </w:rPr>
-              <w:instrText xml:space="preserve"> PAGEREF _Toc238312597 \h </w:instrText>
+              <w:instrText xml:space="preserve"> PAGEREF _Toc238496090 \h </w:instrText>
             </w:r>
             <w:r>
               <w:rPr>
@@ -3368,7 +3368,7 @@
               <w:rPr>
                 <w:noProof/>
               </w:rPr>
-              <w:t>24</w:t>
+              <w:t>23</w:t>
             </w:r>
             <w:r>
               <w:rPr>
@@ -3391,7 +3391,7 @@
               <w14:ligatures w14:val="standardContextual"/>
             </w:rPr>
           </w:pPr>
-          <w:hyperlink w:anchor="_Toc238312598" w:history="1">
+          <w:hyperlink w:anchor="_Toc238496091" w:history="1">
             <w:r>
               <w:rPr>
                 <w:rStyle w:val="Hyperlink"/>
@@ -3415,7 +3415,7 @@
               <w:rPr>
                 <w:noProof/>
               </w:rPr>
-              <w:instrText xml:space="preserve"> PAGEREF _Toc238312598 \h </w:instrText>
+              <w:instrText xml:space="preserve"> PAGEREF _Toc238496091 \h </w:instrText>
             </w:r>
             <w:r>
               <w:rPr>
@@ -3432,7 +3432,7 @@
               <w:rPr>
                 <w:noProof/>
               </w:rPr>
-              <w:t>25</w:t>
+              <w:t>24</w:t>
             </w:r>
             <w:r>
               <w:rPr>
@@ -3455,7 +3455,7 @@
               <w14:ligatures w14:val="standardContextual"/>
             </w:rPr>
           </w:pPr>
-          <w:hyperlink w:anchor="_Toc238312599" w:history="1">
+          <w:hyperlink w:anchor="_Toc238496092" w:history="1">
             <w:r>
               <w:rPr>
                 <w:rStyle w:val="Hyperlink"/>
@@ -3479,7 +3479,7 @@
               <w:rPr>
                 <w:noProof/>
               </w:rPr>
-              <w:instrText xml:space="preserve"> PAGEREF _Toc238312599 \h </w:instrText>
+              <w:instrText xml:space="preserve"> PAGEREF _Toc238496092 \h </w:instrText>
             </w:r>
             <w:r>
               <w:rPr>
@@ -3496,7 +3496,7 @@
               <w:rPr>
                 <w:noProof/>
               </w:rPr>
-              <w:t>25</w:t>
+              <w:t>24</w:t>
             </w:r>
             <w:r>
               <w:rPr>
@@ -3519,7 +3519,7 @@
               <w14:ligatures w14:val="standardContextual"/>
             </w:rPr>
           </w:pPr>
-          <w:hyperlink w:anchor="_Toc238312600" w:history="1">
+          <w:hyperlink w:anchor="_Toc238496093" w:history="1">
             <w:r>
               <w:rPr>
                 <w:rStyle w:val="Hyperlink"/>
@@ -3543,7 +3543,7 @@
               <w:rPr>
                 <w:noProof/>
               </w:rPr>
-              <w:instrText xml:space="preserve"> PAGEREF _Toc238312600 \h </w:instrText>
+              <w:instrText xml:space="preserve"> PAGEREF _Toc238496093 \h </w:instrText>
             </w:r>
             <w:r>
               <w:rPr>
@@ -3560,7 +3560,7 @@
               <w:rPr>
                 <w:noProof/>
               </w:rPr>
-              <w:t>25</w:t>
+              <w:t>24</w:t>
             </w:r>
             <w:r>
               <w:rPr>
@@ -3583,7 +3583,7 @@
               <w14:ligatures w14:val="standardContextual"/>
             </w:rPr>
           </w:pPr>
-          <w:hyperlink w:anchor="_Toc238312601" w:history="1">
+          <w:hyperlink w:anchor="_Toc238496094" w:history="1">
             <w:r>
               <w:rPr>
                 <w:rStyle w:val="Hyperlink"/>
@@ -3607,7 +3607,7 @@
               <w:rPr>
                 <w:noProof/>
               </w:rPr>
-              <w:instrText xml:space="preserve"> PAGEREF _Toc238312601 \h </w:instrText>
+              <w:instrText xml:space="preserve"> PAGEREF _Toc238496094 \h </w:instrText>
             </w:r>
             <w:r>
               <w:rPr>
@@ -3624,7 +3624,7 @@
               <w:rPr>
                 <w:noProof/>
               </w:rPr>
-              <w:t>25</w:t>
+              <w:t>24</w:t>
             </w:r>
             <w:r>
               <w:rPr>
@@ -3647,7 +3647,7 @@
               <w14:ligatures w14:val="standardContextual"/>
             </w:rPr>
           </w:pPr>
-          <w:hyperlink w:anchor="_Toc238312602" w:history="1">
+          <w:hyperlink w:anchor="_Toc238496095" w:history="1">
             <w:r>
               <w:rPr>
                 <w:rStyle w:val="Hyperlink"/>
@@ -3671,7 +3671,7 @@
               <w:rPr>
                 <w:noProof/>
               </w:rPr>
-              <w:instrText xml:space="preserve"> PAGEREF _Toc238312602 \h </w:instrText>
+              <w:instrText xml:space="preserve"> PAGEREF _Toc238496095 \h </w:instrText>
             </w:r>
             <w:r>
               <w:rPr>
@@ -3688,7 +3688,7 @@
               <w:rPr>
                 <w:noProof/>
               </w:rPr>
-              <w:t>26</w:t>
+              <w:t>25</w:t>
             </w:r>
             <w:r>
               <w:rPr>
@@ -3711,7 +3711,7 @@
               <w14:ligatures w14:val="standardContextual"/>
             </w:rPr>
           </w:pPr>
-          <w:hyperlink w:anchor="_Toc238312603" w:history="1">
+          <w:hyperlink w:anchor="_Toc238496096" w:history="1">
             <w:r>
               <w:rPr>
                 <w:rStyle w:val="Hyperlink"/>
@@ -3735,7 +3735,7 @@
               <w:rPr>
                 <w:noProof/>
               </w:rPr>
-              <w:instrText xml:space="preserve"> PAGEREF _Toc238312603 \h </w:instrText>
+              <w:instrText xml:space="preserve"> PAGEREF _Toc238496096 \h </w:instrText>
             </w:r>
             <w:r>
               <w:rPr>
@@ -3752,7 +3752,7 @@
               <w:rPr>
                 <w:noProof/>
               </w:rPr>
-              <w:t>26</w:t>
+              <w:t>25</w:t>
             </w:r>
             <w:r>
               <w:rPr>
@@ -3775,7 +3775,7 @@
               <w14:ligatures w14:val="standardContextual"/>
             </w:rPr>
           </w:pPr>
-          <w:hyperlink w:anchor="_Toc238312604" w:history="1">
+          <w:hyperlink w:anchor="_Toc238496097" w:history="1">
             <w:r>
               <w:rPr>
                 <w:rStyle w:val="Hyperlink"/>
@@ -3799,7 +3799,7 @@
               <w:rPr>
                 <w:noProof/>
               </w:rPr>
-              <w:instrText xml:space="preserve"> PAGEREF _Toc238312604 \h </w:instrText>
+              <w:instrText xml:space="preserve"> PAGEREF _Toc238496097 \h </w:instrText>
             </w:r>
             <w:r>
               <w:rPr>
@@ -3816,7 +3816,7 @@
               <w:rPr>
                 <w:noProof/>
               </w:rPr>
-              <w:t>28</w:t>
+              <w:t>27</w:t>
             </w:r>
             <w:r>
               <w:rPr>
@@ -3839,7 +3839,7 @@
               <w14:ligatures w14:val="standardContextual"/>
             </w:rPr>
           </w:pPr>
-          <w:hyperlink w:anchor="_Toc238312605" w:history="1">
+          <w:hyperlink w:anchor="_Toc238496098" w:history="1">
             <w:r>
               <w:rPr>
                 <w:rStyle w:val="Hyperlink"/>
@@ -3863,7 +3863,7 @@
               <w:rPr>
                 <w:noProof/>
               </w:rPr>
-              <w:instrText xml:space="preserve"> PAGEREF _Toc238312605 \h </w:instrText>
+              <w:instrText xml:space="preserve"> PAGEREF _Toc238496098 \h </w:instrText>
             </w:r>
             <w:r>
               <w:rPr>
@@ -3880,7 +3880,7 @@
               <w:rPr>
                 <w:noProof/>
               </w:rPr>
-              <w:t>30</w:t>
+              <w:t>29</w:t>
             </w:r>
             <w:r>
               <w:rPr>
@@ -3903,7 +3903,7 @@
               <w14:ligatures w14:val="standardContextual"/>
             </w:rPr>
           </w:pPr>
-          <w:hyperlink w:anchor="_Toc238312606" w:history="1">
+          <w:hyperlink w:anchor="_Toc238496099" w:history="1">
             <w:r>
               <w:rPr>
                 <w:rStyle w:val="Hyperlink"/>
@@ -3927,7 +3927,7 @@
               <w:rPr>
                 <w:noProof/>
               </w:rPr>
-              <w:instrText xml:space="preserve"> PAGEREF _Toc238312606 \h </w:instrText>
+              <w:instrText xml:space="preserve"> PAGEREF _Toc238496099 \h </w:instrText>
             </w:r>
             <w:r>
               <w:rPr>
@@ -3944,7 +3944,7 @@
               <w:rPr>
                 <w:noProof/>
               </w:rPr>
-              <w:t>30</w:t>
+              <w:t>29</w:t>
             </w:r>
             <w:r>
               <w:rPr>
@@ -3967,7 +3967,7 @@
               <w14:ligatures w14:val="standardContextual"/>
             </w:rPr>
           </w:pPr>
-          <w:hyperlink w:anchor="_Toc238312607" w:history="1">
+          <w:hyperlink w:anchor="_Toc238496100" w:history="1">
             <w:r>
               <w:rPr>
                 <w:rStyle w:val="Hyperlink"/>
@@ -3991,7 +3991,7 @@
               <w:rPr>
                 <w:noProof/>
               </w:rPr>
-              <w:instrText xml:space="preserve"> PAGEREF _Toc238312607 \h </w:instrText>
+              <w:instrText xml:space="preserve"> PAGEREF _Toc238496100 \h </w:instrText>
             </w:r>
             <w:r>
               <w:rPr>
@@ -4008,7 +4008,7 @@
               <w:rPr>
                 <w:noProof/>
               </w:rPr>
-              <w:t>30</w:t>
+              <w:t>29</w:t>
             </w:r>
             <w:r>
               <w:rPr>
@@ -4031,7 +4031,7 @@
               <w14:ligatures w14:val="standardContextual"/>
             </w:rPr>
           </w:pPr>
-          <w:hyperlink w:anchor="_Toc238312608" w:history="1">
+          <w:hyperlink w:anchor="_Toc238496101" w:history="1">
             <w:r>
               <w:rPr>
                 <w:rStyle w:val="Hyperlink"/>
@@ -4055,7 +4055,7 @@
               <w:rPr>
                 <w:noProof/>
               </w:rPr>
-              <w:instrText xml:space="preserve"> PAGEREF _Toc238312608 \h </w:instrText>
+              <w:instrText xml:space="preserve"> PAGEREF _Toc238496101 \h </w:instrText>
             </w:r>
             <w:r>
               <w:rPr>
@@ -4072,7 +4072,7 @@
               <w:rPr>
                 <w:noProof/>
               </w:rPr>
-              <w:t>31</w:t>
+              <w:t>30</w:t>
             </w:r>
             <w:r>
               <w:rPr>
@@ -4095,7 +4095,7 @@
               <w14:ligatures w14:val="standardContextual"/>
             </w:rPr>
           </w:pPr>
-          <w:hyperlink w:anchor="_Toc238312609" w:history="1">
+          <w:hyperlink w:anchor="_Toc238496102" w:history="1">
             <w:r>
               <w:rPr>
                 <w:rStyle w:val="Hyperlink"/>
@@ -4119,7 +4119,7 @@
               <w:rPr>
                 <w:noProof/>
               </w:rPr>
-              <w:instrText xml:space="preserve"> PAGEREF _Toc238312609 \h </w:instrText>
+              <w:instrText xml:space="preserve"> PAGEREF _Toc238496102 \h </w:instrText>
             </w:r>
             <w:r>
               <w:rPr>
@@ -4136,7 +4136,7 @@
               <w:rPr>
                 <w:noProof/>
               </w:rPr>
-              <w:t>33</w:t>
+              <w:t>32</w:t>
             </w:r>
             <w:r>
               <w:rPr>
@@ -4159,7 +4159,7 @@
               <w14:ligatures w14:val="standardContextual"/>
             </w:rPr>
           </w:pPr>
-          <w:hyperlink w:anchor="_Toc238312610" w:history="1">
+          <w:hyperlink w:anchor="_Toc238496103" w:history="1">
             <w:r>
               <w:rPr>
                 <w:rStyle w:val="Hyperlink"/>
@@ -4183,7 +4183,7 @@
               <w:rPr>
                 <w:noProof/>
               </w:rPr>
-              <w:instrText xml:space="preserve"> PAGEREF _Toc238312610 \h </w:instrText>
+              <w:instrText xml:space="preserve"> PAGEREF _Toc238496103 \h </w:instrText>
             </w:r>
             <w:r>
               <w:rPr>
@@ -4200,7 +4200,7 @@
               <w:rPr>
                 <w:noProof/>
               </w:rPr>
-              <w:t>33</w:t>
+              <w:t>32</w:t>
             </w:r>
             <w:r>
               <w:rPr>
@@ -4223,7 +4223,7 @@
               <w14:ligatures w14:val="standardContextual"/>
             </w:rPr>
           </w:pPr>
-          <w:hyperlink w:anchor="_Toc238312611" w:history="1">
+          <w:hyperlink w:anchor="_Toc238496104" w:history="1">
             <w:r>
               <w:rPr>
                 <w:rStyle w:val="Hyperlink"/>
@@ -4247,7 +4247,7 @@
               <w:rPr>
                 <w:noProof/>
               </w:rPr>
-              <w:instrText xml:space="preserve"> PAGEREF _Toc238312611 \h </w:instrText>
+              <w:instrText xml:space="preserve"> PAGEREF _Toc238496104 \h </w:instrText>
             </w:r>
             <w:r>
               <w:rPr>
@@ -4264,7 +4264,7 @@
               <w:rPr>
                 <w:noProof/>
               </w:rPr>
-              <w:t>33</w:t>
+              <w:t>32</w:t>
             </w:r>
             <w:r>
               <w:rPr>
@@ -4287,7 +4287,7 @@
               <w14:ligatures w14:val="standardContextual"/>
             </w:rPr>
           </w:pPr>
-          <w:hyperlink w:anchor="_Toc238312612" w:history="1">
+          <w:hyperlink w:anchor="_Toc238496105" w:history="1">
             <w:r>
               <w:rPr>
                 <w:rStyle w:val="Hyperlink"/>
@@ -4311,7 +4311,7 @@
               <w:rPr>
                 <w:noProof/>
               </w:rPr>
-              <w:instrText xml:space="preserve"> PAGEREF _Toc238312612 \h </w:instrText>
+              <w:instrText xml:space="preserve"> PAGEREF _Toc238496105 \h </w:instrText>
             </w:r>
             <w:r>
               <w:rPr>
@@ -4328,7 +4328,7 @@
               <w:rPr>
                 <w:noProof/>
               </w:rPr>
-              <w:t>34</w:t>
+              <w:t>33</w:t>
             </w:r>
             <w:r>
               <w:rPr>
@@ -4351,7 +4351,7 @@
               <w14:ligatures w14:val="standardContextual"/>
             </w:rPr>
           </w:pPr>
-          <w:hyperlink w:anchor="_Toc238312613" w:history="1">
+          <w:hyperlink w:anchor="_Toc238496106" w:history="1">
             <w:r>
               <w:rPr>
                 <w:rStyle w:val="Hyperlink"/>
@@ -4375,7 +4375,7 @@
               <w:rPr>
                 <w:noProof/>
               </w:rPr>
-              <w:instrText xml:space="preserve"> PAGEREF _Toc238312613 \h </w:instrText>
+              <w:instrText xml:space="preserve"> PAGEREF _Toc238496106 \h </w:instrText>
             </w:r>
             <w:r>
               <w:rPr>
@@ -4392,7 +4392,7 @@
               <w:rPr>
                 <w:noProof/>
               </w:rPr>
-              <w:t>34</w:t>
+              <w:t>33</w:t>
             </w:r>
             <w:r>
               <w:rPr>
@@ -4415,7 +4415,7 @@
               <w14:ligatures w14:val="standardContextual"/>
             </w:rPr>
           </w:pPr>
-          <w:hyperlink w:anchor="_Toc238312614" w:history="1">
+          <w:hyperlink w:anchor="_Toc238496107" w:history="1">
             <w:r>
               <w:rPr>
                 <w:rStyle w:val="Hyperlink"/>
@@ -4439,7 +4439,7 @@
               <w:rPr>
                 <w:noProof/>
               </w:rPr>
-              <w:instrText xml:space="preserve"> PAGEREF _Toc238312614 \h </w:instrText>
+              <w:instrText xml:space="preserve"> PAGEREF _Toc238496107 \h </w:instrText>
             </w:r>
             <w:r>
               <w:rPr>
@@ -4456,7 +4456,7 @@
               <w:rPr>
                 <w:noProof/>
               </w:rPr>
-              <w:t>35</w:t>
+              <w:t>34</w:t>
             </w:r>
             <w:r>
               <w:rPr>
@@ -4479,7 +4479,7 @@
               <w14:ligatures w14:val="standardContextual"/>
             </w:rPr>
           </w:pPr>
-          <w:hyperlink w:anchor="_Toc238312615" w:history="1">
+          <w:hyperlink w:anchor="_Toc238496108" w:history="1">
             <w:r>
               <w:rPr>
                 <w:rStyle w:val="Hyperlink"/>
@@ -4503,7 +4503,7 @@
               <w:rPr>
                 <w:noProof/>
               </w:rPr>
-              <w:instrText xml:space="preserve"> PAGEREF _Toc238312615 \h </w:instrText>
+              <w:instrText xml:space="preserve"> PAGEREF _Toc238496108 \h </w:instrText>
             </w:r>
             <w:r>
               <w:rPr>
@@ -4520,7 +4520,7 @@
               <w:rPr>
                 <w:noProof/>
               </w:rPr>
-              <w:t>36</w:t>
+              <w:t>35</w:t>
             </w:r>
             <w:r>
               <w:rPr>
@@ -4543,7 +4543,7 @@
               <w14:ligatures w14:val="standardContextual"/>
             </w:rPr>
           </w:pPr>
-          <w:hyperlink w:anchor="_Toc238312616" w:history="1">
+          <w:hyperlink w:anchor="_Toc238496109" w:history="1">
             <w:r>
               <w:rPr>
                 <w:rStyle w:val="Hyperlink"/>
@@ -4567,7 +4567,7 @@
               <w:rPr>
                 <w:noProof/>
               </w:rPr>
-              <w:instrText xml:space="preserve"> PAGEREF _Toc238312616 \h </w:instrText>
+              <w:instrText xml:space="preserve"> PAGEREF _Toc238496109 \h </w:instrText>
             </w:r>
             <w:r>
               <w:rPr>
@@ -4584,7 +4584,7 @@
               <w:rPr>
                 <w:noProof/>
               </w:rPr>
-              <w:t>39</w:t>
+              <w:t>38</w:t>
             </w:r>
             <w:r>
               <w:rPr>
@@ -4607,7 +4607,7 @@
               <w14:ligatures w14:val="standardContextual"/>
             </w:rPr>
           </w:pPr>
-          <w:hyperlink w:anchor="_Toc238312617" w:history="1">
+          <w:hyperlink w:anchor="_Toc238496110" w:history="1">
             <w:r>
               <w:rPr>
                 <w:rStyle w:val="Hyperlink"/>
@@ -4631,7 +4631,7 @@
               <w:rPr>
                 <w:noProof/>
               </w:rPr>
-              <w:instrText xml:space="preserve"> PAGEREF _Toc238312617 \h </w:instrText>
+              <w:instrText xml:space="preserve"> PAGEREF _Toc238496110 \h </w:instrText>
             </w:r>
             <w:r>
               <w:rPr>
@@ -4648,7 +4648,7 @@
               <w:rPr>
                 <w:noProof/>
               </w:rPr>
-              <w:t>39</w:t>
+              <w:t>38</w:t>
             </w:r>
             <w:r>
               <w:rPr>
@@ -4671,7 +4671,7 @@
               <w14:ligatures w14:val="standardContextual"/>
             </w:rPr>
           </w:pPr>
-          <w:hyperlink w:anchor="_Toc238312618" w:history="1">
+          <w:hyperlink w:anchor="_Toc238496111" w:history="1">
             <w:r>
               <w:rPr>
                 <w:rStyle w:val="Hyperlink"/>
@@ -4695,7 +4695,7 @@
               <w:rPr>
                 <w:noProof/>
               </w:rPr>
-              <w:instrText xml:space="preserve"> PAGEREF _Toc238312618 \h </w:instrText>
+              <w:instrText xml:space="preserve"> PAGEREF _Toc238496111 \h </w:instrText>
             </w:r>
             <w:r>
               <w:rPr>
@@ -4712,7 +4712,7 @@
               <w:rPr>
                 <w:noProof/>
               </w:rPr>
-              <w:t>40</w:t>
+              <w:t>39</w:t>
             </w:r>
             <w:r>
               <w:rPr>
@@ -4735,7 +4735,7 @@
               <w14:ligatures w14:val="standardContextual"/>
             </w:rPr>
           </w:pPr>
-          <w:hyperlink w:anchor="_Toc238312619" w:history="1">
+          <w:hyperlink w:anchor="_Toc238496112" w:history="1">
             <w:r>
               <w:rPr>
                 <w:rStyle w:val="Hyperlink"/>
@@ -4759,7 +4759,7 @@
               <w:rPr>
                 <w:noProof/>
               </w:rPr>
-              <w:instrText xml:space="preserve"> PAGEREF _Toc238312619 \h </w:instrText>
+              <w:instrText xml:space="preserve"> PAGEREF _Toc238496112 \h </w:instrText>
             </w:r>
             <w:r>
               <w:rPr>
@@ -4776,7 +4776,7 @@
               <w:rPr>
                 <w:noProof/>
               </w:rPr>
-              <w:t>40</w:t>
+              <w:t>39</w:t>
             </w:r>
             <w:r>
               <w:rPr>
@@ -4799,7 +4799,7 @@
               <w14:ligatures w14:val="standardContextual"/>
             </w:rPr>
           </w:pPr>
-          <w:hyperlink w:anchor="_Toc238312620" w:history="1">
+          <w:hyperlink w:anchor="_Toc238496113" w:history="1">
             <w:r>
               <w:rPr>
                 <w:rStyle w:val="Hyperlink"/>
@@ -4823,7 +4823,7 @@
               <w:rPr>
                 <w:noProof/>
               </w:rPr>
-              <w:instrText xml:space="preserve"> PAGEREF _Toc238312620 \h </w:instrText>
+              <w:instrText xml:space="preserve"> PAGEREF _Toc238496113 \h </w:instrText>
             </w:r>
             <w:r>
               <w:rPr>
@@ -4840,7 +4840,7 @@
               <w:rPr>
                 <w:noProof/>
               </w:rPr>
-              <w:t>40</w:t>
+              <w:t>39</w:t>
             </w:r>
             <w:r>
               <w:rPr>
@@ -4863,7 +4863,7 @@
               <w14:ligatures w14:val="standardContextual"/>
             </w:rPr>
           </w:pPr>
-          <w:hyperlink w:anchor="_Toc238312621" w:history="1">
+          <w:hyperlink w:anchor="_Toc238496114" w:history="1">
             <w:r>
               <w:rPr>
                 <w:rStyle w:val="Hyperlink"/>
@@ -4887,7 +4887,7 @@
               <w:rPr>
                 <w:noProof/>
               </w:rPr>
-              <w:instrText xml:space="preserve"> PAGEREF _Toc238312621 \h </w:instrText>
+              <w:instrText xml:space="preserve"> PAGEREF _Toc238496114 \h </w:instrText>
             </w:r>
             <w:r>
               <w:rPr>
@@ -4904,7 +4904,7 @@
               <w:rPr>
                 <w:noProof/>
               </w:rPr>
-              <w:t>41</w:t>
+              <w:t>40</w:t>
             </w:r>
             <w:r>
               <w:rPr>
@@ -4927,7 +4927,7 @@
               <w14:ligatures w14:val="standardContextual"/>
             </w:rPr>
           </w:pPr>
-          <w:hyperlink w:anchor="_Toc238312622" w:history="1">
+          <w:hyperlink w:anchor="_Toc238496115" w:history="1">
             <w:r>
               <w:rPr>
                 <w:rStyle w:val="Hyperlink"/>
@@ -4951,7 +4951,7 @@
               <w:rPr>
                 <w:noProof/>
               </w:rPr>
-              <w:instrText xml:space="preserve"> PAGEREF _Toc238312622 \h </w:instrText>
+              <w:instrText xml:space="preserve"> PAGEREF _Toc238496115 \h </w:instrText>
             </w:r>
             <w:r>
               <w:rPr>
@@ -4968,7 +4968,7 @@
               <w:rPr>
                 <w:noProof/>
               </w:rPr>
-              <w:t>41</w:t>
+              <w:t>40</w:t>
             </w:r>
             <w:r>
               <w:rPr>
@@ -4991,7 +4991,7 @@
         <w:pStyle w:val="Heading1"/>
         <w:spacing w:before="260" w:after="130"/>
       </w:pPr>
-      <w:bookmarkStart w:id="1" w:name="_Toc238312553"/>
+      <w:bookmarkStart w:id="1" w:name="_Toc238496046"/>
       <w:r>
         <w:t>1. Introduction</w:t>
       </w:r>
@@ -5002,7 +5002,7 @@
         <w:pStyle w:val="Heading2"/>
         <w:spacing w:before="200" w:after="100"/>
       </w:pPr>
-      <w:bookmarkStart w:id="2" w:name="_Toc238312554"/>
+      <w:bookmarkStart w:id="2" w:name="_Toc238496047"/>
       <w:r>
         <w:t>1.1 The Problem</w:t>
       </w:r>
@@ -5013,15 +5013,15 @@
         <w:spacing w:after="140" w:line="252" w:lineRule="auto"/>
       </w:pPr>
       <w:r>
-        <w:t>Most traffic signals in daily use still run on an idea that has barely changed in decades: a fixed cycle of green, yellow, and red, timed once by an engineer and rarely touched again. That works well enough when traffic is predictable, but real traffic rarely is, it swells during rush hour, thins out at night, and reacts to accidents, weather, and events in ways a fixed timer cannot see and cannot respond to. The practical result is a signal that is sometimes too generous to an empty approach and too stingy to a congested one, for no better reason than that it has no way of knowing which is which.</w:t>
-      </w:r>
-    </w:p>
-    <w:p>
-      <w:pPr>
-        <w:spacing w:after="140" w:line="252" w:lineRule="auto"/>
-      </w:pPr>
-      <w:r>
-        <w:t>Other "adaptive" families of controllers try to close that gap. Actuated controllers use loop detectors to extend or shorten a phase depending on whether vehicles are currently arriving, but they typically cannot see more than a short distance past the stop line, so they have little sense of how long a queue actually is once it grows past the detector. What none of these approaches do is learn. Their logic is fixed in advance by an engineer, and only the inputs change.</w:t>
+        <w:t>Most traffic signals in use today run a fixed cycle of green, yellow, and red, timed once by an engineer and rarely revised. A fixed schedule works while demand stays near the historical averages it was derived from. Real demand does not. It rises during peak hours, falls overnight, and responds to accidents, weather, and events a fixed timer cannot detect. The result is a controller that gives green time to an empty approach while a congested one waits, because it cannot tell them apart.</w:t>
+      </w:r>
+    </w:p>
+    <w:p>
+      <w:pPr>
+        <w:spacing w:after="140" w:line="252" w:lineRule="auto"/>
+      </w:pPr>
+      <w:r>
+        <w:t>Adaptive controllers close part of that gap. Vehicle actuated control improved on fixed timing with inductive loop detectors, extending or ending a phase according to whether a vehicle is present. These systems rely on binary presence detection rather than any measure of volume, and they see only a short distance past the stop line, so they cannot tell how long a queue has grown. More importantly, none of them learn. Their logic is fixed in advance by an engineer, and only the inputs change.</w:t>
       </w:r>
     </w:p>
     <w:p>
@@ -5029,7 +5029,7 @@
         <w:pStyle w:val="Heading2"/>
         <w:spacing w:before="200" w:after="100"/>
       </w:pPr>
-      <w:bookmarkStart w:id="3" w:name="_Toc238312555"/>
+      <w:bookmarkStart w:id="3" w:name="_Toc238496048"/>
       <w:r>
         <w:t>1.2 Research Questions</w:t>
       </w:r>
@@ -5040,7 +5040,7 @@
         <w:spacing w:after="140" w:line="252" w:lineRule="auto"/>
       </w:pPr>
       <w:r>
-        <w:t>This project therefore asks a more open question than "which fixed cycle length is best." Three questions guided the work from the beginning, and the rest of this book is organized around answering them.</w:t>
+        <w:t>This project asks three questions:</w:t>
       </w:r>
     </w:p>
     <w:p>
@@ -5053,7 +5053,7 @@
         <w:spacing w:after="90" w:line="252" w:lineRule="auto"/>
       </w:pPr>
       <w:r>
-        <w:t>Can a controller that is given no explicit switching rule at all, and instead learns purely from repeated simulated experience, outperform the fixed time signals already in everyday use?</w:t>
+        <w:t>Can a controller given no explicit switching rule, learning only from repeated simulated experience, outperform the fixed time signals already in use?</w:t>
       </w:r>
     </w:p>
     <w:p>
@@ -5066,7 +5066,7 @@
         <w:spacing w:after="90" w:line="252" w:lineRule="auto"/>
       </w:pPr>
       <w:r>
-        <w:t>If it can, under which traffic conditions does it succeed, where does it fall short, and what actually explains the difference?</w:t>
+        <w:t>Under which traffic conditions does it succeed, where does it fall short, and what explains the difference?</w:t>
       </w:r>
     </w:p>
     <w:p>
@@ -5079,7 +5079,7 @@
         <w:spacing w:after="90" w:line="252" w:lineRule="auto"/>
       </w:pPr>
       <w:r>
-        <w:t>How much confidence can we honestly place in that answer, given that a reinforcement learning agent can find ways to improve its own reward number without doing anything useful for a real driver?</w:t>
+        <w:t>How much confidence can we place in that answer, given that a reinforcement learning agent can raise its own reward score without helping an actual driver?</w:t>
       </w:r>
     </w:p>
     <w:p>
@@ -5087,7 +5087,7 @@
         <w:pStyle w:val="Heading2"/>
         <w:spacing w:before="200" w:after="100"/>
       </w:pPr>
-      <w:bookmarkStart w:id="4" w:name="_Toc238312556"/>
+      <w:bookmarkStart w:id="4" w:name="_Toc238496049"/>
       <w:r>
         <w:t>1.3 Our Solution</w:t>
       </w:r>
@@ -5098,7 +5098,7 @@
         <w:spacing w:after="140" w:line="252" w:lineRule="auto"/>
       </w:pPr>
       <w:r>
-        <w:t>This project set out to build a reinforcement learning agent capable of controlling a single traffic signal intersection more effectively than the standard alternatives already in use, and to evaluate it rigorously. "More effectively" means a lower total vehicle waiting time across light, moderate, and heavy traffic. That is the number every baseline here is judged against.</w:t>
+        <w:t>This project aims to build a reinforcement learning agent that controls a single traffic signal intersection more effectively than the standard alternatives already in use, and to evaluate it rigorously. More effectively means a lower total vehicle waiting time across light, moderate, and heavy traffic.</w:t>
       </w:r>
     </w:p>
     <w:p>
@@ -5114,7 +5114,15 @@
         <w:spacing w:after="140" w:line="252" w:lineRule="auto"/>
       </w:pPr>
       <w:r>
-        <w:t>The first is a SUMO based simulation environment modelling a four way intersection with randomly generated vehicle demand, a camera with limited sensing (the agent only "sees" 150 meters back from the stop line, which represents what an actual roadside sensor could plausibly observe), and a set of hard safety constraints, including minimum and maximum green durations and mandatory yellow transitions, that cannot be violated.</w:t>
+        <w:t>The first is a SUMO based simulation environment modeling a four way intersection with randomly generated vehicle demand, a camera with a limited sensing range (the agent sees only 150 meters back from the stop line, which represents what a roadside sensor could plausibly observe), and a set of hard safety constraints, including minimum and maximum green durations and mandatory yellow transitions, that cannot be violated.</w:t>
+      </w:r>
+    </w:p>
+    <w:p>
+      <w:pPr>
+        <w:spacing w:after="140" w:line="252" w:lineRule="auto"/>
+      </w:pPr>
+      <w:r>
+        <w:t>The second is the trained agent: a Proximal Policy Optimization (PPO) policy agent, trained from scratch with no predefined switching rules, that decides every five simulated seconds whether to hold the current phase or advance to the next.</w:t>
       </w:r>
     </w:p>
     <w:p>
@@ -5123,15 +5131,7 @@
       </w:pPr>
       <w:r>
         <w:lastRenderedPageBreak/>
-        <w:t>The second sub system is the trained agent itself: a Proximal Policy Optimization (PPO) policy, trained from scratch with no hand coded switching rules, that decides every five simulated seconds whether to hold the current phase or to advance to the next.</w:t>
-      </w:r>
-    </w:p>
-    <w:p>
-      <w:pPr>
-        <w:spacing w:after="140" w:line="252" w:lineRule="auto"/>
-      </w:pPr>
-      <w:r>
-        <w:t>The third sub system is an evaluation and demonstration layer, having two browser based applications. It includes a family of statistical comparison tools and a "Watch Live" mode that opens a real SUMO visualization window, built specifically so that the agent's performance can be checked and questioned rather than simply trusted on the strength of one reported number.</w:t>
+        <w:t>The third is an evaluation and demonstration layer, including two applications, a family of statistical comparison tools, and a Watch Live mode that opens a real SUMO visualization window, so that the agent's performance can be interactively checked and questioned.</w:t>
       </w:r>
     </w:p>
     <w:p>
@@ -5139,7 +5139,7 @@
         <w:pStyle w:val="Heading2"/>
         <w:spacing w:before="200" w:after="100"/>
       </w:pPr>
-      <w:bookmarkStart w:id="5" w:name="_Toc238312557"/>
+      <w:bookmarkStart w:id="5" w:name="_Toc238496050"/>
       <w:r>
         <w:t>1.4 How We Tested It, and Against What</w:t>
       </w:r>
@@ -5150,15 +5150,15 @@
         <w:spacing w:after="140" w:line="252" w:lineRule="auto"/>
       </w:pPr>
       <w:r>
-        <w:t>Every claim in this book is measured against fixed time control, the approach already deployed at most intersections, using three different cycle lengths (30, 45, and 60 seconds) as three separate baselines rather than a single convenient one. We also wanted to include Max Pressure, a more principled adaptive controller from the traffic engineering literature, as another agent to compare against, but integrating it reliably would have taken more development time than we had available, so we chose to skip it.</w:t>
-      </w:r>
-    </w:p>
-    <w:p>
-      <w:pPr>
-        <w:spacing w:after="140" w:line="252" w:lineRule="auto"/>
-      </w:pPr>
-      <w:r>
-        <w:t>The comparison is paired. SUMO's vehicle generation is seeded, so a given seed produces an identical stream of vehicles whichever controller drives the signal, meaning any difference comes from the controller and not from one run receiving easier traffic. We test all three demand levels, and the final methodology evaluates every saved checkpoint against its own independently drawn seed and scenario, reporting every result rather than a selected best. Chapter 6 describes the process, Chapter 5 the outcome.</w:t>
+        <w:t>Every method in this project is compared against fixed time control, the approach already deployed at most intersections, using three cycle lengths of 30, 45, and 60 seconds as three separate baselines. We also wanted to include Max Pressure, a more principled adaptive controller from the traffic engineering literature, but integrating it reliably would have taken more development time than we had, so we did not pursue it.</w:t>
+      </w:r>
+    </w:p>
+    <w:p>
+      <w:pPr>
+        <w:spacing w:after="140" w:line="252" w:lineRule="auto"/>
+      </w:pPr>
+      <w:r>
+        <w:t>Every comparison runs in the same traffic. SUMO's vehicle generation is seeded, so a given seed produces an identical stream of vehicles whichever controller drives the signal. Any difference in the result therefore comes from the controller, not from one run getting easier traffic. We tested all three demand levels, and the final method evaluates every saved checkpoint against its own seed and scenario, reporting every result rather than a selected best.</w:t>
       </w:r>
     </w:p>
     <w:p>
@@ -5166,7 +5166,7 @@
         <w:pStyle w:val="Heading2"/>
         <w:spacing w:before="200" w:after="100"/>
       </w:pPr>
-      <w:bookmarkStart w:id="6" w:name="_Toc238312558"/>
+      <w:bookmarkStart w:id="6" w:name="_Toc238496051"/>
       <w:r>
         <w:t>1.5 Who This Book Is For</w:t>
       </w:r>
@@ -5177,7 +5177,7 @@
         <w:spacing w:after="140" w:line="252" w:lineRule="auto"/>
       </w:pPr>
       <w:r>
-        <w:t>The intended stakeholders fall into two groups. For traffic engineers or municipal decision makers, what matters is the evaluation story: does it beat what is already in use, under which conditions, and with how much confidence. The second group is anyone who wishes to continue this work, for whom what matters is the version history, the attempts that failed and why, and having tools that make a new idea quick to test.</w:t>
+        <w:t>The intended stakeholders fall into two groups. For traffic engineers or municipal decision makers, what matters is the evaluation results: does the method outperform what is already in use, under which conditions, and with how much confidence. The second group is researchers who wish to continue this work, for whom what matters is the version history, the attempts that failed, and the explanations.</w:t>
       </w:r>
     </w:p>
     <w:p>
@@ -5185,7 +5185,7 @@
         <w:pStyle w:val="Heading1"/>
         <w:spacing w:before="260" w:after="130"/>
       </w:pPr>
-      <w:bookmarkStart w:id="7" w:name="_Toc238312559"/>
+      <w:bookmarkStart w:id="7" w:name="_Toc238496052"/>
       <w:r>
         <w:t>2. Background, Tools and Methods</w:t>
       </w:r>
@@ -5196,7 +5196,7 @@
         <w:pStyle w:val="Heading2"/>
         <w:spacing w:before="200" w:after="100"/>
       </w:pPr>
-      <w:bookmarkStart w:id="8" w:name="_Toc238312560"/>
+      <w:bookmarkStart w:id="8" w:name="_Toc238496053"/>
       <w:r>
         <w:t>2.1 Related Work</w:t>
       </w:r>
@@ -5207,35 +5207,32 @@
         <w:spacing w:after="140" w:line="252" w:lineRule="auto"/>
       </w:pPr>
       <w:r>
-        <w:t>Traffic signal control has evolved through several generations, each addressing a limitation of the previous one. Fixed time control, still the most common, runs a rigid schedule derived from historical traffic counts (Koonce et al., 2008), blind to current conditions. Vehicle actuated control improves on it with inductive loop detectors, extending or ending a phase according to whether a vehicle is present, but it relies on binary presence detection rather than any measure of volume, so a single vehicle on a minor approach can interrupt a heavy flow on a main road (Akçelik, 1994).</w:t>
-      </w:r>
-    </w:p>
-    <w:p>
-      <w:pPr>
-        <w:spacing w:after="140" w:line="252" w:lineRule="auto"/>
-      </w:pPr>
-      <w:r>
-        <w:t xml:space="preserve">A further generation moved beyond a single intersection's local logic. SCOOT models platoons using upstream detectors and continuously adjusts split, cycle, and offset to maintain a coordinated "green wave" along a corridor (UK Department of Transport, 1995). SCATS instead pursues "equisaturation," measuring a Degree of Saturation at the stop line and reallocating green time to balance competing approaches (Akçelik, 2010). Both are genuinely adaptive and </w:t>
-      </w:r>
+        <w:t>Traffic signal control has evolved through several generations. Fixed time control is still the most common. It runs a rigid schedule derived from historical traffic counts (Koonce et al., 2008), blind to current conditions. Vehicle actuated control improved on this with inductive loop detectors, extending or ending a phase according to whether a vehicle is present. The problem is that these systems rely on binary presence detection rather than any measure of volume, so a single vehicle on a minor approach can interrupt a heavy flow on a main road (Akçelik, 1994).</w:t>
+      </w:r>
+    </w:p>
+    <w:p>
+      <w:pPr>
+        <w:spacing w:after="140" w:line="252" w:lineRule="auto"/>
+      </w:pPr>
+      <w:r>
+        <w:t>A further generation moved beyond a single intersection's local logic. SCOOT models platoons using upstream detectors and continuously adjusts split, cycle, and offset to maintain a coordinated green wave along a corridor (UK Department of Transport, 1995). SCATS instead pursues equisaturation, measuring a Degree of Saturation at the stop line and reallocating green time to balance competing approaches (Akçelik, 2010). Both methods are genuinely adaptive and widely deployed. But their logic is fixed, and they are merely responsive to live inputs.</w:t>
+      </w:r>
+    </w:p>
+    <w:p>
+      <w:pPr>
+        <w:spacing w:after="140" w:line="252" w:lineRule="auto"/>
+      </w:pPr>
+      <w:r>
+        <w:t>A more modern line of research looks past physical signals altogether. Dresner and Stone (2008) proposed a reservation based Autonomous Intersection Management protocol, in which vehicles negotiate directly with an intersection manager and pass through without stopping. Liang et al. (2018) demonstrated a Vehicle to Infrastructure architecture, where vehicles broadcast their position and intent to roadside equipment, feeding a high resolution grid into a Double Dueling Deep Q Network. Both methods depend on a level of connected vehicle network penetration that does not exist yet.</w:t>
+      </w:r>
+    </w:p>
+    <w:p>
+      <w:pPr>
+        <w:spacing w:after="140" w:line="252" w:lineRule="auto"/>
+      </w:pPr>
       <w:r>
         <w:lastRenderedPageBreak/>
-        <w:t>widely deployed, but neither uses machine learning. Their logic is fixed in advance, merely responsive to live inputs rather than to a clock.</w:t>
-      </w:r>
-    </w:p>
-    <w:p>
-      <w:pPr>
-        <w:spacing w:after="140" w:line="252" w:lineRule="auto"/>
-      </w:pPr>
-      <w:r>
-        <w:t>A more modern line of research looks past physical signals altogether. Dresner and Stone (2008) proposed a reservation based Autonomous Intersection Management protocol, in which vehicles negotiate directly with an intersection manager and pass through without stopping. Liang et al. (2018) demonstrated a Vehicle to Infrastructure architecture, where vehicles broadcast their position and intent to roadside equipment, feeding a high resolution grid into a Double Dueling Deep Q Network. Both depend on a level of connected vehicle penetration that does not exist yet.</w:t>
-      </w:r>
-    </w:p>
-    <w:p>
-      <w:pPr>
-        <w:spacing w:after="140" w:line="252" w:lineRule="auto"/>
-      </w:pPr>
-      <w:r>
-        <w:t>Because this book refers to them repeatedly, the three methods behind that work are worth explaining briefly, each with the job it was meant to do in our own pipeline.</w:t>
+        <w:t>The original design was built on three methods:</w:t>
       </w:r>
     </w:p>
     <w:p>
@@ -5248,7 +5245,7 @@
         <w:spacing w:after="90" w:line="252" w:lineRule="auto"/>
       </w:pPr>
       <w:r>
-        <w:t>YOLO, short for You Only Look Once (Redmon et al., 2016), is an object detection algorithm. Given a single camera frame it draws a box around every object it finds and labels what each one is, in one pass over the whole image rather than by scanning many candidate regions in turn, which is what makes it fast enough for live video. In our project its job would be to recognize the vehicles on each approach from the camera feed, producing a count of how many wait in each lane group, one of the two readings our controller acts on.</w:t>
+        <w:t>YOLO, short for You Only Look Once (Redmon et al., 2016), is an object detection algorithm. Given a single camera frame it draws a box around every object it finds and labels what each one is, in one pass over the whole image rather than by scanning many candidate regions in turn, which is what makes it efficient for live video. Its role in the design was to recognize the vehicles on each approach from the camera feed, producing a count of how many wait in each lane group, one of the two inputs the controller acts on.</w:t>
       </w:r>
     </w:p>
     <w:p>
@@ -5261,7 +5258,7 @@
         <w:spacing w:after="90" w:line="252" w:lineRule="auto"/>
       </w:pPr>
       <w:r>
-        <w:t>DeepSORT (Wojke et al., 2017) is a tracking algorithm that runs on top of a detector such as YOLO. A detector alone treats every frame independently, so it can report that four cars are present now, but not that one of them arrived twenty seconds ago. DeepSORT links detections across frames into continuous tracks, predicting where each vehicle should appear next and matching it by appearance, so a vehicle keeps its identity even when a truck briefly hides it. In our project its job would be to give each vehicle that persistent identity, which makes it possible to measure how long one particular car has waited rather than merely how many are visible. That per vehicle waiting time is exactly the starvation signal our observation and reward are built on (Section 3.3), and it cannot be recovered from detection alone.</w:t>
+        <w:t>DeepSORT (Wojke et al., 2017) is a tracking algorithm that runs on top of a frame detector such as YOLO. A frame detector treats every frame independently, so it can only report which cars are present in one frame. DeepSORT links detections across frames into continuous tracks, predicting where each vehicle should appear next and matching it by appearance, so a vehicle keeps its identity even when a truck briefly hides it. Its role was to give each vehicle a persistent identity, which is what makes it possible to measure how long one particular car has waited. That per vehicle waiting time is the starvation signal our observation and reward are built on (Section 3.3), and detection alone cannot produce it.</w:t>
       </w:r>
     </w:p>
     <w:p>
@@ -5274,27 +5271,23 @@
         <w:spacing w:after="90" w:line="252" w:lineRule="auto"/>
       </w:pPr>
       <w:r>
-        <w:t>A Deep Q Network, or DQN (Mnih et al., 2015), is a reinforcement learning algorithm. It uses a neural network to estimate the future value of each action available in a situation, then acts by choosing the highest valued one, refining those estimates by replaying its own stored experience. The Double Dueling variant used by Liang et al. adds two refinements correcting a known tendency of the original to overestimate those values. In our project its job would be the decision itself, taking the readings above and choosing every few seconds whether to hold the current phase or advance. This is the one part of the pipeline we did build, although Section 4.3 explains why we eventually replaced DQN.</w:t>
-      </w:r>
-    </w:p>
-    <w:p>
-      <w:pPr>
-        <w:spacing w:after="140" w:line="252" w:lineRule="auto"/>
-      </w:pPr>
-      <w:r>
-        <w:t>Our original proposal aimed to bridge that gap with a "camera as a sensor" approach, combining these three methods into a full perception to decision pipeline retrofitted onto existing intersections rather than waiting for connected vehicles. Wang et al. (2024) validated a closely related framework, confirming this remains an active research direction.</w:t>
-      </w:r>
-    </w:p>
-    <w:p>
-      <w:pPr>
-        <w:spacing w:after="140" w:line="252" w:lineRule="auto"/>
-      </w:pPr>
-      <w:r>
-        <w:t xml:space="preserve">This is also why our agent observes only 150 meters back from the stop line. The observation was shaped to match what a roadside camera could plausibly deliver, so the same trained policy could later be driven by a real perception pipeline instead of simulator ground truth, without retraining on a different kind of input. As Chapter 4 describes, the project narrowed to the </w:t>
-      </w:r>
-      <w:r>
-        <w:lastRenderedPageBreak/>
-        <w:t>control policy question alone, and the vision layer was not implemented. We consider it the natural next step, not a direction tried and found wanting.</w:t>
+        <w:t>A Deep Q Network, or DQN (Mnih et al., 2015), is a reinforcement learning algorithm. It uses a neural network to estimate the future value of each action available in a situation, then acts by choosing the highest valued one, refining those estimates by replaying its own stored experience. The Double Dueling variant used by Liang et al. adds two refinements that correct a known tendency of the original to overestimate those values. Its role was the decision itself, choosing every few seconds whether to hold the current phase or advance. This is the one part of the pipeline we did build, although Section 4.3 explains why we later replaced it.</w:t>
+      </w:r>
+    </w:p>
+    <w:p>
+      <w:pPr>
+        <w:spacing w:after="140" w:line="252" w:lineRule="auto"/>
+      </w:pPr>
+      <w:r>
+        <w:t>Our original proposal aimed to use a camera as a sensor approach, combining these three methods into a full pipeline retrofitted onto existing intersections. Wang et al. (2024) validated a closely related framework, confirming this remains an active research direction.</w:t>
+      </w:r>
+    </w:p>
+    <w:p>
+      <w:pPr>
+        <w:spacing w:after="140" w:line="252" w:lineRule="auto"/>
+      </w:pPr>
+      <w:r>
+        <w:t>This is also why our agent observes only 150 meters back from the stop line. The observation was shaped to match what a roadside camera could plausibly deliver, so the same trained policy could later be driven by a real perception pipeline. As Chapter 4 explains, the vision layer was not implemented, and it remains the natural next step.</w:t>
       </w:r>
     </w:p>
     <w:p>
@@ -5302,7 +5295,7 @@
         <w:pStyle w:val="Heading2"/>
         <w:spacing w:before="200" w:after="100"/>
       </w:pPr>
-      <w:bookmarkStart w:id="9" w:name="_Toc238312561"/>
+      <w:bookmarkStart w:id="9" w:name="_Toc238496054"/>
       <w:r>
         <w:t>2.2 Why Reinforcement Learning Fits This Problem</w:t>
       </w:r>
@@ -5313,15 +5306,16 @@
         <w:spacing w:after="140" w:line="252" w:lineRule="auto"/>
       </w:pPr>
       <w:r>
-        <w:t>Reinforcement learning fits this problem because it has exactly the shape RL is built for: an agent (the signal controller) observes a state (who is waiting, for how long, how the intersection looks to the camera), takes an action (hold the phase, or advance), and receives feedback on whether that was a good decision, over and over across thousands of simulated episodes. What makes it hard also makes it interesting. The right reward signal is not obvious (reward the absence of waiting? reward throughput?), the environment is only partially observable, and, as this project showed more than once, an RL agent can find a technically correct but practically useless way to raise its own reward without helping a single driver.</w:t>
-      </w:r>
-    </w:p>
-    <w:p>
-      <w:pPr>
-        <w:spacing w:after="140" w:line="252" w:lineRule="auto"/>
-      </w:pPr>
-      <w:r>
-        <w:t>We built a dedicated single intersection SUMO (Simulation of Urban Mobility) environment to study this cleanly, before considering anything more ambitious, since most of the genuinely hard problems in this space, reward design, partial observability, exploration versus exploitation, and the risk of reward hacking, are already fully present at a single four phase intersection.</w:t>
+        <w:t>The problem maps onto the reinforcement learning formalism directly. An agent, here the signal controller, observes a state describing current demand at each approach, chooses an action, and receives a reward telling it whether that decision improved conditions. This repeats across thousands of simulated episodes. Three properties make it hard. The right reward is not obvious, since minimizing waiting time, maximizing throughput, and keeping approaches fair are not the same objective. The environment is only partially observable, because a roadside sensor cannot see indefinitely far upstream. And an agent can raise its reward through behavior that satisfies the reward definition but does nothing for road users, which this project encountered repeatedly.</w:t>
+      </w:r>
+    </w:p>
+    <w:p>
+      <w:pPr>
+        <w:spacing w:after="140" w:line="252" w:lineRule="auto"/>
+      </w:pPr>
+      <w:r>
+        <w:lastRenderedPageBreak/>
+        <w:t>We therefore built a dedicated single intersection environment in SUMO (Simulation of Urban Mobility) to isolate these issues before considering a larger network. Reward design, partial observability, the exploration and exploitation trade off, and the risk of reward exploitation are all present at a single four phase intersection, and are easier to diagnose there.</w:t>
       </w:r>
     </w:p>
     <w:p>
@@ -5329,7 +5323,7 @@
         <w:pStyle w:val="Heading2"/>
         <w:spacing w:before="200" w:after="100"/>
       </w:pPr>
-      <w:bookmarkStart w:id="10" w:name="_Toc238312562"/>
+      <w:bookmarkStart w:id="10" w:name="_Toc238496055"/>
       <w:r>
         <w:t>2.3 Tools and Technologies Used</w:t>
       </w:r>
@@ -5340,7 +5334,7 @@
         <w:spacing w:after="140" w:line="252" w:lineRule="auto"/>
       </w:pPr>
       <w:r>
-        <w:t>The simulation itself runs on SUMO (Simulation of Urban Mobility), driven through the sumo-rl and TraCI/libsumo interfaces from Python. Training uses Stable-Baselines3 and its sb3-contrib extension for the maskable variant of PPO, with vectorized, parallel environments (ten simultaneous SUMO instances during training) to make reasonable use of available CPU. Evaluation and analysis lean on pandas, matplotlib, and seaborn. The interactive comparison tooling differs by agent: the PPO agent's is a single FastAPI web application plus a small hand written HTML/CSS/JavaScript frontend, including a floating guided tour that walks a new user through every field. The DQN agent's is a plain Tkinter desktop application. FlowGrid_Web, the second browser application described in Section 3.7, is a React and Vite frontend over its own separate FastAPI backend. All of them are deliberately kept dependency light rather than pulled into a larger framework.</w:t>
+        <w:t>The simulation runs on SUMO, accessed from Python through the sumo-rl and TraCI/libsumo interfaces. Training uses Stable-Baselines3 with its sb3-contrib extension, which provides the maskable variant of PPO, over vectorized parallel environments running ten SUMO instances at once. Evaluation and analysis use pandas, matplotlib, and seaborn. The interactive tooling differs by agent. The PPO agent uses a FastAPI application with a hand written HTML, CSS, and JavaScript front end that includes a guided tour. The DQN agent keeps a Tkinter desktop application. FlowGrid_Web, described in Section 3.7, is a React and Vite front end over its own FastAPI backend. All were kept dependency light rather than built on a larger framework.</w:t>
       </w:r>
     </w:p>
     <w:p>
@@ -5348,7 +5342,7 @@
         <w:pStyle w:val="Heading1"/>
         <w:spacing w:before="260" w:after="130"/>
       </w:pPr>
-      <w:bookmarkStart w:id="11" w:name="_Toc238312563"/>
+      <w:bookmarkStart w:id="11" w:name="_Toc238496056"/>
       <w:r>
         <w:t>3. The Delivered System</w:t>
       </w:r>
@@ -5359,7 +5353,7 @@
         <w:spacing w:after="140" w:line="252" w:lineRule="auto"/>
       </w:pPr>
       <w:r>
-        <w:t>This chapter presents the algorithms and methodology behind the agent. The complete software system is fully documented in the Developer and Maintenance Guide (Appendix B).</w:t>
+        <w:t>This chapter presents the algorithms and methodology behind the agent. The software that implements them is documented in the Developer and Maintenance Guide (Appendix B).</w:t>
       </w:r>
     </w:p>
     <w:p>
@@ -5367,7 +5361,7 @@
         <w:pStyle w:val="Heading2"/>
         <w:spacing w:before="200" w:after="100"/>
       </w:pPr>
-      <w:bookmarkStart w:id="12" w:name="_Toc238312564"/>
+      <w:bookmarkStart w:id="12" w:name="_Toc238496057"/>
       <w:r>
         <w:t>3.1 System Architecture</w:t>
       </w:r>
@@ -5378,27 +5372,23 @@
         <w:spacing w:after="140" w:line="252" w:lineRule="auto"/>
       </w:pPr>
       <w:r>
-        <w:t>First, the plain version of what this system does. Our controller learns its job the way a person learns a game, by practising over and over and keeping whatever works. No real intersection is involved. The system runs a simulated one, lets the controller decide every few seconds whether to change the lights, tells it afterwards whether traffic got better or worse, and repeats that several million times. Everything below exists to make that practice loop run correctly, and fast enough to finish.</w:t>
-      </w:r>
-    </w:p>
-    <w:p>
-      <w:pPr>
-        <w:spacing w:after="140" w:line="252" w:lineRule="auto"/>
-      </w:pPr>
-      <w:r>
-        <w:t xml:space="preserve">The architecture separates into three stacked concerns: the simulator that models the traffic, a translation layer that turns raw simulator state into something an agent can learn from, and the learning algorithm itself. The agent never speaks to the simulator directly. Everything it observes and every action it takes passes through that middle layer. That separation is what made the </w:t>
-      </w:r>
-      <w:r>
-        <w:lastRenderedPageBreak/>
-        <w:t>long sequence of experiments in Section 4.4 practical, since each changed one component without disturbing the simulator below or the algorithm above.</w:t>
-      </w:r>
-    </w:p>
-    <w:p>
-      <w:pPr>
-        <w:spacing w:after="140" w:line="252" w:lineRule="auto"/>
-      </w:pPr>
-      <w:r>
-        <w:t>Figure 3.1 shows that stack as a UML component diagram. Every component named in it is a real class or module in the delivered codebase, not an aspirational design.</w:t>
+        <w:t>FlowGrid is a closed loop training system. A simulated intersection advances in fixed time steps, the agent chooses a control action at each step, and the resulting change in traffic state becomes a reward that updates the policy. Training repeats this loop for several million steps. The components below exist to run that loop correctly and fast enough to be practical.</w:t>
+      </w:r>
+    </w:p>
+    <w:p>
+      <w:pPr>
+        <w:spacing w:after="140" w:line="252" w:lineRule="auto"/>
+      </w:pPr>
+      <w:r>
+        <w:t>The architecture has three layers: the simulator that models traffic, a translation layer that converts raw simulator state into a learnable representation, and the learning algorithm. The agent never talks to the simulator directly. Every observation it receives and every action it issues passes through the middle layer. That separation is what made the sequence of reward and observation experiments in Section 4.4 practical, since each one changed a single layer without disturbing the others.</w:t>
+      </w:r>
+    </w:p>
+    <w:p>
+      <w:pPr>
+        <w:spacing w:after="140" w:line="252" w:lineRule="auto"/>
+      </w:pPr>
+      <w:r>
+        <w:t>Figure 3.1 shows these layers as a UML component diagram. Every component named in it is a real class or module in the delivered code.</w:t>
       </w:r>
     </w:p>
     <w:p>
@@ -5410,11 +5400,12 @@
         <w:rPr>
           <w:noProof/>
         </w:rPr>
+        <w:lastRenderedPageBreak/>
         <w:drawing>
-          <wp:inline distT="0" distB="0" distL="0" distR="0" wp14:anchorId="61B1B538" wp14:editId="798202ED">
+          <wp:inline distT="0" distB="0" distL="0" distR="0" wp14:anchorId="2896ADB6" wp14:editId="3792EE64">
             <wp:extent cx="5429250" cy="2781300"/>
             <wp:effectExtent l="0" t="0" r="0" b="0"/>
-            <wp:docPr id="298499326" name="Picture 298499326"/>
+            <wp:docPr id="1221097503" name="Picture 1221097503"/>
             <wp:cNvGraphicFramePr>
               <a:graphicFrameLocks xmlns:a="http://schemas.openxmlformats.org/drawingml/2006/main" noChangeAspect="1"/>
             </wp:cNvGraphicFramePr>
@@ -5469,7 +5460,7 @@
         <w:spacing w:after="140" w:line="252" w:lineRule="auto"/>
       </w:pPr>
       <w:r>
-        <w:t>Working from the bottom of that diagram upward, each part plays the following role.</w:t>
+        <w:t>Working from the bottom of the diagram upward:</w:t>
       </w:r>
     </w:p>
     <w:p>
@@ -5482,7 +5473,7 @@
         <w:spacing w:after="90" w:line="252" w:lineRule="auto"/>
       </w:pPr>
       <w:r>
-        <w:t>The simulated world. Eclipse SUMO, an open source traffic simulator, stands in for the real intersection. It decides where every vehicle is, how fast it moves, when it must stop behind the car in front, and how long it has waited. Our code controls it through TraCI, SUMO's remote control interface, which lets an outside program read what is happening and change the traffic light while the simulation runs. One setting is worth naming: SUMO normally deletes a vehicle stuck for an implausibly long time, and we switched that off, because leaving it on let an early version of our agent cheat (Section 7.1).</w:t>
+        <w:t>Simulation layer. Eclipse SUMO models the road network, vehicle dynamics, car following, and queue formation, and holds the ground truth state: where every vehicle is and how long it has waited. We drive it through TraCI, SUMO's remote control interface, which lets an external process read state and set the signal phase while the simulation runs. One configuration choice matters: SUMO by default removes vehicles that have been stationary for an implausibly long time, and we disabled it, because it let an early version of the agent exploit the reward function (Section 7.1).</w:t>
       </w:r>
     </w:p>
     <w:p>
@@ -5495,7 +5486,7 @@
         <w:spacing w:after="90" w:line="252" w:lineRule="auto"/>
       </w:pPr>
       <w:r>
-        <w:t>The translator. Our own SwitchOrKeepWrapper exists because the two sides speak different languages. SUMO deals in individual cars on individual lanes. A learning algorithm needs a fixed list of numbers in and a simple choice out. It does three jobs. It summarizes current traffic into the 21 numbers described in Section 3.3, seeing only 150 meters back from the stop line. It enforces the rules the agent may never break: a green light lasts at least 10 seconds and at most 60, every change passes through 3 seconds of yellow, and switching is unavailable when nobody is waiting. And it works out the score for the decision just made. Almost every experiment in Section 4.4 was a change to this one piece.</w:t>
+        <w:t>Translation layer. The SwitchOrKeepWrapper sits between the simulator, which deals in individual vehicles on individual lanes, and the learning algorithm, which needs a fixed length observation vector and a discrete action. It does three things. It builds the 21 element observation described in Section 3.3, subject to the 150 meter sensing limit. It enforces the constraints the policy may not override: a minimum green of 10 seconds, a maximum of 60, a mandatory 3 second yellow on every phase change, and an action mask that removes Switch when no vehicle is present. And it computes the reward. Almost every version in Section 4.4 was a change confined to this layer.</w:t>
       </w:r>
     </w:p>
     <w:p>
@@ -5508,7 +5499,7 @@
         <w:spacing w:after="90" w:line="252" w:lineRule="auto"/>
       </w:pPr>
       <w:r>
-        <w:t>The ten parallel worlds. Learning takes enormous practice, and one simulation produces it slowly. SubprocVecEnv, a standard Stable-Baselines3 component, runs ten complete SUMO simulations at once, each in its own process with its own traffic, feeding all ten streams of experience to the same learner. This is the difference between a training run finishing in hours and one finishing in days.</w:t>
+        <w:t>Parallel environment execution. Training time is bound by how fast experience can be generated, and one simulation produces it slowly. SubprocVecEnv, a standard Stable-Baselines3 component, runs ten SUMO instances in separate processes, each with independently generated demand, and merges their experience into one training stream. This brings a six million step run down from days to hours.</w:t>
       </w:r>
     </w:p>
     <w:p>
@@ -5521,11 +5512,7 @@
         <w:spacing w:after="90" w:line="252" w:lineRule="auto"/>
       </w:pPr>
       <w:r>
-        <w:t xml:space="preserve">The scaler. The 21 numbers arrive on very different scales, since a count of queued cars and a waiting time in seconds are not comparable, and a neural network learns badly </w:t>
-      </w:r>
-      <w:r>
-        <w:lastRenderedPageBreak/>
-        <w:t>when one input is numerically much larger than the rest. VecNormalize tracks how large each number typically is and rescales each against its own typical size, so all end up in a similar range. One consequence matters: those typical sizes are part of the trained agent, not a separate detail. An agent loaded without them reads a differently scaled world and behaves incorrectly, which is why every checkpoint is stored with its own copy.</w:t>
+        <w:t>Observation normalization. The 21 observation elements sit on very different numeric ranges, and gradient based training degrades when one input is far larger than the rest. VecNormalize tracks a running mean and variance for each element and rescales incoming observations against them, clipping to bound outliers. We normalize observations but not rewards, since the reward is already a bounded physical quantity. These statistics are part of the trained model, not a side file: a checkpoint restored without them receives inputs on the wrong scale and behaves incorrectly, which is why every checkpoint is saved together with its own copy.</w:t>
       </w:r>
     </w:p>
     <w:p>
@@ -5538,15 +5525,16 @@
         <w:spacing w:after="90" w:line="252" w:lineRule="auto"/>
       </w:pPr>
       <w:r>
-        <w:t>The learner. The MaskablePPO agent is the part that improves with practice: a small neural network, two layers of 128 units choosing what to do and two more judging how good the situation is. Maskable is the important word. On every decision the translator hands it a list of which actions are legal, and the illegal ones are removed before it chooses rather than blocked afterwards. Section 3.4 explains why that difference mattered so much.</w:t>
-      </w:r>
-    </w:p>
-    <w:p>
-      <w:pPr>
-        <w:spacing w:after="140" w:line="252" w:lineRule="auto"/>
-      </w:pPr>
-      <w:r>
-        <w:t>A single decision therefore looks like this. The simulation runs forward five seconds. The translator reads the intersection, writes down the 21 numbers, works out whether the previous decision helped or hurt, and notes which actions are legal. The scaler adjusts the numbers to their usual range. The agent answers one question: keep this light green, or move to the next phase. The translator carries that answer back, inserting the yellow light if the answer was to switch. Then it happens again. Training is this loop across ten simulations until the practice budget is used up. Evaluation is the same loop with learning switched off, run by the tools in Section 3.6.</w:t>
+        <w:lastRenderedPageBreak/>
+        <w:t>Policy optimization. The MaskablePPO agent holds the policy, a multilayer perceptron with two hidden layers of 128 units for the policy head and two for the value head. Action masking is the important property. At each decision the translation layer supplies the set of legal actions, and illegal ones are removed from the policy distribution before sampling rather than rejected afterwards. Section 3.4 explains why that mattered.</w:t>
+      </w:r>
+    </w:p>
+    <w:p>
+      <w:pPr>
+        <w:spacing w:after="140" w:line="252" w:lineRule="auto"/>
+      </w:pPr>
+      <w:r>
+        <w:t>A single decision step runs as follows. The simulation advances five simulated seconds. The translation layer reads the resulting state through TraCI, builds the 21 observation elements, computes the reward earned by the previous action, and determines the current action mask. The observation is normalized. The policy chooses Keep or Switch. The translation layer converts that choice into signal commands, inserting the yellow interval on a phase change. The cycle repeats. Training runs this loop across ten parallel environments until the step budget is spent. Evaluation is the same loop with policy updates disabled, driven by the tooling in Section 3.6.</w:t>
       </w:r>
     </w:p>
     <w:p>
@@ -5554,7 +5542,7 @@
         <w:pStyle w:val="Heading2"/>
         <w:spacing w:before="200" w:after="100"/>
       </w:pPr>
-      <w:bookmarkStart w:id="13" w:name="_Toc238312565"/>
+      <w:bookmarkStart w:id="13" w:name="_Toc238496058"/>
       <w:r>
         <w:t>3.2 The Decision Problem, Formally</w:t>
       </w:r>
@@ -5565,15 +5553,15 @@
         <w:spacing w:after="140" w:line="252" w:lineRule="auto"/>
       </w:pPr>
       <w:r>
-        <w:t>Every reinforcement learning problem reduces to a Markov Decision Process: a state the agent observes, an action it chooses, a reward it receives, and rules governing how the state evolves. Framing our own problem this way early on was one of the more clarifying steps in the project, since it forced explicit answers to questions that are easy to leave vague otherwise.</w:t>
-      </w:r>
-    </w:p>
-    <w:p>
-      <w:pPr>
-        <w:spacing w:after="140" w:line="252" w:lineRule="auto"/>
-      </w:pPr>
-      <w:r>
-        <w:t>Figure 3.2 shows that loop as our own code implements it, inside the SwitchOrKeepWrapper. Its numbered steps correspond directly to the state, action, and reward definitions given in Section 3.3.</w:t>
+        <w:t>Every reinforcement learning problem reduces to a Markov Decision Process: a state the agent observes, an action it chooses, a reward it receives, and rules governing how the state evolves. Framing the problem this way early forced explicit answers to questions that are easy to leave vague.</w:t>
+      </w:r>
+    </w:p>
+    <w:p>
+      <w:pPr>
+        <w:spacing w:after="140" w:line="252" w:lineRule="auto"/>
+      </w:pPr>
+      <w:r>
+        <w:t>Figure 3.2 shows that loop as our code implements it, inside the SwitchOrKeepWrapper. Its numbered steps map directly onto the state, action, and reward definitions in Section 3.3.</w:t>
       </w:r>
     </w:p>
     <w:p>
@@ -5585,12 +5573,11 @@
         <w:rPr>
           <w:noProof/>
         </w:rPr>
-        <w:lastRenderedPageBreak/>
         <w:drawing>
-          <wp:inline distT="0" distB="0" distL="0" distR="0" wp14:anchorId="0BB73949" wp14:editId="0F1D4A50">
+          <wp:inline distT="0" distB="0" distL="0" distR="0" wp14:anchorId="1AD052EA" wp14:editId="450993A7">
             <wp:extent cx="4286250" cy="3419475"/>
             <wp:effectExtent l="0" t="0" r="0" b="0"/>
-            <wp:docPr id="1189017889" name="Picture 1189017889"/>
+            <wp:docPr id="1042289572" name="Picture 1042289572"/>
             <wp:cNvGraphicFramePr>
               <a:graphicFrameLocks xmlns:a="http://schemas.openxmlformats.org/drawingml/2006/main" noChangeAspect="1"/>
             </wp:cNvGraphicFramePr>
@@ -5645,7 +5632,7 @@
         <w:pStyle w:val="Heading2"/>
         <w:spacing w:before="200" w:after="100"/>
       </w:pPr>
-      <w:bookmarkStart w:id="14" w:name="_Toc238312566"/>
+      <w:bookmarkStart w:id="14" w:name="_Toc238496059"/>
       <w:r>
         <w:t>3.3 State, Action, and Reward</w:t>
       </w:r>
@@ -5656,23 +5643,27 @@
         <w:spacing w:after="140" w:line="252" w:lineRule="auto"/>
       </w:pPr>
       <w:r>
-        <w:t>The state is a 21 dimensional vector, normalized to [0, 1]: a one hot encoding of which of the four phases is green, how long it has held green as a fraction of its allowed maximum, an occupancy density for each of eight lane groups (camera limited to 150 meters), and a starvation score per lane group capturing how long that group's longest waiting vehicle has sat there. That last piece matters: an intersection can show a reasonable average wait while one unlucky vehicle in a rarely served lane waits far longer than anyone would accept, and the starvation term exists so the agent cannot ignore that vehicle just because the aggregate looks fine.</w:t>
-      </w:r>
-    </w:p>
-    <w:p>
-      <w:pPr>
-        <w:spacing w:after="140" w:line="252" w:lineRule="auto"/>
-      </w:pPr>
-      <w:r>
-        <w:t>The action space is intentionally small: hold the current phase, or switch to the next in a fixed cyclic order. We do not let the agent jump to an arbitrary phase, since early experimentation (Chapter 7) showed a free jump action space encourages rapid, wasteful cycling through yellow transitions, and a cyclic structure removes that failure mode by construction rather than penalizing it away. The hard constraints listed in Section 3.1 sit on top of this action space, enforced outside the learned policy entirely.</w:t>
-      </w:r>
-    </w:p>
-    <w:p>
-      <w:pPr>
-        <w:spacing w:after="140" w:line="252" w:lineRule="auto"/>
-      </w:pPr>
-      <w:r>
-        <w:t>The reward is deliberately simple: the reduction in total system wide waiting time between one decision and the next, measured directly from the simulator, minus a small penalty tied to the worst starvation score observed. Simplicity was a hard won lesson rather than a starting assumption. An earlier reward (Chapter 7) used a dozen or more hand tuned terms, and untangling which one drove a given behavior became close to impossible. Tying the reward to the same quantity the project is ultimately judged on made both training and debugging far more tractable.</w:t>
+        <w:t xml:space="preserve">The state is a 21 element vector, normalized to the range 0 to 1: a one hot encoding of which of the four phases is green, how long it has held green as a fraction of its maximum, an occupancy density for each of eight lane groups, and a starvation score per lane group giving how long that group's longest waiting vehicle has sat there. The starvation term matters because an </w:t>
+      </w:r>
+      <w:r>
+        <w:lastRenderedPageBreak/>
+        <w:t>intersection can show a reasonable average wait while one vehicle in a rarely served lane waits far longer than anyone would accept. It exists so the agent cannot ignore that vehicle when the aggregate looks fine.</w:t>
+      </w:r>
+    </w:p>
+    <w:p>
+      <w:pPr>
+        <w:spacing w:after="140" w:line="252" w:lineRule="auto"/>
+      </w:pPr>
+      <w:r>
+        <w:t>The action space is deliberately small: hold the current phase, or switch to the next in a fixed cyclic order. We do not allow jumps to an arbitrary phase. Early experiments (Chapter 7) showed that a free jump action space encourages rapid cycling through yellow transitions, and a cyclic structure removes that failure mode by construction. The hard constraints listed in Section 3.1 sit on top of this action space and are enforced outside the policy.</w:t>
+      </w:r>
+    </w:p>
+    <w:p>
+      <w:pPr>
+        <w:spacing w:after="140" w:line="252" w:lineRule="auto"/>
+      </w:pPr>
+      <w:r>
+        <w:t>The reward is simple: the reduction in total system wide waiting time between one decision and the next, measured directly from the simulator, minus a small penalty tied to the worst starvation score. Simplicity was a hard won lesson rather than a starting assumption. An earlier reward (Chapter 7) used a dozen hand tuned terms, and it became almost impossible to tell which one drove a given behavior. Tying the reward to the same quantity the project is judged on made training and debugging far easier.</w:t>
       </w:r>
     </w:p>
     <w:p>
@@ -5680,7 +5671,7 @@
         <w:pStyle w:val="Heading2"/>
         <w:spacing w:before="200" w:after="100"/>
       </w:pPr>
-      <w:bookmarkStart w:id="15" w:name="_Toc238312567"/>
+      <w:bookmarkStart w:id="15" w:name="_Toc238496060"/>
       <w:r>
         <w:t>3.4 Why MaskablePPO</w:t>
       </w:r>
@@ -5691,11 +5682,7 @@
         <w:spacing w:after="140" w:line="252" w:lineRule="auto"/>
       </w:pPr>
       <w:r>
-        <w:t xml:space="preserve">We trained the final agent using MaskablePPO, an extension of standard Proximal Policy Optimization that is aware of action masking: when an action is structurally disallowed in a given state (for instance, switching an empty intersection), the masked probability is properly </w:t>
-      </w:r>
-      <w:r>
-        <w:lastRenderedPageBreak/>
-        <w:t>excluded from the policy's own distribution rather than merely blocked after the fact. We considered Deep Q Networks as an alternative, and an earlier, parallel DQN implementation exists in this project's codebase, described in Section 4.3, but PPO's clipped policy updates and built in early stopping on excessive KL divergence gave us two independent safeguards against the kind of violent, single update policy collapse that had already cost us real time earlier in the project (see Section 7.2). Those safeguards mattered more to us, in practice, than any small efficiency argument in either algorithm's favor.</w:t>
+        <w:t>We trained the final agent with MaskablePPO, an extension of Proximal Policy Optimization that understands action masking. When an action is structurally disallowed, such as switching an empty intersection, its probability is removed from the policy distribution rather than blocked after the fact. We considered Deep Q Networks instead, and an earlier DQN implementation exists in the codebase (Section 4.3). PPO's clipped updates and its early stopping on excessive KL divergence gave us two independent guards against the abrupt policy collapse that had already cost us time (Section 7.2). Those guards mattered more in practice than any efficiency argument either way.</w:t>
       </w:r>
     </w:p>
     <w:p>
@@ -5703,7 +5690,7 @@
         <w:pStyle w:val="Heading2"/>
         <w:spacing w:before="200" w:after="100"/>
       </w:pPr>
-      <w:bookmarkStart w:id="16" w:name="_Toc238312568"/>
+      <w:bookmarkStart w:id="16" w:name="_Toc238496061"/>
       <w:r>
         <w:t>3.5 The Decision Loop in Operation</w:t>
       </w:r>
@@ -5714,7 +5701,7 @@
         <w:spacing w:after="140" w:line="252" w:lineRule="auto"/>
       </w:pPr>
       <w:r>
-        <w:t>Figure 3.3 traces the decision loop as it actually runs today, drawn as a UML activity diagram, and every box in it corresponds to a real step inside sumo_rl_env_V8.py. Two things in it are worth noticing. The hard action mask, the step that removes Switch from the available choices, is the structural safety constraint described in Section 3.3 rather than a penalty applied after the fact. And there is no YOLO detection, no DeepSORT tracking, no Priority Protocol, and no Fallback Mode anywhere in the loop, because none of those were built, for the reasons Chapter 4 gives.</w:t>
+        <w:t>Figure 3.3 traces the decision loop as it runs today, as a UML activity diagram. Every box corresponds to a real step in sumo_rl_env_V8.py. Two things are worth noting. The hard action mask, the step that removes Switch, is the structural constraint from Section 3.3 rather than a penalty applied afterwards. And there is no YOLO detection, DeepSORT tracking, Priority Protocol, or Fallback Mode anywhere in the loop, because none of those were built (Chapter 4).</w:t>
       </w:r>
     </w:p>
     <w:p>
@@ -5726,11 +5713,12 @@
         <w:rPr>
           <w:noProof/>
         </w:rPr>
+        <w:lastRenderedPageBreak/>
         <w:drawing>
-          <wp:inline distT="0" distB="0" distL="0" distR="0" wp14:anchorId="71B899A7" wp14:editId="51EB9D85">
+          <wp:inline distT="0" distB="0" distL="0" distR="0" wp14:anchorId="1B7253CC" wp14:editId="0C0582B1">
             <wp:extent cx="4286250" cy="3286125"/>
             <wp:effectExtent l="0" t="0" r="0" b="0"/>
-            <wp:docPr id="587782794" name="Picture 587782794"/>
+            <wp:docPr id="222806958" name="Picture 222806958"/>
             <wp:cNvGraphicFramePr>
               <a:graphicFrameLocks xmlns:a="http://schemas.openxmlformats.org/drawingml/2006/main" noChangeAspect="1"/>
             </wp:cNvGraphicFramePr>
@@ -5785,7 +5773,7 @@
         <w:pStyle w:val="Heading2"/>
         <w:spacing w:before="200" w:after="100"/>
       </w:pPr>
-      <w:bookmarkStart w:id="17" w:name="_Toc238312569"/>
+      <w:bookmarkStart w:id="17" w:name="_Toc238496062"/>
       <w:r>
         <w:t>3.6 The Comparison Application</w:t>
       </w:r>
@@ -5796,27 +5784,23 @@
         <w:spacing w:after="140" w:line="252" w:lineRule="auto"/>
       </w:pPr>
       <w:r>
-        <w:t>The comparison application makes every claim in Chapter 5 independently checkable. It lets anyone pick a trained model, the fixed time baselines to measure it against, a traffic scenario and one or more random seeds, and run the comparison directly in a browser. Its "Watch Live" mode opens a real SUMO window so the agent's behavior can be watched rather than inferred from a number.</w:t>
-      </w:r>
-    </w:p>
-    <w:p>
-      <w:pPr>
-        <w:spacing w:after="140" w:line="252" w:lineRule="auto"/>
-      </w:pPr>
-      <w:r>
-        <w:t xml:space="preserve">The application is designed to be approachable to new users. It opens with a floating, step by step guided tour that spotlights each field in turn, for example which models to compare, which baselines to use, how seeds and scenarios work, and what "Watch Live" does, each with a plain language explanation. It starts automatically on every visit and can be reopened using a "? </w:t>
-      </w:r>
-      <w:r>
-        <w:lastRenderedPageBreak/>
-        <w:t>Guide" button in the header. We consider this a genuine part of the deliverable, since a comparison tool nobody can work out how to use produces no meaningful results at all.</w:t>
-      </w:r>
-    </w:p>
-    <w:p>
-      <w:pPr>
-        <w:spacing w:after="140" w:line="252" w:lineRule="auto"/>
-      </w:pPr>
-      <w:r>
-        <w:t>Figure 3.4 shows what Watch Live actually opens, SUMO's own graphical window, which is the same view a reviewer sees when we demonstrate the agent. The intersection geometry and the vehicles, in yellow, are real, and the red and green bars on each approach lane are the current signal phase.</w:t>
+        <w:t>The comparison application makes every claim in Chapter 5 independently checkable. It lets anyone pick a trained model, the baselines to measure it against, a traffic scenario, and one or more seeds, then run the comparison in a browser. Its Watch Live mode opens a real SUMO window so the agent's behavior can be watched rather than inferred from a number.</w:t>
+      </w:r>
+    </w:p>
+    <w:p>
+      <w:pPr>
+        <w:spacing w:after="140" w:line="252" w:lineRule="auto"/>
+      </w:pPr>
+      <w:r>
+        <w:t>The application is built to be approachable to new users. It opens with a floating, step by step guided tour that highlights each field in turn, for example which models to compare, which baselines to use, how seeds and scenarios work, and what Watch Live does. It starts automatically on every visit and can be reopened from a Guide button in the header. We treat this as part of the deliverable, since a comparison tool nobody can operate produces no results.</w:t>
+      </w:r>
+    </w:p>
+    <w:p>
+      <w:pPr>
+        <w:spacing w:after="140" w:line="252" w:lineRule="auto"/>
+      </w:pPr>
+      <w:r>
+        <w:t>Figure 3.4 shows what Watch Live opens: SUMO's own graphical window, the same view a reviewer sees during a demonstration. The intersection geometry and the vehicles in yellow are real, and the red and green bars on each approach are the current signal phase.</w:t>
       </w:r>
     </w:p>
     <w:p>
@@ -5829,10 +5813,10 @@
           <w:noProof/>
         </w:rPr>
         <w:drawing>
-          <wp:inline distT="0" distB="0" distL="0" distR="0" wp14:anchorId="5706C8EA" wp14:editId="3A568B6E">
+          <wp:inline distT="0" distB="0" distL="0" distR="0" wp14:anchorId="4A738203" wp14:editId="4C4F9264">
             <wp:extent cx="5429250" cy="2571750"/>
             <wp:effectExtent l="0" t="0" r="0" b="0"/>
-            <wp:docPr id="1597654406" name="Picture 1597654406"/>
+            <wp:docPr id="699377842" name="Picture 699377842"/>
             <wp:cNvGraphicFramePr>
               <a:graphicFrameLocks xmlns:a="http://schemas.openxmlformats.org/drawingml/2006/main" noChangeAspect="1"/>
             </wp:cNvGraphicFramePr>
@@ -5879,6 +5863,7 @@
           <w:sz w:val="20"/>
           <w:szCs w:val="20"/>
         </w:rPr>
+        <w:lastRenderedPageBreak/>
         <w:t>Figure 3.4: The SUMO window during a Watch Live session.</w:t>
       </w:r>
     </w:p>
@@ -5887,7 +5872,7 @@
         <w:spacing w:after="140" w:line="252" w:lineRule="auto"/>
       </w:pPr>
       <w:r>
-        <w:t>Figure 3.5 shows the application itself at the end of a run, comparing PPO_Agent_V8 against the Fixed_45s baseline in medium traffic on seed 732846, with the results table and bar chart it produces. This is a real screenshot of the delivered application, not a mockup.</w:t>
+        <w:t>Figure 3.5 shows the application at the end of a run, comparing PPO_Agent_V8 against the Fixed_45s baseline in medium traffic on seed 732846, with the results table and bar chart it produces. This is a real screenshot, not a mockup.</w:t>
       </w:r>
     </w:p>
     <w:p>
@@ -5900,10 +5885,10 @@
           <w:noProof/>
         </w:rPr>
         <w:drawing>
-          <wp:inline distT="0" distB="0" distL="0" distR="0" wp14:anchorId="252FCD4F" wp14:editId="35E41B14">
+          <wp:inline distT="0" distB="0" distL="0" distR="0" wp14:anchorId="23AFF659" wp14:editId="308A7D04">
             <wp:extent cx="5048250" cy="3857625"/>
             <wp:effectExtent l="0" t="0" r="0" b="0"/>
-            <wp:docPr id="142532642" name="Picture 142532642"/>
+            <wp:docPr id="1924440898" name="Picture 1924440898"/>
             <wp:cNvGraphicFramePr>
               <a:graphicFrameLocks xmlns:a="http://schemas.openxmlformats.org/drawingml/2006/main" noChangeAspect="1"/>
             </wp:cNvGraphicFramePr>
@@ -5958,9 +5943,8 @@
         <w:pStyle w:val="Heading2"/>
         <w:spacing w:before="200" w:after="100"/>
       </w:pPr>
-      <w:bookmarkStart w:id="18" w:name="_Toc238312570"/>
-      <w:r>
-        <w:lastRenderedPageBreak/>
+      <w:bookmarkStart w:id="18" w:name="_Toc238496063"/>
+      <w:r>
         <w:t>3.7 FlowGrid_Web, the Operations Dashboard</w:t>
       </w:r>
       <w:bookmarkEnd w:id="18"/>
@@ -5970,15 +5954,15 @@
         <w:spacing w:after="140" w:line="252" w:lineRule="auto"/>
       </w:pPr>
       <w:r>
-        <w:t>This phase also delivered FlowGrid_Web, an independent SaaS style traffic operations dashboard (its own backend, multi junction navigation, login, device settings, reports, user management) showing what a fully deployed version of this system could look like to a traffic authority operator. Every screen is a real, working UI, but for every junction except one the data behind it is simulated. The exception is deliberate: "Live Junction (SUMO Simulation)" is wired to the same trained PPO agent and simulator described throughout this book, with a "Run Agent" control (scenario only, random seed chosen automatically) that launches a real, paced SUMO episode and streams back live per direction queue counts, signal colors, and a snapshot from the running SUMO window, the same simulation shown in Figure 3.4.</w:t>
-      </w:r>
-    </w:p>
-    <w:p>
-      <w:pPr>
-        <w:spacing w:after="140" w:line="252" w:lineRule="auto"/>
-      </w:pPr>
-      <w:r>
-        <w:t>Figure 3.6 reproduces the Use Case Diagram from our Phase A proposal, unchanged from the original. FlowGrid_Web implements every one of these eight use cases as a real, clickable screen. What still separates it from a fully deployed system is the data behind those screens, real and live only for View Junction Data on the Live Junction, and simulated everywhere else, including Log In, which accepts two fixed demonstration accounts rather than a real authentication server.</w:t>
+        <w:t>This phase also delivered FlowGrid_Web, an independent SaaS style traffic operations dashboard with its own backend, multi junction navigation, login, device settings, reports, and user management. It shows what a fully deployed version of this system could look like to a traffic authority operator. Every screen is a real, working interface, but for every junction except one the data behind it is simulated. The exception is deliberate: Live Junction (SUMO Simulation) is wired to the same trained PPO agent and simulator used throughout this book, with a Run Agent control that launches a real SUMO episode and streams back live per direction queue counts, signal colors, and a snapshot from the running window, the same simulation shown in Figure 3.4.</w:t>
+      </w:r>
+    </w:p>
+    <w:p>
+      <w:pPr>
+        <w:spacing w:after="140" w:line="252" w:lineRule="auto"/>
+      </w:pPr>
+      <w:r>
+        <w:t>Figure 3.6 reproduces the Use Case Diagram from our Phase A proposal, unchanged. FlowGrid_Web implements all eight use cases as real, clickable screens. What separates it from a deployed system is the data behind those screens, which is real and live only for View Junction Data on the Live Junction and simulated everywhere else, including Log In, which accepts two fixed demonstration accounts rather than a real authentication server.</w:t>
       </w:r>
     </w:p>
     <w:p>
@@ -5990,11 +5974,12 @@
         <w:rPr>
           <w:noProof/>
         </w:rPr>
+        <w:lastRenderedPageBreak/>
         <w:drawing>
-          <wp:inline distT="0" distB="0" distL="0" distR="0" wp14:anchorId="0AEF9DC5" wp14:editId="25843754">
+          <wp:inline distT="0" distB="0" distL="0" distR="0" wp14:anchorId="4BEABD45" wp14:editId="076BF076">
             <wp:extent cx="4667250" cy="3448050"/>
             <wp:effectExtent l="0" t="0" r="0" b="0"/>
-            <wp:docPr id="1113671741" name="Picture 1113671741"/>
+            <wp:docPr id="734078583" name="Picture 734078583"/>
             <wp:cNvGraphicFramePr>
               <a:graphicFrameLocks xmlns:a="http://schemas.openxmlformats.org/drawingml/2006/main" noChangeAspect="1"/>
             </wp:cNvGraphicFramePr>
@@ -6057,7 +6042,7 @@
         <w:pStyle w:val="Heading1"/>
         <w:spacing w:before="260" w:after="130"/>
       </w:pPr>
-      <w:bookmarkStart w:id="19" w:name="_Toc238312571"/>
+      <w:bookmarkStart w:id="19" w:name="_Toc238496064"/>
       <w:r>
         <w:t>4. Development Process and Decision Making</w:t>
       </w:r>
@@ -6068,7 +6053,7 @@
         <w:pStyle w:val="Heading2"/>
         <w:spacing w:before="200" w:after="100"/>
       </w:pPr>
-      <w:bookmarkStart w:id="20" w:name="_Toc238312572"/>
+      <w:bookmarkStart w:id="20" w:name="_Toc238496065"/>
       <w:r>
         <w:t>4.1 From the Original Plan to What We Actually Built</w:t>
       </w:r>
@@ -6079,19 +6064,15 @@
         <w:spacing w:after="140" w:line="252" w:lineRule="auto"/>
       </w:pPr>
       <w:r>
-        <w:t xml:space="preserve">The delivered project sits some distance from the Phase A proposal, and we would rather explain that plainly than let it surface as an unexplained gap. The proposal described a complete </w:t>
-      </w:r>
-      <w:r>
-        <w:lastRenderedPageBreak/>
-        <w:t>perception to decision pipeline: YOLO for detection and classification, DeepSORT for tracking across occlusion, a DQN agent making the phase decisions, a Priority Protocol guaranteeing zero delay for emergency vehicles, a Rule Based Safety Layer and Historical Data Fallback Mode, and a cloud hosted dashboard (FastAPI, PostgreSQL, deployed on Render). Its success criteria were correspondingly broad: at least 20% less average waiting time, at least 15% less maximum queue length, detection accuracy above 90% (95% for emergency vehicles), sub 100 millisecond latency, and zero delay emergency preemption in 100% of test cases.</w:t>
-      </w:r>
-    </w:p>
-    <w:p>
-      <w:pPr>
-        <w:spacing w:after="140" w:line="252" w:lineRule="auto"/>
-      </w:pPr>
-      <w:r>
-        <w:t>Figure 4.1 reproduces the Deployment Diagram from that proposal, relabelled only to say Trained PPO Model in place of Trained DQN Model, per Section 4.3. We show it specifically because it was not implemented. None of the cloud infrastructure, the edge device, the IP camera, or the traffic light controller integration drawn in it exists in the delivered system. What we built instead is the pipeline shown in Figure 3.1.</w:t>
+        <w:t>The delivered system differs substantially from the Phase A proposal. The proposal described a full perception to decision pipeline: YOLO for vehicle detection and classification, DeepSORT for tracking across occlusion, a DQN agent for phase selection, a Priority Protocol giving emergency vehicles zero delay, a Rule Based Safety Layer with a Historical Data Fallback Mode, and a cloud hosted dashboard on FastAPI and PostgreSQL. Its success criteria were equally broad: at least 20% less average waiting time, at least 15% less maximum queue length, detection accuracy above 90% and above 95% for emergency vehicles, latency under 100 milliseconds, and zero delay emergency preemption in all test cases.</w:t>
+      </w:r>
+    </w:p>
+    <w:p>
+      <w:pPr>
+        <w:spacing w:after="140" w:line="252" w:lineRule="auto"/>
+      </w:pPr>
+      <w:r>
+        <w:t>Figure 4.1 reproduces the Deployment Diagram from that proposal, relabelled only to say Trained PPO Model in place of Trained DQN Model. We show it because it was not implemented. None of the cloud infrastructure, the edge device, the IP camera, or the controller integration in it exists in the delivered system. What we built instead is the pipeline in Figure 3.1.</w:t>
       </w:r>
     </w:p>
     <w:p>
@@ -6103,11 +6084,12 @@
         <w:rPr>
           <w:noProof/>
         </w:rPr>
+        <w:lastRenderedPageBreak/>
         <w:drawing>
-          <wp:inline distT="0" distB="0" distL="0" distR="0" wp14:anchorId="5C4B6429" wp14:editId="534E6025">
+          <wp:inline distT="0" distB="0" distL="0" distR="0" wp14:anchorId="52F4A406" wp14:editId="0E456D1F">
             <wp:extent cx="4476750" cy="4210050"/>
             <wp:effectExtent l="0" t="0" r="0" b="0"/>
-            <wp:docPr id="485556484" name="Picture 485556484"/>
+            <wp:docPr id="1496366269" name="Picture 1496366269"/>
             <wp:cNvGraphicFramePr>
               <a:graphicFrameLocks xmlns:a="http://schemas.openxmlformats.org/drawingml/2006/main" noChangeAspect="1"/>
             </wp:cNvGraphicFramePr>
@@ -6162,7 +6144,7 @@
         <w:spacing w:after="140" w:line="252" w:lineRule="auto"/>
       </w:pPr>
       <w:r>
-        <w:t>What we delivered is narrower, and in the one dimension we chose to go deep on, far more rigorously verified than the plan called for: a single intersection control policy, trained and evaluated on the simulator's own ground truth vehicle state rather than a vision pipeline, with no priority protocol, no fallback mode, and no cloud infrastructure. The vision layer, the emergency priority logic, and the cloud hosting were not implemented.</w:t>
+        <w:t>The delivered scope is narrower, and in the one dimension we chose to go deep on, verified far more rigorously than the proposal required: a single intersection control policy, trained and evaluated on the simulator's ground truth vehicle state rather than a vision estimate, with no priority protocol, no fallback mode, and no cloud infrastructure. The vision layer, the emergency preemption logic, and the hosted deployment were not built.</w:t>
       </w:r>
     </w:p>
     <w:p>
@@ -6170,7 +6152,7 @@
         <w:pStyle w:val="Heading2"/>
         <w:spacing w:before="200" w:after="100"/>
       </w:pPr>
-      <w:bookmarkStart w:id="21" w:name="_Toc238312573"/>
+      <w:bookmarkStart w:id="21" w:name="_Toc238496066"/>
       <w:r>
         <w:t>4.2 Why the Scope Narrowed</w:t>
       </w:r>
@@ -6181,19 +6163,15 @@
         <w:spacing w:after="140" w:line="252" w:lineRule="auto"/>
       </w:pPr>
       <w:r>
-        <w:t xml:space="preserve">Two reasons drove this, and both were real rather than the more flattering one. The first was a deliberate research decision. The control policy question, given a traffic state, which phase should be green and for how long, is already a substantial problem on its own, as Section 4.4 </w:t>
-      </w:r>
-      <w:r>
-        <w:lastRenderedPageBreak/>
-        <w:t>demonstrates at length. Bundling it with an unsolved vision and tracking problem would have made it far harder to tell, when something went wrong, whether the fault lay in perception or in decision making. Isolating the control problem first, using ground truth as a stand in for perfect perception, let us study it cleanly.</w:t>
-      </w:r>
-    </w:p>
-    <w:p>
-      <w:pPr>
-        <w:spacing w:after="140" w:line="252" w:lineRule="auto"/>
-      </w:pPr>
-      <w:r>
-        <w:t>The second reason was circumstantial rather than planned: during the project timeline, both of us were called up for military reserves, which is compulsory once summoned and cannot be deferred on request, removing a significant and unpredictable block of development time with no advance warning. Faced with a real reduction in available time, we chose to protect the depth and rigor of the reinforcement learning work already underway, rather than spread the remaining time thinly across vision, tracking, priority logic, and cloud infrastructure and risk finishing all of them shallowly, with nothing brought to a genuinely complete, demonstrable state. We see this as two distinct phases of the same project: the decision making "brain," the reinforcement learning policy itself, which we finished and evaluated rigorously, and the sim to real deployment layer, camera based perception, tracking, and physical integration, which remains the natural next phase rather than something we attempted and abandoned. We think this was the right trade off under the circumstances.</w:t>
+        <w:t>Two factors explain this. The first was a deliberate research decision. Deciding which phase should be green and for how long is already a substantial problem on its own, as the version history in Section 4.4 shows. Combining it with an unsolved detection and tracking problem would have made it much harder to tell whether a poor result came from perception or from decision making. Isolating the control problem, with ground truth state standing in for perfect perception, let us study it on its own.</w:t>
+      </w:r>
+    </w:p>
+    <w:p>
+      <w:pPr>
+        <w:spacing w:after="140" w:line="252" w:lineRule="auto"/>
+      </w:pPr>
+      <w:r>
+        <w:t>The second factor was circumstantial. During the project both team members were called up for military reserves, which is compulsory once summoned and cannot be deferred, removing a significant and unpredictable block of development time without notice. Faced with a real reduction in available time, we chose to protect the depth of the reinforcement learning work already underway rather than spread the remaining time across perception, tracking, priority logic, and cloud infrastructure and finish none of them to a demonstrable standard. We see the work as two phases of the same project: the decision making component, which we completed and evaluated rigorously, and the simulation to reality deployment layer, which remains the next phase rather than an abandoned attempt.</w:t>
       </w:r>
     </w:p>
     <w:p>
@@ -6201,8 +6179,9 @@
         <w:pStyle w:val="Heading2"/>
         <w:spacing w:before="200" w:after="100"/>
       </w:pPr>
-      <w:bookmarkStart w:id="22" w:name="_Toc238312574"/>
-      <w:r>
+      <w:bookmarkStart w:id="22" w:name="_Toc238496067"/>
+      <w:r>
+        <w:lastRenderedPageBreak/>
         <w:t>4.3 Changing the Algorithm, DQN to PPO</w:t>
       </w:r>
       <w:bookmarkEnd w:id="22"/>
@@ -6212,23 +6191,23 @@
         <w:spacing w:after="140" w:line="252" w:lineRule="auto"/>
       </w:pPr>
       <w:r>
-        <w:t>We also changed which reinforcement learning algorithm served as the primary approach. An early DQN implementation exists in the codebase, operating on the same ground truth state rather than vision input, with its own environment, a far more complex multi term reward, and its own training pipeline.</w:t>
-      </w:r>
-    </w:p>
-    <w:p>
-      <w:pPr>
-        <w:spacing w:after="140" w:line="252" w:lineRule="auto"/>
-      </w:pPr>
-      <w:r>
-        <w:t>The DQN implementation was evaluated against a fixed time baseline many times during its development, and the full log survives in the project's data files. What it reveals is not simply that DQN was worse than PPO, it is that DQN's own result, run to run, was not consistent enough to trust. Thirty four logged runs exist (a thirty fifth, synthetic sanity check entry is excluded), all on the same fixed seed, spanning three intersection configurations across roughly three weeks. Their improvement ranges from essentially eliminating waiting time (99.6% better) to roughly 1,380 times more total waiting time than doing nothing (about negative 137,858%). The median run, 34.8% better, looks respectable in isolation. The mean is a meaningless negative 4,046%, dragged there by a handful of catastrophic outliers, which is itself the point: a metric whose mean and median disagree this violently is not describing a reliable controller.</w:t>
-      </w:r>
-    </w:p>
-    <w:p>
-      <w:pPr>
-        <w:spacing w:after="140" w:line="252" w:lineRule="auto"/>
-      </w:pPr>
-      <w:r>
-        <w:t>Figure 4.2 plots every logged evaluation in chronological order. Each dot is one real test at a different point in development, and the axis is percent improvement over the fixed timer, on a log scale so the good and the extremely bad results fit on one chart. Blue beat the baseline, red did worse, gray was logged with exactly zero waiting time, which we treat as a failed run rather than a perfect result. The chart shows the instability itself: good results and severe failures sit side by side throughout, the opposite of the steady pattern the PPO charts show in Chapter 5.</w:t>
+        <w:t>We also changed which reinforcement learning algorithm served as the primary approach. An earlier DQN implementation exists in the codebase, working on the same ground truth state rather than vision input, with its own environment, a much more complex multi term reward, and its own training pipeline.</w:t>
+      </w:r>
+    </w:p>
+    <w:p>
+      <w:pPr>
+        <w:spacing w:after="140" w:line="252" w:lineRule="auto"/>
+      </w:pPr>
+      <w:r>
+        <w:t>We evaluated the DQN implementation against a fixed time baseline many times during its development, and the full log survives in the project data files. The log shows not simply that DQN was worse than PPO, but that its result varied too much between runs to be trusted. Thirty four logged runs exist, excluding a thirty fifth synthetic sanity check, all on the same fixed seed and spanning three intersection configurations over roughly three weeks. Improvement over the baseline ranges from effectively eliminating waiting time, at 99.6% better, to producing roughly 1,380 times more total waiting time than doing nothing, about negative 137,858%. The median run, at 34.8% better, looks respectable on its own. The mean is negative 4,046%, pulled there by a few catastrophic outliers. A metric whose mean and median disagree this violently does not describe a dependable controller.</w:t>
+      </w:r>
+    </w:p>
+    <w:p>
+      <w:pPr>
+        <w:spacing w:after="140" w:line="252" w:lineRule="auto"/>
+      </w:pPr>
+      <w:r>
+        <w:t>Figure 4.2 plots every logged evaluation in chronological order. Each dot is one real test at a different point in development, and the vertical axis is percent improvement over the fixed timer, on a log scale so the good and the extremely bad results fit on one chart. Blue beat the baseline, red did worse, and gray was logged with exactly zero waiting time, which we treat as a failed run rather than a perfect result. Good results and severe failures sit side by side throughout, the opposite of the steady pattern the PPO charts show in Chapter 5.</w:t>
       </w:r>
     </w:p>
     <w:p>
@@ -6240,12 +6219,11 @@
         <w:rPr>
           <w:noProof/>
         </w:rPr>
-        <w:lastRenderedPageBreak/>
         <w:drawing>
-          <wp:inline distT="0" distB="0" distL="0" distR="0" wp14:anchorId="00CB50D3" wp14:editId="12E858EA">
+          <wp:inline distT="0" distB="0" distL="0" distR="0" wp14:anchorId="18780A2B" wp14:editId="502AC72C">
             <wp:extent cx="5429250" cy="2714625"/>
             <wp:effectExtent l="0" t="0" r="0" b="0"/>
-            <wp:docPr id="938835357" name="Picture 938835357"/>
+            <wp:docPr id="1325943211" name="Picture 1325943211"/>
             <wp:cNvGraphicFramePr>
               <a:graphicFrameLocks xmlns:a="http://schemas.openxmlformats.org/drawingml/2006/main" noChangeAspect="1"/>
             </wp:cNvGraphicFramePr>
@@ -6300,15 +6278,19 @@
         <w:spacing w:after="140" w:line="252" w:lineRule="auto"/>
       </w:pPr>
       <w:r>
-        <w:t>Counting the runs rather than the extremes: 23 of the 34 beat the baseline, 4 did worse (the negative 137,858% case coincides with that run's own log noting 411 vehicles still stuck on the map at the time limit, a genuine gridlock), and 7 were logged with exactly zero waiting time, which reads as a failed evaluation rather than a perfect controller, so we do not count those as successes either. We excluded none of them.</w:t>
-      </w:r>
-    </w:p>
-    <w:p>
-      <w:pPr>
-        <w:spacing w:after="140" w:line="252" w:lineRule="auto"/>
-      </w:pPr>
-      <w:r>
-        <w:t>This was not an agent we could safely put in charge of an intersection. The failure mode recurred: certain approaches starved almost entirely in favor of others, with nothing in the agent's own logic pulling it back out, despite more than a dozen hand tuned reward terms trying to discourage exactly that. PPO's clipped updates were materially more stable against violent policy collapse (Chapter 7), and its native action masking let us rule out unsafe behavior structurally rather than merely discourage it. The DQN implementation remains in the repository in full.</w:t>
+        <w:t>By count rather than by extreme value, 23 of the 34 runs beat the baseline, 4 did worse, and 7 were logged with exactly zero waiting time. The worst case, at negative 137,858%, matches that run's own log recording 411 vehicles still stuck on the map at the time limit, which is genuine gridlock rather than a numerical artifact. We treat the seven zero waiting time entries as failed evaluations, not successes. No run was excluded from the chart or from these totals.</w:t>
+      </w:r>
+    </w:p>
+    <w:p>
+      <w:pPr>
+        <w:spacing w:after="140" w:line="252" w:lineRule="auto"/>
+      </w:pPr>
+      <w:r>
+        <w:t xml:space="preserve">This was not a controller we could put in charge of an intersection. The failure mode recurred: individual approaches were starved almost entirely in favor of others, with nothing in the agent's </w:t>
+      </w:r>
+      <w:r>
+        <w:lastRenderedPageBreak/>
+        <w:t>own logic to recover, despite more than a dozen hand tuned reward terms meant to prevent exactly that. PPO's clipped updates proved much more resistant to the abrupt policy collapse we hit elsewhere (Chapter 7), and its action masking let us rule out unsafe behavior structurally rather than penalize it. The DQN implementation remains in the repository in full.</w:t>
       </w:r>
     </w:p>
     <w:p>
@@ -6316,7 +6298,7 @@
         <w:pStyle w:val="Heading2"/>
         <w:spacing w:before="200" w:after="100"/>
       </w:pPr>
-      <w:bookmarkStart w:id="23" w:name="_Toc238312575"/>
+      <w:bookmarkStart w:id="23" w:name="_Toc238496068"/>
       <w:r>
         <w:t>4.4 The Version History</w:t>
       </w:r>
@@ -6327,7 +6309,7 @@
         <w:spacing w:after="140" w:line="252" w:lineRule="auto"/>
       </w:pPr>
       <w:r>
-        <w:t>The project did not progress in a straight line, and we think that is worth stating plainly rather than smoothing over. What follows is the actual sequence of major iterations, each one a fresh, from scratch training run rather than a continuation of the last, since changing the reward or observation definition partway through training and then resuming from an old checkpoint turned out, the hard way, to reliably corrupt the agent rather than improve it.</w:t>
+        <w:t>Development did not run in a straight line, and the actual sequence of iterations is reported here rather than smoothed over. Each version below is a training run started from random initialization rather than a continuation of the one before it, because changing the reward or observation definition partway through training and then resuming from a checkpoint corrupted the policy instead of improving it.</w:t>
       </w:r>
     </w:p>
     <w:tbl>
@@ -6598,7 +6580,6 @@
                 <w:sz w:val="20"/>
                 <w:szCs w:val="20"/>
               </w:rPr>
-              <w:lastRenderedPageBreak/>
               <w:t>V3.1 – V3.3</w:t>
             </w:r>
           </w:p>
@@ -6814,7 +6795,7 @@
         <w:spacing w:after="140" w:line="252" w:lineRule="auto"/>
       </w:pPr>
       <w:r>
-        <w:t>A full account of exactly what changed between each version, and the reasoning behind each change, is preserved in the project's version history document rather than repeated here in full. The table above is the condensed arc of it.</w:t>
+        <w:t>The project version history document records what changed between versions and why. The table above is the condensed form.</w:t>
       </w:r>
     </w:p>
     <w:p>
@@ -6822,7 +6803,7 @@
         <w:pStyle w:val="Heading2"/>
         <w:spacing w:before="200" w:after="100"/>
       </w:pPr>
-      <w:bookmarkStart w:id="24" w:name="_Toc238312576"/>
+      <w:bookmarkStart w:id="24" w:name="_Toc238496069"/>
       <w:r>
         <w:t>4.5 How We Worked</w:t>
       </w:r>
@@ -6833,15 +6814,16 @@
         <w:spacing w:after="140" w:line="252" w:lineRule="auto"/>
       </w:pPr>
       <w:r>
-        <w:t>This project was steered through frequent review sessions in which the agent was shown live rather than described in a status report. That is why the graphical comparison tools exist: picking a model, a scenario, and a seed, including one typed in on the spot, then watching the result immediately, is far more convincing than a slide of numbers.</w:t>
-      </w:r>
-    </w:p>
-    <w:p>
-      <w:pPr>
-        <w:spacing w:after="140" w:line="252" w:lineRule="auto"/>
-      </w:pPr>
-      <w:r>
-        <w:t>Once V8 beat every baseline, the project's centre of gravity shifted from building something better to establishing how sure we actually were. Chapter 6 describes the testing process that produced.</w:t>
+        <w:t>The project was steered through frequent review sessions in which we demonstrated the agent live rather than describing it in a written status report. This is the main reason the graphical comparison tools exist: picking a model, a scenario, and a seed, including one supplied on the spot, then watching the result immediately, demonstrates progress far better than a table of figures.</w:t>
+      </w:r>
+    </w:p>
+    <w:p>
+      <w:pPr>
+        <w:spacing w:after="140" w:line="252" w:lineRule="auto"/>
+      </w:pPr>
+      <w:r>
+        <w:lastRenderedPageBreak/>
+        <w:t>Once V8 beat every baseline, the emphasis shifted from improving performance to establishing how confidently that performance could be claimed. Chapter 6 documents the evaluation process that followed.</w:t>
       </w:r>
     </w:p>
     <w:p>
@@ -6849,7 +6831,7 @@
         <w:pStyle w:val="Heading1"/>
         <w:spacing w:before="260" w:after="130"/>
       </w:pPr>
-      <w:bookmarkStart w:id="25" w:name="_Toc238312577"/>
+      <w:bookmarkStart w:id="25" w:name="_Toc238496070"/>
       <w:r>
         <w:t>5. Results</w:t>
       </w:r>
@@ -6860,7 +6842,7 @@
         <w:pStyle w:val="Heading2"/>
         <w:spacing w:before="200" w:after="100"/>
       </w:pPr>
-      <w:bookmarkStart w:id="26" w:name="_Toc238312578"/>
+      <w:bookmarkStart w:id="26" w:name="_Toc238496071"/>
       <w:r>
         <w:t>5.1 The Headline Result</w:t>
       </w:r>
@@ -6871,7 +6853,7 @@
         <w:spacing w:after="140" w:line="252" w:lineRule="auto"/>
       </w:pPr>
       <w:r>
-        <w:t>The project's central goal, an agent that beats fixed time control across light, moderate, and heavy traffic, was achieved and independently verified rather than taken on faith. Our champion agent reduces total waiting time by roughly 50% in light traffic, 36% in moderate traffic, and 8% in heavy traffic, each measured against the best performing fixed time baseline for that condition. Under the project's most rigorous test, described in Chapter 6, the champion agent beat every one of the three fixed time baselines outright in 53 of 60 cases (88.3%), and its remaining losses were narrow, single digit percentage misses against only the single toughest baseline in light traffic, never a broad or catastrophic failure.</w:t>
+        <w:t>The project's central goal, an agent that beats fixed time control across light, moderate, and heavy traffic, was achieved and independently verified. Our champion agent reduces total waiting time by roughly 50% in light traffic, 36% in moderate traffic, and 8% in heavy traffic, each measured against the best fixed time baseline for that condition. Under the most rigorous test we ran, described in Chapter 6, it beat all three baselines in 53 of 60 cases, or 88.3%. Its remaining losses were narrow single digit misses against the toughest baseline in light traffic, not broad failures.</w:t>
       </w:r>
     </w:p>
     <w:p>
@@ -6879,7 +6861,7 @@
         <w:pStyle w:val="Heading2"/>
         <w:spacing w:before="200" w:after="100"/>
       </w:pPr>
-      <w:bookmarkStart w:id="27" w:name="_Toc238312579"/>
+      <w:bookmarkStart w:id="27" w:name="_Toc238496072"/>
       <w:r>
         <w:t>5.2 The Evidence</w:t>
       </w:r>
@@ -6890,19 +6872,15 @@
         <w:spacing w:after="140" w:line="252" w:lineRule="auto"/>
       </w:pPr>
       <w:r>
-        <w:t>The three charts below are the evidence behind that number. In each, our agent is measured against ordinary fixed timers, and lower means less time waiting, so a line below the fixed timer lines means our agent is winning.</w:t>
-      </w:r>
-    </w:p>
-    <w:p>
-      <w:pPr>
-        <w:spacing w:after="140" w:line="252" w:lineRule="auto"/>
-      </w:pPr>
-      <w:r>
-        <w:t xml:space="preserve">Figure 5.1 plots total waiting time at every checkpoint of our champion agent against the three baselines, one independently drawn seed and scenario per checkpoint. The axis is compressed to </w:t>
-      </w:r>
-      <w:r>
-        <w:lastRenderedPageBreak/>
-        <w:t>a log scale only so light and heavy traffic can share one chart. The agent starts roughly tied with the fixed timers, drops sharply within the first few hundred thousand steps, then stays below all three for the rest of training, in light, moderate, and heavy traffic alike (solid, dashed, and dotted lines).</w:t>
+        <w:t>The three figures below show that evidence directly. In each, our agent is measured against ordinary fixed timer signals, and lower means less waiting time, so a line below the fixed timer lines means our agent is winning.</w:t>
+      </w:r>
+    </w:p>
+    <w:p>
+      <w:pPr>
+        <w:spacing w:after="140" w:line="252" w:lineRule="auto"/>
+      </w:pPr>
+      <w:r>
+        <w:t>Figure 5.1 plots total waiting time at every checkpoint of our champion agent against the three baselines, with one independently drawn seed and scenario per checkpoint. The axis uses a log scale only so light and heavy traffic can share one chart. The agent starts roughly level with the fixed timers, drops sharply within the first few hundred thousand steps, then stays below all three for the rest of training, in light, moderate, and heavy traffic alike, shown as solid, dashed, and dotted lines.</w:t>
       </w:r>
     </w:p>
     <w:p>
@@ -6915,10 +6893,10 @@
           <w:noProof/>
         </w:rPr>
         <w:drawing>
-          <wp:inline distT="0" distB="0" distL="0" distR="0" wp14:anchorId="76A7CD91" wp14:editId="1E8620BC">
+          <wp:inline distT="0" distB="0" distL="0" distR="0" wp14:anchorId="1427BBA1" wp14:editId="5355BE64">
             <wp:extent cx="5429250" cy="2714625"/>
             <wp:effectExtent l="0" t="0" r="0" b="0"/>
-            <wp:docPr id="1869822914" name="Picture 1869822914"/>
+            <wp:docPr id="2078596659" name="Picture 2078596659"/>
             <wp:cNvGraphicFramePr>
               <a:graphicFrameLocks xmlns:a="http://schemas.openxmlformats.org/drawingml/2006/main" noChangeAspect="1"/>
             </wp:cNvGraphicFramePr>
@@ -6973,7 +6951,7 @@
         <w:spacing w:after="140" w:line="252" w:lineRule="auto"/>
       </w:pPr>
       <w:r>
-        <w:t>Figure 5.2 reduces those 60 checkpoints to one number each, percent improvement over the Fixed_60s baseline, split by traffic condition. A dot above the zero line means the agent won at that point in training, below means it lost. Aside from two checkpoints in the first half million steps, nearly every dot sits above the line. This is the direct evidence behind the 88.3% win rate, in deliberate contrast to Figure 4.2, where losing results keep reappearing.</w:t>
+        <w:t>Figure 5.2 reduces those 60 checkpoints to one number each, percent improvement over the Fixed_60s baseline, split by traffic condition. A dot above the zero line means the agent won at that point in training, below means it lost. Apart from two checkpoints in the first half million steps, nearly every dot sits above the line. This is the direct evidence behind the 88.3% win rate, and the contrast with Figure 4.2, where losing results keep reappearing, is deliberate.</w:t>
       </w:r>
     </w:p>
     <w:p>
@@ -6985,11 +6963,12 @@
         <w:rPr>
           <w:noProof/>
         </w:rPr>
+        <w:lastRenderedPageBreak/>
         <w:drawing>
-          <wp:inline distT="0" distB="0" distL="0" distR="0" wp14:anchorId="1AA2A17E" wp14:editId="6C1A2667">
+          <wp:inline distT="0" distB="0" distL="0" distR="0" wp14:anchorId="1B75F74B" wp14:editId="179CC07B">
             <wp:extent cx="5429250" cy="2324100"/>
             <wp:effectExtent l="0" t="0" r="0" b="0"/>
-            <wp:docPr id="1100118508" name="Picture 1100118508"/>
+            <wp:docPr id="1128173197" name="Picture 1128173197"/>
             <wp:cNvGraphicFramePr>
               <a:graphicFrameLocks xmlns:a="http://schemas.openxmlformats.org/drawingml/2006/main" noChangeAspect="1"/>
             </wp:cNvGraphicFramePr>
@@ -7044,7 +7023,7 @@
         <w:spacing w:after="140" w:line="252" w:lineRule="auto"/>
       </w:pPr>
       <w:r>
-        <w:t>Figure 5.3 repeats the comparison for moderate traffic alone, on an ordinary rather than a compressed axis, which shows the shape of the improvement more directly. The agent's line starts far above the fixed timers, meaning it performs worse at first, then falls sharply and settles below every one of them for the rest of training.</w:t>
+        <w:t>Figure 5.3 repeats the comparison for moderate traffic alone on an ordinary axis, which shows the shape of the improvement more directly than a log scale. The agent line starts far above the fixed timers, then falls sharply and settles below all of them for the rest of training.</w:t>
       </w:r>
     </w:p>
     <w:p>
@@ -7056,12 +7035,11 @@
         <w:rPr>
           <w:noProof/>
         </w:rPr>
-        <w:lastRenderedPageBreak/>
         <w:drawing>
-          <wp:inline distT="0" distB="0" distL="0" distR="0" wp14:anchorId="42403022" wp14:editId="338365CA">
+          <wp:inline distT="0" distB="0" distL="0" distR="0" wp14:anchorId="7390E60E" wp14:editId="18D689D8">
             <wp:extent cx="5286375" cy="2714625"/>
             <wp:effectExtent l="0" t="0" r="0" b="0"/>
-            <wp:docPr id="127977464" name="Picture 127977464"/>
+            <wp:docPr id="405511480" name="Picture 405511480"/>
             <wp:cNvGraphicFramePr>
               <a:graphicFrameLocks xmlns:a="http://schemas.openxmlformats.org/drawingml/2006/main" noChangeAspect="1"/>
             </wp:cNvGraphicFramePr>
@@ -7116,7 +7094,7 @@
         <w:pStyle w:val="Heading2"/>
         <w:spacing w:before="200" w:after="100"/>
       </w:pPr>
-      <w:bookmarkStart w:id="28" w:name="_Toc238312580"/>
+      <w:bookmarkStart w:id="28" w:name="_Toc238496073"/>
       <w:r>
         <w:t>5.3 Investigating the Heavy Traffic Gap</w:t>
       </w:r>
@@ -7127,7 +7105,7 @@
         <w:spacing w:after="140" w:line="252" w:lineRule="auto"/>
       </w:pPr>
       <w:r>
-        <w:t>The remaining gap in heavy traffic was the subject of a dedicated investigation. We hypothesized that the agent's camera limited observation was "saturating" under heavy demand, every input reading effectively maxed out, leaving the policy unable to distinguish one badly congested state from another, and tested this directly by training an otherwise identical agent with a richer, non saturating encoding of the same information. It performed identically to the original, checkpoint for checkpoint. We concluded that this gap reflects a genuine demand ceiling, queueing physics as arrivals approach the intersection's physical service capacity, rather than a perception limitation, and that closing it further would likely require coordinating with neighboring intersections.</w:t>
+        <w:t>We investigated the remaining gap in heavy traffic rather than leaving it unexplained. Our hypothesis was that the sensing limit saturates the observation under heavy demand, with every input near its maximum and the policy unable to tell one congested state from another. We tested this directly by training an otherwise identical agent with a richer, non saturating encoding of the same information. It performed identically, checkpoint for checkpoint. We conclude the gap is a demand ceiling, queueing behavior as arrivals approach the physical capacity of the intersection, not a perception limit. Closing it further would require coordinating with neighboring intersections.</w:t>
       </w:r>
     </w:p>
     <w:p>
@@ -7135,7 +7113,7 @@
         <w:pStyle w:val="Heading2"/>
         <w:spacing w:before="200" w:after="100"/>
       </w:pPr>
-      <w:bookmarkStart w:id="29" w:name="_Toc238312581"/>
+      <w:bookmarkStart w:id="29" w:name="_Toc238496074"/>
       <w:r>
         <w:t>5.4 Does Training Longer Help?</w:t>
       </w:r>
@@ -7146,7 +7124,11 @@
         <w:spacing w:after="140" w:line="252" w:lineRule="auto"/>
       </w:pPr>
       <w:r>
-        <w:t>A second, unplanned but genuinely valuable result came from directly testing whether training for longer improves the agent. It does not, reliably: a fresh agent trained for twice the original step budget scored 77.4% on the same rigorous evaluation, meaningfully below the original champion's 88.3%, despite twice the training experience. The checkpoint history told a specific story about why: even at 99% through its schedule, a checkpoint could still sit between two much better neighbors ten thousand steps away, consistent with a fixed, never decaying exploration noise setting still perturbing the policy rather than the run simply running out of time. A second collapse also appeared partway through the longer run. We traced part of the reason to how the learning rate schedule is defined relative to the requested training length, and consider the likely remaining cause that same non decaying exploration setting. Both are concrete, addressable design choices for future work, not a fundamental ceiling on what this approach can achieve.</w:t>
+        <w:t xml:space="preserve">A second, unplanned result concerns training length. Training longer does not reliably help. An agent trained from scratch for twice the original step budget scored 77.4% under the same </w:t>
+      </w:r>
+      <w:r>
+        <w:lastRenderedPageBreak/>
+        <w:t>evaluation, against 88.3% for the original champion, despite twice the experience. The checkpoint history shows why. Even at 99% of the schedule, individual checkpoints sat between much better neighbors ten thousand steps away, which points to a fixed, non decaying exploration coefficient still disturbing the policy rather than to a shortage of training time. A second collapse also appeared partway through the longer run. Part of the cause is how the learning rate schedule is defined relative to the requested run length, and the rest is most likely that non decaying exploration setting. Both are concrete design choices we can fix, not a ceiling on the approach.</w:t>
       </w:r>
     </w:p>
     <w:p>
@@ -7154,7 +7136,7 @@
         <w:pStyle w:val="Heading2"/>
         <w:spacing w:before="200" w:after="100"/>
       </w:pPr>
-      <w:bookmarkStart w:id="30" w:name="_Toc238312582"/>
+      <w:bookmarkStart w:id="30" w:name="_Toc238496075"/>
       <w:r>
         <w:t>5.5 Did We Meet Our Phase A Metrics?</w:t>
       </w:r>
@@ -7165,7 +7147,7 @@
         <w:spacing w:after="140" w:line="252" w:lineRule="auto"/>
       </w:pPr>
       <w:r>
-        <w:t>Our Phase A proposal defined six quantitative success criteria, and honesty requires reporting against every one of them, not only the ones the project ended up addressing. The table below does that directly.</w:t>
+        <w:t>The Phase A proposal defined six quantitative success criteria. We report against all six, including the ones the delivered scope did not address.</w:t>
       </w:r>
     </w:p>
     <w:tbl>
@@ -7208,7 +7190,6 @@
                 <w:sz w:val="20"/>
                 <w:szCs w:val="20"/>
               </w:rPr>
-              <w:lastRenderedPageBreak/>
               <w:t>Phase A success criterion</w:t>
             </w:r>
           </w:p>
@@ -7520,7 +7501,7 @@
         <w:spacing w:after="140" w:line="252" w:lineRule="auto"/>
       </w:pPr>
       <w:r>
-        <w:t>Put plainly: the one criterion concerning the control policy itself, at least 20% less average waiting time against a fixed time baseline, was exceeded in two of the three conditions, and the condition where it was not (heavy traffic, 8%) was investigated rather than left unexplained (Section 5.3). The remaining five all concerned the vision, priority protocol, and infrastructure components which, as Chapter 4 explains, were not implemented. We would rather report that gap plainly than describe success only in terms of the criterion we did address.</w:t>
+        <w:t>The one criterion that concerned the control policy itself, at least 20% less average waiting time than a fixed time baseline, was exceeded in two of the three conditions. The condition where it was not, heavy traffic at 8%, was investigated rather than left unexplained (Section 5.3). The other five criteria concern the vision, priority protocol, and infrastructure components which, as Chapter 4 explains, were not built.</w:t>
       </w:r>
     </w:p>
     <w:p>
@@ -7528,7 +7509,7 @@
         <w:pStyle w:val="Heading1"/>
         <w:spacing w:before="260" w:after="130"/>
       </w:pPr>
-      <w:bookmarkStart w:id="31" w:name="_Toc238312583"/>
+      <w:bookmarkStart w:id="31" w:name="_Toc238496076"/>
       <w:r>
         <w:t>6. The Testing Process</w:t>
       </w:r>
@@ -7539,7 +7520,7 @@
         <w:spacing w:after="140" w:line="252" w:lineRule="auto"/>
       </w:pPr>
       <w:r>
-        <w:t>Every number in Chapter 5 rests on the testing process described here. We treat it as a research contribution rather than an afterthought, because the central risk is not an agent that fails visibly, it is one that looks good on a chart and is not trustworthy.</w:t>
+        <w:t>Every number in Chapter 5 rests on the evaluation process described here. We treat it as a contribution in its own right, because the main risk in work like this is not an agent that fails visibly, but one that produces good summary statistics without being dependable.</w:t>
       </w:r>
     </w:p>
     <w:p>
@@ -7547,7 +7528,7 @@
         <w:pStyle w:val="Heading2"/>
         <w:spacing w:before="200" w:after="100"/>
       </w:pPr>
-      <w:bookmarkStart w:id="32" w:name="_Toc238312584"/>
+      <w:bookmarkStart w:id="32" w:name="_Toc238496077"/>
       <w:r>
         <w:t>6.1 Verifying the Simulator Is Deterministic</w:t>
       </w:r>
@@ -7558,7 +7539,11 @@
         <w:spacing w:after="140" w:line="252" w:lineRule="auto"/>
       </w:pPr>
       <w:r>
-        <w:t>Before relying on any comparison, we verified rather than assumed that SUMO's seeded vehicle generation is deterministic: the same seed produces a bit for bit identical stream of vehicles whichever controller drives the signal, across separate runs and different days. That property is what makes a paired comparison meaningful, since any difference must then come from the controller and not from easier traffic. We would not have trusted any comparison here without checking it.</w:t>
+        <w:t xml:space="preserve">Before relying on any comparison between controllers, we verified rather than assumed that SUMO's vehicle generation is deterministic. The same seed produces a bit for bit identical stream of vehicles whichever controller drives the signal, across separate processes and across </w:t>
+      </w:r>
+      <w:r>
+        <w:lastRenderedPageBreak/>
+        <w:t>different days. This is what makes a paired comparison meaningful, since any difference must then come from the controller rather than from easier traffic in one run.</w:t>
       </w:r>
     </w:p>
     <w:p>
@@ -7566,7 +7551,7 @@
         <w:pStyle w:val="Heading2"/>
         <w:spacing w:before="200" w:after="100"/>
       </w:pPr>
-      <w:bookmarkStart w:id="33" w:name="_Toc238312585"/>
+      <w:bookmarkStart w:id="33" w:name="_Toc238496078"/>
       <w:r>
         <w:t>6.2 How Our Evaluation Methodology Escalated</w:t>
       </w:r>
@@ -7577,7 +7562,7 @@
         <w:spacing w:after="140" w:line="252" w:lineRule="auto"/>
       </w:pPr>
       <w:r>
-        <w:t>We escalated how rigorously we verified each claim, and the escalation is worth recording, since each step was prompted by a specific doubt about the one before it.</w:t>
+        <w:t>We escalated verification rigor in three stages, each prompted by a specific limitation of the one before it.</w:t>
       </w:r>
     </w:p>
     <w:p>
@@ -7590,7 +7575,7 @@
         <w:spacing w:after="90" w:line="252" w:lineRule="auto"/>
       </w:pPr>
       <w:r>
-        <w:t>A couple of fixed seeds during early development. Adequate for telling whether a change did anything, not for claiming one version beats another.</w:t>
+        <w:t>Two fixed seeds during early development. Enough to show whether a change had any effect, not enough to claim one version beats another.</w:t>
       </w:r>
     </w:p>
     <w:p>
@@ -7616,8 +7601,7 @@
         <w:spacing w:after="90" w:line="252" w:lineRule="auto"/>
       </w:pPr>
       <w:r>
-        <w:lastRenderedPageBreak/>
-        <w:t>Every saved checkpoint against its own freshly drawn seed and scenario, nothing reused, nothing cherry picked, no unfavorable result excluded.</w:t>
+        <w:t>Every saved checkpoint evaluated against its own independently drawn seed and scenario, with no reuse, no selection, and no unfavorable result excluded.</w:t>
       </w:r>
     </w:p>
     <w:p>
@@ -7625,7 +7609,7 @@
         <w:pStyle w:val="Heading2"/>
         <w:spacing w:before="200" w:after="100"/>
       </w:pPr>
-      <w:bookmarkStart w:id="34" w:name="_Toc238312586"/>
+      <w:bookmarkStart w:id="34" w:name="_Toc238496079"/>
       <w:r>
         <w:t>6.3 The Final, Unfiltered Methodology</w:t>
       </w:r>
@@ -7636,23 +7620,23 @@
         <w:spacing w:after="140" w:line="252" w:lineRule="auto"/>
       </w:pPr>
       <w:r>
-        <w:t>A checkpoint is a saved copy of the agent's weights, written automatically every 100,000 steps, so a 6 million step run produces 60 of them, an evenly spaced record of progress from start to end rather than just the final state. The final methodology evaluates all 60, each against its own independently drawn seed and scenario, and reports every outcome.</w:t>
-      </w:r>
-    </w:p>
-    <w:p>
-      <w:pPr>
-        <w:spacing w:after="140" w:line="252" w:lineRule="auto"/>
-      </w:pPr>
-      <w:r>
-        <w:t>This is what let us say, with real confidence rather than a hopeful headline number, that our champion agent beats all three baselines on 53 of 60 independently random evaluations (88.3%), and that its few losses are narrow, single digit misses against only the toughest baseline in light traffic, not the catastrophic failures earlier versions had shown. The same methodology, applied to a second run of the identical recipe, produced one of the project's more sobering findings, reported in Section 5.4: a second run is not guaranteed to reproduce the first one's quality at all.</w:t>
-      </w:r>
-    </w:p>
-    <w:p>
-      <w:pPr>
-        <w:spacing w:after="140" w:line="252" w:lineRule="auto"/>
-      </w:pPr>
-      <w:r>
-        <w:t>The raw output is preserved in the repository, so any claim in Chapter 5 can be checked against the numbers that produced it. Running this many episodes only became practical after we added an early exit condition, stopping the moment no vehicle remains and none are expected, which cut typical evaluation time roughly seven to eight times with no change to the results.</w:t>
+        <w:t>A checkpoint is a saved copy of the agent's weights, written automatically every 100,000 steps, so a six million step run produces 60 of them. That gives an evenly spaced record of progress from start to finish rather than only the final state. The final method evaluates all 60, each against its own seed and scenario, and reports every outcome.</w:t>
+      </w:r>
+    </w:p>
+    <w:p>
+      <w:pPr>
+        <w:spacing w:after="140" w:line="252" w:lineRule="auto"/>
+      </w:pPr>
+      <w:r>
+        <w:t>This is what lets us say, with real confidence rather than as a headline figure, that our champion agent beats all three baselines in 53 of 60 independent evaluations, or 88.3%, and that its losses are narrow single digit misses against the toughest baseline in light traffic rather than the systematic failures earlier versions showed. Applying the same method to a second run of the identical recipe gave one of the project's more useful negative results, reported in Section 5.4: a repeat run does not reliably reproduce the quality of the first.</w:t>
+      </w:r>
+    </w:p>
+    <w:p>
+      <w:pPr>
+        <w:spacing w:after="140" w:line="252" w:lineRule="auto"/>
+      </w:pPr>
+      <w:r>
+        <w:t>The raw output is kept in the repository, so any claim in Chapter 5 can be checked against the per checkpoint numbers behind it. Running this many episodes only became practical after we added an early exit condition, stopping an episode once no vehicle remains and none are expected, which cut typical evaluation time by roughly seven to eight times with no change to the results.</w:t>
       </w:r>
     </w:p>
     <w:p>
@@ -7660,7 +7644,7 @@
         <w:pStyle w:val="Heading1"/>
         <w:spacing w:before="260" w:after="130"/>
       </w:pPr>
-      <w:bookmarkStart w:id="35" w:name="_Toc238312587"/>
+      <w:bookmarkStart w:id="35" w:name="_Toc238496080"/>
       <w:r>
         <w:t>7. Challenges and How We Overcame Them</w:t>
       </w:r>
@@ -7671,7 +7655,7 @@
         <w:spacing w:after="140" w:line="252" w:lineRule="auto"/>
       </w:pPr>
       <w:r>
-        <w:t>Several problems recurred, and most are general lessons about reinforcement learning rather than quirks of this intersection.</w:t>
+        <w:t>Several problems recurred during development. Most are general lessons about applied reinforcement learning rather than quirks of this intersection.</w:t>
       </w:r>
     </w:p>
     <w:p>
@@ -7679,7 +7663,7 @@
         <w:pStyle w:val="Heading2"/>
         <w:spacing w:before="200" w:after="100"/>
       </w:pPr>
-      <w:bookmarkStart w:id="36" w:name="_Toc238312588"/>
+      <w:bookmarkStart w:id="36" w:name="_Toc238496081"/>
       <w:r>
         <w:t>7.1 Reward Hacking via Simulator Artifacts</w:t>
       </w:r>
@@ -7690,7 +7674,7 @@
         <w:spacing w:after="140" w:line="252" w:lineRule="auto"/>
       </w:pPr>
       <w:r>
-        <w:t>The first working version appeared to be doing extremely well, until we saw how. It was starving certain lanes long enough that SUMO's teleportation safety feature, which removes a vehicle that has waited implausibly long so the simulation does not stall, would delete those vehicles entirely. Waiting time attributed to a vehicle that no longer exists is, to the reward function, waiting time that never happened. The fix was simple in hindsight, permanently disabling teleportation, but finding it meant watching the agent rather than trusting the reward curve, which climbed steadily throughout.</w:t>
+        <w:t>The first working version looked exceptional until we examined how. It was starving selected lanes long enough that SUMO's teleportation safety feature, which removes vehicles stationary for an implausible period so the simulation does not deadlock, deleted those vehicles entirely. Waiting time charged to a vehicle that no longer exists is, to the reward function, waiting time that never happened. The fix was simple once found, disabling teleportation permanently, but finding it meant watching the agent's behavior directly rather than trusting the reward curve, which rose steadily the whole time.</w:t>
       </w:r>
     </w:p>
     <w:p>
@@ -7698,7 +7682,7 @@
         <w:pStyle w:val="Heading2"/>
         <w:spacing w:before="200" w:after="100"/>
       </w:pPr>
-      <w:bookmarkStart w:id="37" w:name="_Toc238312589"/>
+      <w:bookmarkStart w:id="37" w:name="_Toc238496082"/>
       <w:r>
         <w:t>7.2 A Dynamic Minimum Green Rule That Fired on the Wrong Signal</w:t>
       </w:r>
@@ -7709,7 +7693,8 @@
         <w:spacing w:after="140" w:line="252" w:lineRule="auto"/>
       </w:pPr>
       <w:r>
-        <w:t>One version let the agent switch before the minimum green time whenever the current phase looked nearly empty, measured by live vehicle counts on that phase's lanes. This had a structural flaw: while a phase is green its vehicles are moving rather than halting, so a live count on a green phase reads as nearly empty almost by construction. Trained further on this bug, the agent committed to exploiting it. Some phases switched at the earliest possible moment every time, others held for the maximum, and starved phases waited over 17,000 seconds, the worst result in the project's history. Only a fresh agent trained from random initialization fixed it, which became our rule thereafter: resuming training after a meaningful rule change risks reinforcing a bug rather than correcting it.</w:t>
+        <w:lastRenderedPageBreak/>
+        <w:t>One version let the agent switch before the minimum green interval whenever the active phase looked nearly empty, measured by live vehicle counts on that phase's lanes. This had a structural flaw. While a phase is green its vehicles are moving rather than halted, so a live count on a green phase reads as nearly empty almost by construction. Trained further against this bug, the agent committed to exploiting it. Some phases switched at the earliest possible moment every cycle, others held for the maximum, and starved phases accumulated waits over 17,000 seconds, the worst result in the project. Only an agent retrained from random initialization fixed it. That set the rule we applied afterwards: resuming training after a real rule change risks reinforcing a bug rather than correcting it.</w:t>
       </w:r>
     </w:p>
     <w:p>
@@ -7717,7 +7702,7 @@
         <w:pStyle w:val="Heading2"/>
         <w:spacing w:before="200" w:after="100"/>
       </w:pPr>
-      <w:bookmarkStart w:id="38" w:name="_Toc238312590"/>
+      <w:bookmarkStart w:id="38" w:name="_Toc238496083"/>
       <w:r>
         <w:t>7.3 A Reward with Almost No Gradient in Light Traffic</w:t>
       </w:r>
@@ -7728,8 +7713,7 @@
         <w:spacing w:after="140" w:line="252" w:lineRule="auto"/>
       </w:pPr>
       <w:r>
-        <w:lastRenderedPageBreak/>
-        <w:t>A version rewarded purely on the reduction in total waiting time did acceptably in moderate and heavy traffic but could not learn light traffic at all. With very few vehicles present, the change in total waiting time between one decision and the next is near zero almost regardless of what the agent does, leaving almost no signal to learn from in exactly the condition where it was needed most. Adding a starvation penalty, responding to how long a lane's longest waiting vehicle has sat there rather than to an aggregate that trivially stays near zero, supplied a real gradient even when traffic was sparse, and light traffic performance improved roughly fifteen fold.</w:t>
+        <w:t>A version rewarded only on the reduction in total waiting time did acceptably in moderate and heavy traffic but could not learn light traffic at all. With few vehicles present, the change in total waiting time between decisions is near zero almost regardless of what the agent does, leaving almost no gradient in exactly the condition where it was needed. Adding a starvation penalty, which responds to how long a lane group's longest waiting vehicle has sat there rather than to an aggregate that stays near zero, gave a usable gradient under sparse demand, and light traffic performance improved by roughly a factor of fifteen.</w:t>
       </w:r>
     </w:p>
     <w:p>
@@ -7737,7 +7721,7 @@
         <w:pStyle w:val="Heading2"/>
         <w:spacing w:before="200" w:after="100"/>
       </w:pPr>
-      <w:bookmarkStart w:id="39" w:name="_Toc238312591"/>
+      <w:bookmarkStart w:id="39" w:name="_Toc238496084"/>
       <w:r>
         <w:t>7.4 The Camera Range Trade Off</w:t>
       </w:r>
@@ -7748,7 +7732,7 @@
         <w:spacing w:after="140" w:line="252" w:lineRule="auto"/>
       </w:pPr>
       <w:r>
-        <w:t>Limiting the observation to a fixed distance from the stop line, to model a realistic sensor rather than an omniscient one, initially caused a heavy traffic regression: queues extending past the visible range were invisible, so the agent under reacted to congestion it could not see. We tested whether a richer, non saturating encoding of the same observation would help. It did not (Section 5.3), and we resolved the regression by extending the visible range instead.</w:t>
+        <w:t>Limiting the observation to a fixed distance from the stop line, to model a realistic sensor rather than an omniscient one, first caused a regression in heavy traffic. Queues extending past the sensing range were invisible, so the agent under reacted to congestion it could not see. We tested whether a richer, non saturating encoding of the same observation would compensate. It did not (Section 5.3), and we resolved the regression by extending the sensing range instead.</w:t>
       </w:r>
     </w:p>
     <w:p>
@@ -7756,7 +7740,7 @@
         <w:pStyle w:val="Heading2"/>
         <w:spacing w:before="200" w:after="100"/>
       </w:pPr>
-      <w:bookmarkStart w:id="40" w:name="_Toc238312592"/>
+      <w:bookmarkStart w:id="40" w:name="_Toc238496085"/>
       <w:r>
         <w:t>7.5 An Idle Intersection That Still Wanted to Switch</w:t>
       </w:r>
@@ -7767,7 +7751,7 @@
         <w:spacing w:after="140" w:line="252" w:lineRule="auto"/>
       </w:pPr>
       <w:r>
-        <w:t>Even once other issues were resolved, the agent would occasionally switch phases at a completely empty intersection for no benefit, since nothing in training had taught it that doing so was pointless. A soft penalty was tried first and was too weak to compete with the main reward. The fix removed the option outright: switching is now structurally unavailable whenever no vehicle is visible, whatever the policy would otherwise prefer. This single change took the agent from beating some baselines to beating every baseline in every tested condition, and the principle, enforce a real constraint structurally rather than discourage it with a penalty, is one we would apply earlier next time.</w:t>
+        <w:t>Once the other issues were resolved, the agent still occasionally switched phases at a completely empty intersection, for no benefit, because nothing in training had taught it that doing so was pointless. We tried a soft penalty first and it was too weak to compete with the main reward term. The fix removed the action entirely: switching is structurally unavailable whenever no vehicle is present, whatever the policy would otherwise choose. This single change took the agent from beating some baselines to beating every baseline in every tested condition. The principle, enforce a real constraint structurally rather than discourage it with a penalty, is one we would apply earlier next time.</w:t>
       </w:r>
     </w:p>
     <w:p>
@@ -7775,7 +7759,7 @@
         <w:pStyle w:val="Heading1"/>
         <w:spacing w:before="260" w:after="130"/>
       </w:pPr>
-      <w:bookmarkStart w:id="41" w:name="_Toc238312593"/>
+      <w:bookmarkStart w:id="41" w:name="_Toc238496086"/>
       <w:r>
         <w:t>8. Summary, Conclusions and Future Work</w:t>
       </w:r>
@@ -7786,7 +7770,7 @@
         <w:pStyle w:val="Heading2"/>
         <w:spacing w:before="200" w:after="100"/>
       </w:pPr>
-      <w:bookmarkStart w:id="42" w:name="_Toc238312594"/>
+      <w:bookmarkStart w:id="42" w:name="_Toc238496087"/>
       <w:r>
         <w:t>8.1 Summary</w:t>
       </w:r>
@@ -7797,7 +7781,7 @@
         <w:spacing w:after="140" w:line="252" w:lineRule="auto"/>
       </w:pPr>
       <w:r>
-        <w:t>This project asked whether a reinforcement learning agent, given no explicit control rules, could run an intersection better than the fixed time signals in everyday use. It can, by roughly 50% in light traffic, 36% in moderate, and 8% in heavy, winning 53 of 60 fully independent evaluations. The remaining heavy traffic gap was investigated rather than left unexplained, and reflects the physical capacity of a single intersection rather than any limit on the agent's perception.</w:t>
+        <w:t>This project asked whether a reinforcement learning agent, given no explicit control rules, could run an intersection better than the fixed time signals in general use. It can, by roughly 50% in light traffic, 36% in moderate, and 8% in heavy, winning 53 of 60 fully independent evaluations. The remaining gap in heavy traffic was investigated rather than left unexplained, and comes from the physical capacity of a single intersection rather than any limit on what the agent can see.</w:t>
       </w:r>
     </w:p>
     <w:p>
@@ -7805,8 +7789,9 @@
         <w:pStyle w:val="Heading2"/>
         <w:spacing w:before="200" w:after="100"/>
       </w:pPr>
-      <w:bookmarkStart w:id="43" w:name="_Toc238312595"/>
-      <w:r>
+      <w:bookmarkStart w:id="43" w:name="_Toc238496088"/>
+      <w:r>
+        <w:lastRenderedPageBreak/>
         <w:t>8.2 Lessons Learned</w:t>
       </w:r>
       <w:bookmarkEnd w:id="43"/>
@@ -7816,24 +7801,23 @@
         <w:spacing w:after="140" w:line="252" w:lineRule="auto"/>
       </w:pPr>
       <w:r>
-        <w:t>If we repeated this project, several things would change. We would enforce genuine physical or logical constraints structurally through action masking from the first version, rather than discouraging unwanted behavior with a penalty and only reaching for a hard constraint once the penalty had failed. The empty intersection problem cost more iteration time than it needed to for exactly that reason. We would also adopt the full unfiltered evaluation methodology much earlier rather than escalating into it. Several early "this version is clearly better" conclusions, based on one or two fixed seeds, proved far less certain once tested properly, and committing to rigor sooner would have saved iteration cycles rather than costing them.</w:t>
-      </w:r>
-    </w:p>
-    <w:p>
-      <w:pPr>
-        <w:spacing w:after="140" w:line="252" w:lineRule="auto"/>
-      </w:pPr>
-      <w:r>
-        <w:t>We would also treat "train it for longer" with far more skepticism. It is intuitive and low effort, and not obviously wrong, but we now have controlled evidence that it does not reliably help under this training setup, and we would rather have known that earlier than midway through.</w:t>
-      </w:r>
-    </w:p>
-    <w:p>
-      <w:pPr>
-        <w:spacing w:after="140" w:line="252" w:lineRule="auto"/>
-      </w:pPr>
-      <w:r>
-        <w:lastRenderedPageBreak/>
-        <w:t>On balance we handled the project's central risk correctly, an agent that looks good on paper but is not trustworthy, by consistently building more rigorous verification rather than accepting an encouraging headline number. That discipline is the most transferable outcome of this project, independent of the traffic control results.</w:t>
+        <w:t>We would do several things differently. We would enforce real physical or logical constraints structurally through action masking from the first version, rather than discouraging them with a penalty and only reaching for a hard constraint after the penalty had failed. The empty intersection problem cost more iteration time than it needed to for exactly that reason. We would also adopt the full unfiltered evaluation method from the start rather than escalating into it. Several early conclusions that one version was clearly better turned out to be far less certain once tested properly, and committing to rigor sooner would have saved iteration cycles rather than costing them.</w:t>
+      </w:r>
+    </w:p>
+    <w:p>
+      <w:pPr>
+        <w:spacing w:after="140" w:line="252" w:lineRule="auto"/>
+      </w:pPr>
+      <w:r>
+        <w:t>We would also treat "train it for longer" with far more skepticism. It is an intuitive, low effort thing to try, and it is not obviously wrong, but we now have controlled evidence that it does not reliably help under this training setup. We would rather have established that early than midway through.</w:t>
+      </w:r>
+    </w:p>
+    <w:p>
+      <w:pPr>
+        <w:spacing w:after="140" w:line="252" w:lineRule="auto"/>
+      </w:pPr>
+      <w:r>
+        <w:t>On balance we handled the project's central risk correctly, an agent that looks good on paper but is not dependable, by consistently building better verification rather than accepting an encouraging headline figure. That discipline is the most transferable outcome of this work, independent of the traffic control results.</w:t>
       </w:r>
     </w:p>
     <w:p>
@@ -7841,7 +7825,7 @@
         <w:pStyle w:val="Heading2"/>
         <w:spacing w:before="200" w:after="100"/>
       </w:pPr>
-      <w:bookmarkStart w:id="44" w:name="_Toc238312596"/>
+      <w:bookmarkStart w:id="44" w:name="_Toc238496089"/>
       <w:r>
         <w:t>8.3 Thoughts for Future Development</w:t>
       </w:r>
@@ -7852,7 +7836,7 @@
         <w:spacing w:after="140" w:line="252" w:lineRule="auto"/>
       </w:pPr>
       <w:r>
-        <w:t>Four directions follow from where this project stopped. We consider the first two the most valuable.</w:t>
+        <w:t>Four directions follow from where this project stopped. The first two are the most valuable.</w:t>
       </w:r>
     </w:p>
     <w:p>
@@ -7865,7 +7849,7 @@
         <w:spacing w:after="90" w:line="252" w:lineRule="auto"/>
       </w:pPr>
       <w:r>
-        <w:t>The sim to real deployment layer: camera based perception (YOLO and DeepSORT), tracking, and physical integration with a real signal controller. This is the half of the Phase A vision we did not build, and the step that would turn a validated policy into a deployable system.</w:t>
+        <w:t>The simulation to reality deployment layer: camera based perception with YOLO and DeepSORT, tracking, and physical integration with a signal controller. This is the half of the Phase A vision we did not build, and the step that turns a validated policy into a deployable system.</w:t>
       </w:r>
     </w:p>
     <w:p>
@@ -7878,7 +7862,7 @@
         <w:spacing w:after="90" w:line="252" w:lineRule="auto"/>
       </w:pPr>
       <w:r>
-        <w:t>Multi intersection coordination. The heavy traffic ceiling in Section 5.3 is a property of one intersection in isolation. Coordinating neighbors is the way past it, and where the largest remaining gains almost certainly are.</w:t>
+        <w:t>Multi intersection coordination. The heavy traffic ceiling in Section 5.3 is a property of one intersection in isolation. Coordinating with neighbors is the way past it, and where the largest remaining gains most likely are.</w:t>
       </w:r>
     </w:p>
     <w:p>
@@ -7891,7 +7875,7 @@
         <w:spacing w:after="90" w:line="252" w:lineRule="auto"/>
       </w:pPr>
       <w:r>
-        <w:t>A decaying exploration schedule. The evidence in Section 5.4 points directly at the constant, never decaying entropy coefficient as the likely cause of run to run instability, which makes it a concrete and testable next experiment rather than an open question.</w:t>
+        <w:t>A decaying exploration schedule. The evidence in Section 5.4 points at the constant, non decaying entropy coefficient as the likely cause of run to run instability, which makes it a concrete next experiment rather than an open question.</w:t>
       </w:r>
     </w:p>
     <w:p>
@@ -7904,7 +7888,7 @@
         <w:spacing w:after="90" w:line="252" w:lineRule="auto"/>
       </w:pPr>
       <w:r>
-        <w:t>A rigorous head to head DQN versus PPO comparison, using the methodology in Chapter 6 on both agents, which would close the honest gap described in Section 4.3.</w:t>
+        <w:t>A direct comparison between the DQN and PPO agents, applying the method in Chapter 6 to both, which would close the gap described in Section 4.3.</w:t>
       </w:r>
     </w:p>
     <w:p>
@@ -7917,7 +7901,7 @@
         <w:pStyle w:val="Heading1"/>
         <w:spacing w:before="260" w:after="130"/>
       </w:pPr>
-      <w:bookmarkStart w:id="45" w:name="_Toc238312597"/>
+      <w:bookmarkStart w:id="45" w:name="_Toc238496090"/>
       <w:r>
         <w:lastRenderedPageBreak/>
         <w:t>References</w:t>
@@ -8014,7 +7998,7 @@
         <w:pStyle w:val="Heading1"/>
         <w:spacing w:before="260" w:after="130"/>
       </w:pPr>
-      <w:bookmarkStart w:id="46" w:name="_Toc238312598"/>
+      <w:bookmarkStart w:id="46" w:name="_Toc238496091"/>
       <w:r>
         <w:lastRenderedPageBreak/>
         <w:t>Appendix A, User Guide</w:t>
@@ -8026,7 +8010,7 @@
         <w:pStyle w:val="Heading2"/>
         <w:spacing w:before="200" w:after="100"/>
       </w:pPr>
-      <w:bookmarkStart w:id="47" w:name="_Toc238312599"/>
+      <w:bookmarkStart w:id="47" w:name="_Toc238496092"/>
       <w:r>
         <w:t>A.1 Introduction</w:t>
       </w:r>
@@ -8069,7 +8053,7 @@
         <w:pStyle w:val="Heading2"/>
         <w:spacing w:before="200" w:after="100"/>
       </w:pPr>
-      <w:bookmarkStart w:id="48" w:name="_Toc238312600"/>
+      <w:bookmarkStart w:id="48" w:name="_Toc238496093"/>
       <w:r>
         <w:t>A.2 System Requirements</w:t>
       </w:r>
@@ -8339,7 +8323,7 @@
         <w:pStyle w:val="Heading2"/>
         <w:spacing w:before="200" w:after="100"/>
       </w:pPr>
-      <w:bookmarkStart w:id="49" w:name="_Toc238312601"/>
+      <w:bookmarkStart w:id="49" w:name="_Toc238496094"/>
       <w:r>
         <w:t>A.3 Installation</w:t>
       </w:r>
@@ -8440,7 +8424,7 @@
         <w:pStyle w:val="Heading2"/>
         <w:spacing w:before="200" w:after="100"/>
       </w:pPr>
-      <w:bookmarkStart w:id="50" w:name="_Toc238312602"/>
+      <w:bookmarkStart w:id="50" w:name="_Toc238496095"/>
       <w:r>
         <w:t>A.4 Quick Start</w:t>
       </w:r>
@@ -8553,7 +8537,7 @@
         <w:pStyle w:val="Heading2"/>
         <w:spacing w:before="200" w:after="100"/>
       </w:pPr>
-      <w:bookmarkStart w:id="51" w:name="_Toc238312603"/>
+      <w:bookmarkStart w:id="51" w:name="_Toc238496096"/>
       <w:r>
         <w:t>A.5 Using the PPO Comparison Tool (Current Agent)</w:t>
       </w:r>
@@ -8726,10 +8710,10 @@
           <w:noProof/>
         </w:rPr>
         <w:drawing>
-          <wp:inline distT="0" distB="0" distL="0" distR="0" wp14:anchorId="52E4BD44" wp14:editId="2C3DAD1A">
+          <wp:inline distT="0" distB="0" distL="0" distR="0" wp14:anchorId="7972E687" wp14:editId="4802B8B0">
             <wp:extent cx="4381500" cy="2076450"/>
             <wp:effectExtent l="0" t="0" r="0" b="0"/>
-            <wp:docPr id="1183341361" name="Picture 1183341361"/>
+            <wp:docPr id="131182921" name="Picture 131182921"/>
             <wp:cNvGraphicFramePr>
               <a:graphicFrameLocks xmlns:a="http://schemas.openxmlformats.org/drawingml/2006/main" noChangeAspect="1"/>
             </wp:cNvGraphicFramePr>
@@ -8832,10 +8816,10 @@
           <w:noProof/>
         </w:rPr>
         <w:drawing>
-          <wp:inline distT="0" distB="0" distL="0" distR="0" wp14:anchorId="5526784A" wp14:editId="3FE1916A">
+          <wp:inline distT="0" distB="0" distL="0" distR="0" wp14:anchorId="2B74044A" wp14:editId="1CD5683F">
             <wp:extent cx="4191000" cy="3200400"/>
             <wp:effectExtent l="0" t="0" r="0" b="0"/>
-            <wp:docPr id="1468135559" name="Picture 1468135559"/>
+            <wp:docPr id="1064302086" name="Picture 1064302086"/>
             <wp:cNvGraphicFramePr>
               <a:graphicFrameLocks xmlns:a="http://schemas.openxmlformats.org/drawingml/2006/main" noChangeAspect="1"/>
             </wp:cNvGraphicFramePr>
@@ -8890,7 +8874,7 @@
         <w:pStyle w:val="Heading2"/>
         <w:spacing w:before="200" w:after="100"/>
       </w:pPr>
-      <w:bookmarkStart w:id="52" w:name="_Toc238312604"/>
+      <w:bookmarkStart w:id="52" w:name="_Toc238496097"/>
       <w:r>
         <w:t>A.6 Using FlowGrid_Web (Live Junction Dashboard)</w:t>
       </w:r>
@@ -9235,7 +9219,7 @@
         <w:pStyle w:val="Heading2"/>
         <w:spacing w:before="200" w:after="100"/>
       </w:pPr>
-      <w:bookmarkStart w:id="53" w:name="_Toc238312605"/>
+      <w:bookmarkStart w:id="53" w:name="_Toc238496098"/>
       <w:r>
         <w:t>A.7 Using the DQN Tools (Original Agent, Archived)</w:t>
       </w:r>
@@ -9372,7 +9356,7 @@
         <w:pStyle w:val="Heading2"/>
         <w:spacing w:before="200" w:after="100"/>
       </w:pPr>
-      <w:bookmarkStart w:id="54" w:name="_Toc238312606"/>
+      <w:bookmarkStart w:id="54" w:name="_Toc238496099"/>
       <w:r>
         <w:t>A.8 Understanding the Traffic Scenarios</w:t>
       </w:r>
@@ -9605,7 +9589,7 @@
         <w:pStyle w:val="Heading2"/>
         <w:spacing w:before="200" w:after="100"/>
       </w:pPr>
-      <w:bookmarkStart w:id="55" w:name="_Toc238312607"/>
+      <w:bookmarkStart w:id="55" w:name="_Toc238496100"/>
       <w:r>
         <w:t>A.9 Troubleshooting / FAQ</w:t>
       </w:r>
@@ -9743,7 +9727,7 @@
         <w:pStyle w:val="Heading2"/>
         <w:spacing w:before="200" w:after="100"/>
       </w:pPr>
-      <w:bookmarkStart w:id="56" w:name="_Toc238312608"/>
+      <w:bookmarkStart w:id="56" w:name="_Toc238496101"/>
       <w:r>
         <w:t>A.10 Glossary</w:t>
       </w:r>
@@ -10093,7 +10077,7 @@
         <w:pStyle w:val="Heading1"/>
         <w:spacing w:before="260" w:after="130"/>
       </w:pPr>
-      <w:bookmarkStart w:id="57" w:name="_Toc238312609"/>
+      <w:bookmarkStart w:id="57" w:name="_Toc238496102"/>
       <w:r>
         <w:lastRenderedPageBreak/>
         <w:t>Appendix B, Developer / Maintenance Guide</w:t>
@@ -10105,7 +10089,7 @@
         <w:pStyle w:val="Heading2"/>
         <w:spacing w:before="200" w:after="100"/>
       </w:pPr>
-      <w:bookmarkStart w:id="58" w:name="_Toc238312610"/>
+      <w:bookmarkStart w:id="58" w:name="_Toc238496103"/>
       <w:r>
         <w:t>B.1 Introduction and Audience</w:t>
       </w:r>
@@ -10124,7 +10108,7 @@
         <w:pStyle w:val="Heading2"/>
         <w:spacing w:before="200" w:after="100"/>
       </w:pPr>
-      <w:bookmarkStart w:id="59" w:name="_Toc238312611"/>
+      <w:bookmarkStart w:id="59" w:name="_Toc238496104"/>
       <w:r>
         <w:t>B.2 System Architecture Overview</w:t>
       </w:r>
@@ -10195,10 +10179,10 @@
           <w:noProof/>
         </w:rPr>
         <w:drawing>
-          <wp:inline distT="0" distB="0" distL="0" distR="0" wp14:anchorId="4B9463E0" wp14:editId="16C87673">
+          <wp:inline distT="0" distB="0" distL="0" distR="0" wp14:anchorId="420CF8CD" wp14:editId="06B1A7FE">
             <wp:extent cx="4381500" cy="2247900"/>
             <wp:effectExtent l="0" t="0" r="0" b="0"/>
-            <wp:docPr id="320444416" name="Picture 320444416"/>
+            <wp:docPr id="1208002324" name="Picture 1208002324"/>
             <wp:cNvGraphicFramePr>
               <a:graphicFrameLocks xmlns:a="http://schemas.openxmlformats.org/drawingml/2006/main" noChangeAspect="1"/>
             </wp:cNvGraphicFramePr>
@@ -10268,10 +10252,10 @@
           <w:noProof/>
         </w:rPr>
         <w:drawing>
-          <wp:inline distT="0" distB="0" distL="0" distR="0" wp14:anchorId="2374C6BD" wp14:editId="51F8F389">
+          <wp:inline distT="0" distB="0" distL="0" distR="0" wp14:anchorId="688674BE" wp14:editId="09398314">
             <wp:extent cx="4191000" cy="2809875"/>
             <wp:effectExtent l="0" t="0" r="0" b="0"/>
-            <wp:docPr id="1027520892" name="Picture 1027520892"/>
+            <wp:docPr id="1740881302" name="Picture 1740881302"/>
             <wp:cNvGraphicFramePr>
               <a:graphicFrameLocks xmlns:a="http://schemas.openxmlformats.org/drawingml/2006/main" noChangeAspect="1"/>
             </wp:cNvGraphicFramePr>
@@ -10326,7 +10310,7 @@
         <w:pStyle w:val="Heading2"/>
         <w:spacing w:before="200" w:after="100"/>
       </w:pPr>
-      <w:bookmarkStart w:id="60" w:name="_Toc238312612"/>
+      <w:bookmarkStart w:id="60" w:name="_Toc238496105"/>
       <w:r>
         <w:t>B.3 Repository Structure</w:t>
       </w:r>
@@ -10610,7 +10594,7 @@
         <w:pStyle w:val="Heading2"/>
         <w:spacing w:before="200" w:after="100"/>
       </w:pPr>
-      <w:bookmarkStart w:id="61" w:name="_Toc238312613"/>
+      <w:bookmarkStart w:id="61" w:name="_Toc238496106"/>
       <w:r>
         <w:t>B.4 Environment Setup for Development</w:t>
       </w:r>
@@ -10695,7 +10679,7 @@
         <w:pStyle w:val="Heading2"/>
         <w:spacing w:before="200" w:after="100"/>
       </w:pPr>
-      <w:bookmarkStart w:id="62" w:name="_Toc238312614"/>
+      <w:bookmarkStart w:id="62" w:name="_Toc238496107"/>
       <w:r>
         <w:t>B.5 The PPO Agent (V8), Code Walkthrough</w:t>
       </w:r>
@@ -11119,7 +11103,7 @@
         <w:pStyle w:val="Heading2"/>
         <w:spacing w:before="200" w:after="100"/>
       </w:pPr>
-      <w:bookmarkStart w:id="63" w:name="_Toc238312615"/>
+      <w:bookmarkStart w:id="63" w:name="_Toc238496108"/>
       <w:r>
         <w:t>B.6 FlowGrid_Web, a Second, Independent Product</w:t>
       </w:r>
@@ -11648,7 +11632,7 @@
         <w:pStyle w:val="Heading2"/>
         <w:spacing w:before="200" w:after="100"/>
       </w:pPr>
-      <w:bookmarkStart w:id="64" w:name="_Toc238312616"/>
+      <w:bookmarkStart w:id="64" w:name="_Toc238496109"/>
       <w:r>
         <w:t>B.7 The DQN Agent, Code Walkthrough</w:t>
       </w:r>
@@ -11918,7 +11902,7 @@
         <w:pStyle w:val="Heading2"/>
         <w:spacing w:before="200" w:after="100"/>
       </w:pPr>
-      <w:bookmarkStart w:id="65" w:name="_Toc238312617"/>
+      <w:bookmarkStart w:id="65" w:name="_Toc238496110"/>
       <w:r>
         <w:t>B.8 Retraining or Extending the PPO Agent</w:t>
       </w:r>
@@ -11977,7 +11961,7 @@
         <w:pStyle w:val="Heading2"/>
         <w:spacing w:before="200" w:after="100"/>
       </w:pPr>
-      <w:bookmarkStart w:id="66" w:name="_Toc238312618"/>
+      <w:bookmarkStart w:id="66" w:name="_Toc238496111"/>
       <w:r>
         <w:t>B.9 Adding a New Baseline or Comparison Target</w:t>
       </w:r>
@@ -11996,7 +11980,7 @@
         <w:pStyle w:val="Heading2"/>
         <w:spacing w:before="200" w:after="100"/>
       </w:pPr>
-      <w:bookmarkStart w:id="67" w:name="_Toc238312619"/>
+      <w:bookmarkStart w:id="67" w:name="_Toc238496112"/>
       <w:r>
         <w:t>B.10 Running an Evaluation Sweep</w:t>
       </w:r>
@@ -12051,7 +12035,7 @@
         <w:pStyle w:val="Heading2"/>
         <w:spacing w:before="200" w:after="100"/>
       </w:pPr>
-      <w:bookmarkStart w:id="68" w:name="_Toc238312620"/>
+      <w:bookmarkStart w:id="68" w:name="_Toc238496113"/>
       <w:r>
         <w:t>B.11 Testing and Verification Methodology</w:t>
       </w:r>
@@ -12088,7 +12072,7 @@
         <w:spacing w:after="90" w:line="252" w:lineRule="auto"/>
       </w:pPr>
       <w:r>
-        <w:t>Five, then fifty independently drawn seeds, when a specific comparison needed more statistical confidence.</w:t>
+        <w:t>Five, then fifty independently drawn seeds, once a comparison needed more confidence than two runs could give.</w:t>
       </w:r>
     </w:p>
     <w:p>
@@ -12117,7 +12101,7 @@
         <w:pStyle w:val="Heading2"/>
         <w:spacing w:before="200" w:after="100"/>
       </w:pPr>
-      <w:bookmarkStart w:id="69" w:name="_Toc238312621"/>
+      <w:bookmarkStart w:id="69" w:name="_Toc238496114"/>
       <w:r>
         <w:lastRenderedPageBreak/>
         <w:t>B.12 Known Limitations and Future Work</w:t>
@@ -12194,7 +12178,7 @@
         <w:pStyle w:val="Heading2"/>
         <w:spacing w:before="200" w:after="100"/>
       </w:pPr>
-      <w:bookmarkStart w:id="70" w:name="_Toc238312622"/>
+      <w:bookmarkStart w:id="70" w:name="_Toc238496115"/>
       <w:r>
         <w:t>B.13 Coding Conventions Observed in This Codebase</w:t>
       </w:r>
@@ -12369,10 +12353,10 @@
 <file path=word/numbering.xml><?xml version="1.0" encoding="utf-8"?>
 <w:numbering xmlns:wpc="http://schemas.microsoft.com/office/word/2010/wordprocessingCanvas" xmlns:cx="http://schemas.microsoft.com/office/drawing/2014/chartex" xmlns:cx1="http://schemas.microsoft.com/office/drawing/2015/9/8/chartex" xmlns:cx2="http://schemas.microsoft.com/office/drawing/2015/10/21/chartex" xmlns:cx3="http://schemas.microsoft.com/office/drawing/2016/5/9/chartex" xmlns:cx4="http://schemas.microsoft.com/office/drawing/2016/5/10/chartex" xmlns:cx5="http://schemas.microsoft.com/office/drawing/2016/5/11/chartex" xmlns:cx6="http://schemas.microsoft.com/office/drawing/2016/5/12/chartex" xmlns:cx7="http://schemas.microsoft.com/office/drawing/2016/5/13/chartex" xmlns:cx8="http://schemas.microsoft.com/office/drawing/2016/5/14/chartex" xmlns:mc="http://schemas.openxmlformats.org/markup-compatibility/2006" xmlns:aink="http://schemas.microsoft.com/office/drawing/2016/ink" xmlns:am3d="http://schemas.microsoft.com/office/drawing/2017/model3d" xmlns:o="urn:schemas-microsoft-com:office:office" xmlns:oel="http://schemas.microsoft.com/office/2019/extlst" xmlns:r="http://schemas.openxmlformats.org/officeDocument/2006/relationships" xmlns:m="http://schemas.openxmlformats.org/officeDocument/2006/math" xmlns:v="urn:schemas-microsoft-com:vml" xmlns:wp14="http://schemas.microsoft.com/office/word/2010/wordprocessingDrawing" xmlns:wp="http://schemas.openxmlformats.org/drawingml/2006/wordprocessingDrawing" xmlns:w10="urn:schemas-microsoft-com:office:word" xmlns:w="http://schemas.openxmlformats.org/wordprocessingml/2006/main" xmlns:w14="http://schemas.microsoft.com/office/word/2010/wordml" xmlns:w15="http://schemas.microsoft.com/office/word/2012/wordml" xmlns:w16cei="http://schemas.microsoft.com/office/word/2026/wordml/cei" xmlns:w16cex="http://schemas.microsoft.com/office/word/2018/wordml/cex" xmlns:w16cid="http://schemas.microsoft.com/office/word/2016/wordml/cid" xmlns:w16="http://schemas.microsoft.com/office/word/2018/wordml" xmlns:w16du="http://schemas.microsoft.com/office/word/2023/wordml/word16du" xmlns:w16sdtdh="http://schemas.microsoft.com/office/word/2020/wordml/sdtdatahash" xmlns:w16sdtfl="http://schemas.microsoft.com/office/word/2024/wordml/sdtformatlock" xmlns:w16se="http://schemas.microsoft.com/office/word/2015/wordml/symex" xmlns:wpg="http://schemas.microsoft.com/office/word/2010/wordprocessingGroup" xmlns:wpi="http://schemas.microsoft.com/office/word/2010/wordprocessingInk" xmlns:wne="http://schemas.microsoft.com/office/word/2006/wordml" xmlns:wps="http://schemas.microsoft.com/office/word/2010/wordprocessingShape" mc:Ignorable="w14 w15 w16se w16cid w16 w16cex w16sdtdh w16sdtfl w16du wp14">
   <w:abstractNum w:abstractNumId="0" w15:restartNumberingAfterBreak="0">
-    <w:nsid w:val="272612EB"/>
+    <w:nsid w:val="42E9264D"/>
     <w:multiLevelType w:val="hybridMultilevel"/>
-    <w:tmpl w:val="149C0300"/>
-    <w:lvl w:ilvl="0" w:tplc="675C9A42">
+    <w:tmpl w:val="4C9A1866"/>
+    <w:lvl w:ilvl="0" w:tplc="7A48A3CE">
       <w:start w:val="1"/>
       <w:numFmt w:val="bullet"/>
       <w:lvlText w:val="●"/>
@@ -12381,7 +12365,7 @@
         <w:ind w:left="720" w:hanging="360"/>
       </w:pPr>
     </w:lvl>
-    <w:lvl w:ilvl="1" w:tplc="4CCEF3B2">
+    <w:lvl w:ilvl="1" w:tplc="7DEC6082">
       <w:start w:val="1"/>
       <w:numFmt w:val="bullet"/>
       <w:lvlText w:val="○"/>
@@ -12390,7 +12374,7 @@
         <w:ind w:left="1440" w:hanging="360"/>
       </w:pPr>
     </w:lvl>
-    <w:lvl w:ilvl="2" w:tplc="AA6EBDF8">
+    <w:lvl w:ilvl="2" w:tplc="D0D05FDC">
       <w:start w:val="1"/>
       <w:numFmt w:val="bullet"/>
       <w:lvlText w:val="■"/>
@@ -12399,7 +12383,7 @@
         <w:ind w:left="2160" w:hanging="360"/>
       </w:pPr>
     </w:lvl>
-    <w:lvl w:ilvl="3" w:tplc="7EDAD184">
+    <w:lvl w:ilvl="3" w:tplc="F000C876">
       <w:start w:val="1"/>
       <w:numFmt w:val="bullet"/>
       <w:lvlText w:val="●"/>
@@ -12408,7 +12392,7 @@
         <w:ind w:left="2880" w:hanging="360"/>
       </w:pPr>
     </w:lvl>
-    <w:lvl w:ilvl="4" w:tplc="4EAEB9A0">
+    <w:lvl w:ilvl="4" w:tplc="DBBEB5CC">
       <w:start w:val="1"/>
       <w:numFmt w:val="bullet"/>
       <w:lvlText w:val="○"/>
@@ -12417,7 +12401,7 @@
         <w:ind w:left="3600" w:hanging="360"/>
       </w:pPr>
     </w:lvl>
-    <w:lvl w:ilvl="5" w:tplc="B2387C56">
+    <w:lvl w:ilvl="5" w:tplc="E6063888">
       <w:start w:val="1"/>
       <w:numFmt w:val="bullet"/>
       <w:lvlText w:val="■"/>
@@ -12426,7 +12410,7 @@
         <w:ind w:left="4320" w:hanging="360"/>
       </w:pPr>
     </w:lvl>
-    <w:lvl w:ilvl="6" w:tplc="88D03198">
+    <w:lvl w:ilvl="6" w:tplc="1CA8A626">
       <w:start w:val="1"/>
       <w:numFmt w:val="bullet"/>
       <w:lvlText w:val="●"/>
@@ -12435,7 +12419,7 @@
         <w:ind w:left="5040" w:hanging="360"/>
       </w:pPr>
     </w:lvl>
-    <w:lvl w:ilvl="7" w:tplc="DF9AD0DE">
+    <w:lvl w:ilvl="7" w:tplc="87D8F4E6">
       <w:start w:val="1"/>
       <w:numFmt w:val="bullet"/>
       <w:lvlText w:val="●"/>
@@ -12444,7 +12428,7 @@
         <w:ind w:left="5760" w:hanging="360"/>
       </w:pPr>
     </w:lvl>
-    <w:lvl w:ilvl="8" w:tplc="63D44998">
+    <w:lvl w:ilvl="8" w:tplc="D4682DEA">
       <w:start w:val="1"/>
       <w:numFmt w:val="bullet"/>
       <w:lvlText w:val="●"/>
@@ -12454,7 +12438,7 @@
       </w:pPr>
     </w:lvl>
   </w:abstractNum>
-  <w:num w:numId="1" w16cid:durableId="780420721">
+  <w:num w:numId="1" w16cid:durableId="1202790531">
     <w:abstractNumId w:val="0"/>
     <w:lvlOverride w:ilvl="0">
       <w:startOverride w:val="1"/>
@@ -13064,7 +13048,7 @@
     <w:autoRedefine/>
     <w:uiPriority w:val="39"/>
     <w:unhideWhenUsed/>
-    <w:rsid w:val="008E399C"/>
+    <w:rsid w:val="00BB66D4"/>
     <w:pPr>
       <w:spacing w:after="100"/>
     </w:pPr>
@@ -13076,11 +13060,23 @@
     <w:autoRedefine/>
     <w:uiPriority w:val="39"/>
     <w:unhideWhenUsed/>
-    <w:rsid w:val="008E399C"/>
+    <w:rsid w:val="00BB66D4"/>
     <w:pPr>
       <w:spacing w:after="100"/>
       <w:ind w:left="240"/>
     </w:pPr>
+  </w:style>
+  <w:style w:type="character" w:styleId="UnresolvedMention">
+    <w:name w:val="Unresolved Mention"/>
+    <w:basedOn w:val="DefaultParagraphFont"/>
+    <w:uiPriority w:val="99"/>
+    <w:semiHidden/>
+    <w:unhideWhenUsed/>
+    <w:rsid w:val="00381752"/>
+    <w:rPr>
+      <w:color w:val="605E5C"/>
+      <w:shd w:val="clear" w:color="auto" w:fill="E1DFDD"/>
+    </w:rPr>
   </w:style>
 </w:styles>
 </file>

</xml_diff>